<commit_message>
Travel consent templates — add page numbers, remove disclaimer from running footer (kept on instruction page)
</commit_message>
<xml_diff>
--- a/assets/forms/travel_consent_complex.docx
+++ b/assets/forms/travel_consent_complex.docx
@@ -4184,7 +4184,46 @@
         <w:sz w:val="16"/>
         <w:szCs w:val="16"/>
       </w:rPr>
-      <w:t xml:space="preserve">Travel Consent — Complex Multi-Leg  ·  Self-help template  ·  Not legal advice</w:t>
+      <w:t xml:space="preserve">Travel Consent — Complex Multi-Leg     Page </w:t>
+    </w:r>
+    <w:r>
+      <w:rPr>
+        <w:rFonts w:ascii="Calibri" w:cs="Calibri" w:eastAsia="Calibri" w:hAnsi="Calibri"/>
+        <w:i/>
+        <w:iCs/>
+        <w:color w:val="7A7974"/>
+        <w:sz w:val="16"/>
+        <w:szCs w:val="16"/>
+      </w:rPr>
+      <w:fldChar w:fldCharType="begin"/>
+      <w:instrText xml:space="preserve">PAGE</w:instrText>
+      <w:fldChar w:fldCharType="separate"/>
+      <w:fldChar w:fldCharType="end"/>
+    </w:r>
+    <w:r>
+      <w:rPr>
+        <w:rFonts w:ascii="Calibri" w:cs="Calibri" w:eastAsia="Calibri" w:hAnsi="Calibri"/>
+        <w:i/>
+        <w:iCs/>
+        <w:color w:val="7A7974"/>
+        <w:sz w:val="16"/>
+        <w:szCs w:val="16"/>
+      </w:rPr>
+      <w:t xml:space="preserve"> of </w:t>
+    </w:r>
+    <w:r>
+      <w:rPr>
+        <w:rFonts w:ascii="Calibri" w:cs="Calibri" w:eastAsia="Calibri" w:hAnsi="Calibri"/>
+        <w:i/>
+        <w:iCs/>
+        <w:color w:val="7A7974"/>
+        <w:sz w:val="16"/>
+        <w:szCs w:val="16"/>
+      </w:rPr>
+      <w:fldChar w:fldCharType="begin"/>
+      <w:instrText xml:space="preserve">NUMPAGES</w:instrText>
+      <w:fldChar w:fldCharType="separate"/>
+      <w:fldChar w:fldCharType="end"/>
     </w:r>
   </w:p>
 </w:ftr>

</xml_diff>

<commit_message>
Travel consent templates — move seal box next to signature line (same row)
</commit_message>
<xml_diff>
--- a/assets/forms/travel_consent_complex.docx
+++ b/assets/forms/travel_consent_complex.docx
@@ -3751,59 +3751,103 @@
         <w:t xml:space="preserve"/>
       </w:r>
     </w:p>
-    <w:p>
-      <w:pPr>
-        <w:spacing w:after="160"/>
-      </w:pPr>
-      <w:r>
-        <w:rPr>
-          <w:rFonts w:ascii="Calibri" w:cs="Calibri" w:eastAsia="Calibri" w:hAnsi="Calibri"/>
-          <w:color w:val="28251D"/>
-          <w:sz w:val="22"/>
-          <w:szCs w:val="22"/>
-        </w:rPr>
-        <w:t xml:space="preserve">Signature of Notary Public: </w:t>
-      </w:r>
-      <w:r>
-        <w:rPr>
-          <w:rFonts w:ascii="Calibri" w:cs="Calibri" w:eastAsia="Calibri" w:hAnsi="Calibri"/>
-          <w:sz w:val="22"/>
-          <w:szCs w:val="22"/>
-          <w:u w:val="single" w:color="28251D"/>
-        </w:rPr>
-        <w:t xml:space="preserve">                                             </w:t>
-      </w:r>
-    </w:p>
-    <w:p>
-      <w:pPr>
-        <w:spacing w:after="240"/>
-      </w:pPr>
-      <w:r>
-        <w:rPr>
-          <w:rFonts w:ascii="Calibri" w:cs="Calibri" w:eastAsia="Calibri" w:hAnsi="Calibri"/>
-          <w:sz w:val="22"/>
-          <w:szCs w:val="22"/>
-        </w:rPr>
-        <w:t xml:space="preserve"/>
-      </w:r>
-    </w:p>
-    <w:p>
-      <w:pPr>
-        <w:spacing w:after="120"/>
-        <w:jc w:val="center"/>
-      </w:pPr>
-      <w:r>
-        <w:rPr>
-          <w:rFonts w:ascii="Calibri" w:cs="Calibri" w:eastAsia="Calibri" w:hAnsi="Calibri"/>
-          <w:i/>
-          <w:iCs/>
-          <w:color w:val="7A7974"/>
-          <w:sz w:val="20"/>
-          <w:szCs w:val="20"/>
-        </w:rPr>
-        <w:t xml:space="preserve">(Notary Seal)</w:t>
-      </w:r>
-    </w:p>
+    <w:tbl>
+      <w:tblPr>
+        <w:tblW w:type="dxa" w:w="9360"/>
+        <w:tblBorders>
+          <w:top w:val="none" w:color="FFFFFF" w:sz="0"/>
+          <w:left w:val="none" w:color="FFFFFF" w:sz="0"/>
+          <w:bottom w:val="none" w:color="FFFFFF" w:sz="0"/>
+          <w:right w:val="none" w:color="FFFFFF" w:sz="0"/>
+          <w:insideH w:val="none" w:color="FFFFFF" w:sz="0"/>
+          <w:insideV w:val="none" w:color="FFFFFF" w:sz="0"/>
+        </w:tblBorders>
+      </w:tblPr>
+      <w:tblGrid>
+        <w:gridCol w:w="100"/>
+        <w:gridCol w:w="100"/>
+      </w:tblGrid>
+      <w:tr>
+        <w:trPr>
+          <w:cantSplit/>
+          <w:trHeight w:val="1800" w:hRule="atLeast"/>
+        </w:trPr>
+        <w:tc>
+          <w:tcPr>
+            <w:tcW w:type="dxa" w:w="5900"/>
+            <w:tcMar>
+              <w:top w:type="dxa" w:w="40"/>
+              <w:left w:type="dxa" w:w="40"/>
+              <w:bottom w:type="dxa" w:w="40"/>
+              <w:right w:type="dxa" w:w="200"/>
+            </w:tcMar>
+            <w:vAlign w:val="bottom"/>
+          </w:tcPr>
+          <w:p>
+            <w:pPr>
+              <w:spacing w:after="40"/>
+            </w:pPr>
+            <w:r>
+              <w:rPr>
+                <w:rFonts w:ascii="Calibri" w:cs="Calibri" w:eastAsia="Calibri" w:hAnsi="Calibri"/>
+                <w:sz w:val="22"/>
+                <w:szCs w:val="22"/>
+                <w:u w:val="single" w:color="28251D"/>
+              </w:rPr>
+              <w:t xml:space="preserve">                                                            </w:t>
+            </w:r>
+          </w:p>
+          <w:p>
+            <w:r>
+              <w:rPr>
+                <w:rFonts w:ascii="Calibri" w:cs="Calibri" w:eastAsia="Calibri" w:hAnsi="Calibri"/>
+                <w:i/>
+                <w:iCs/>
+                <w:color w:val="7A7974"/>
+                <w:sz w:val="20"/>
+                <w:szCs w:val="20"/>
+              </w:rPr>
+              <w:t xml:space="preserve">Signature of Notary Public</w:t>
+            </w:r>
+          </w:p>
+        </w:tc>
+        <w:tc>
+          <w:tcPr>
+            <w:tcW w:type="dxa" w:w="3460"/>
+            <w:tcBorders>
+              <w:top w:val="single" w:color="7A7974" w:sz="4" w:space="4"/>
+              <w:left w:val="single" w:color="7A7974" w:sz="4" w:space="4"/>
+              <w:bottom w:val="single" w:color="7A7974" w:sz="4" w:space="4"/>
+              <w:right w:val="single" w:color="7A7974" w:sz="4" w:space="4"/>
+            </w:tcBorders>
+            <w:tcMar>
+              <w:top w:type="dxa" w:w="40"/>
+              <w:left w:type="dxa" w:w="40"/>
+              <w:bottom w:type="dxa" w:w="40"/>
+              <w:right w:type="dxa" w:w="40"/>
+            </w:tcMar>
+            <w:vAlign w:val="center"/>
+          </w:tcPr>
+          <w:p>
+            <w:pPr>
+              <w:spacing w:after="200" w:before="200"/>
+              <w:jc w:val="center"/>
+            </w:pPr>
+            <w:r>
+              <w:rPr>
+                <w:rFonts w:ascii="Calibri" w:cs="Calibri" w:eastAsia="Calibri" w:hAnsi="Calibri"/>
+                <w:i/>
+                <w:iCs/>
+                <w:color w:val="7A7974"/>
+                <w:sz w:val="20"/>
+                <w:szCs w:val="20"/>
+              </w:rPr>
+              <w:t xml:space="preserve">Place Notary Seal Here</w:t>
+            </w:r>
+          </w:p>
+        </w:tc>
+      </w:tr>
+    </w:tbl>
     <w:p>
       <w:r>
         <w:br w:type="page"/>
@@ -4064,59 +4108,103 @@
         <w:t xml:space="preserve"/>
       </w:r>
     </w:p>
-    <w:p>
-      <w:pPr>
-        <w:spacing w:after="160"/>
-      </w:pPr>
-      <w:r>
-        <w:rPr>
-          <w:rFonts w:ascii="Calibri" w:cs="Calibri" w:eastAsia="Calibri" w:hAnsi="Calibri"/>
-          <w:color w:val="28251D"/>
-          <w:sz w:val="22"/>
-          <w:szCs w:val="22"/>
-        </w:rPr>
-        <w:t xml:space="preserve">Signature of Notary Public: </w:t>
-      </w:r>
-      <w:r>
-        <w:rPr>
-          <w:rFonts w:ascii="Calibri" w:cs="Calibri" w:eastAsia="Calibri" w:hAnsi="Calibri"/>
-          <w:sz w:val="22"/>
-          <w:szCs w:val="22"/>
-          <w:u w:val="single" w:color="28251D"/>
-        </w:rPr>
-        <w:t xml:space="preserve">                                             </w:t>
-      </w:r>
-    </w:p>
-    <w:p>
-      <w:pPr>
-        <w:spacing w:after="240"/>
-      </w:pPr>
-      <w:r>
-        <w:rPr>
-          <w:rFonts w:ascii="Calibri" w:cs="Calibri" w:eastAsia="Calibri" w:hAnsi="Calibri"/>
-          <w:sz w:val="22"/>
-          <w:szCs w:val="22"/>
-        </w:rPr>
-        <w:t xml:space="preserve"/>
-      </w:r>
-    </w:p>
-    <w:p>
-      <w:pPr>
-        <w:spacing w:after="120"/>
-        <w:jc w:val="center"/>
-      </w:pPr>
-      <w:r>
-        <w:rPr>
-          <w:rFonts w:ascii="Calibri" w:cs="Calibri" w:eastAsia="Calibri" w:hAnsi="Calibri"/>
-          <w:i/>
-          <w:iCs/>
-          <w:color w:val="7A7974"/>
-          <w:sz w:val="20"/>
-          <w:szCs w:val="20"/>
-        </w:rPr>
-        <w:t xml:space="preserve">(Notary Seal)</w:t>
-      </w:r>
-    </w:p>
+    <w:tbl>
+      <w:tblPr>
+        <w:tblW w:type="dxa" w:w="9360"/>
+        <w:tblBorders>
+          <w:top w:val="none" w:color="FFFFFF" w:sz="0"/>
+          <w:left w:val="none" w:color="FFFFFF" w:sz="0"/>
+          <w:bottom w:val="none" w:color="FFFFFF" w:sz="0"/>
+          <w:right w:val="none" w:color="FFFFFF" w:sz="0"/>
+          <w:insideH w:val="none" w:color="FFFFFF" w:sz="0"/>
+          <w:insideV w:val="none" w:color="FFFFFF" w:sz="0"/>
+        </w:tblBorders>
+      </w:tblPr>
+      <w:tblGrid>
+        <w:gridCol w:w="100"/>
+        <w:gridCol w:w="100"/>
+      </w:tblGrid>
+      <w:tr>
+        <w:trPr>
+          <w:cantSplit/>
+          <w:trHeight w:val="1800" w:hRule="atLeast"/>
+        </w:trPr>
+        <w:tc>
+          <w:tcPr>
+            <w:tcW w:type="dxa" w:w="5900"/>
+            <w:tcMar>
+              <w:top w:type="dxa" w:w="40"/>
+              <w:left w:type="dxa" w:w="40"/>
+              <w:bottom w:type="dxa" w:w="40"/>
+              <w:right w:type="dxa" w:w="200"/>
+            </w:tcMar>
+            <w:vAlign w:val="bottom"/>
+          </w:tcPr>
+          <w:p>
+            <w:pPr>
+              <w:spacing w:after="40"/>
+            </w:pPr>
+            <w:r>
+              <w:rPr>
+                <w:rFonts w:ascii="Calibri" w:cs="Calibri" w:eastAsia="Calibri" w:hAnsi="Calibri"/>
+                <w:sz w:val="22"/>
+                <w:szCs w:val="22"/>
+                <w:u w:val="single" w:color="28251D"/>
+              </w:rPr>
+              <w:t xml:space="preserve">                                                            </w:t>
+            </w:r>
+          </w:p>
+          <w:p>
+            <w:r>
+              <w:rPr>
+                <w:rFonts w:ascii="Calibri" w:cs="Calibri" w:eastAsia="Calibri" w:hAnsi="Calibri"/>
+                <w:i/>
+                <w:iCs/>
+                <w:color w:val="7A7974"/>
+                <w:sz w:val="20"/>
+                <w:szCs w:val="20"/>
+              </w:rPr>
+              <w:t xml:space="preserve">Signature of Notary Public</w:t>
+            </w:r>
+          </w:p>
+        </w:tc>
+        <w:tc>
+          <w:tcPr>
+            <w:tcW w:type="dxa" w:w="3460"/>
+            <w:tcBorders>
+              <w:top w:val="single" w:color="7A7974" w:sz="4" w:space="4"/>
+              <w:left w:val="single" w:color="7A7974" w:sz="4" w:space="4"/>
+              <w:bottom w:val="single" w:color="7A7974" w:sz="4" w:space="4"/>
+              <w:right w:val="single" w:color="7A7974" w:sz="4" w:space="4"/>
+            </w:tcBorders>
+            <w:tcMar>
+              <w:top w:type="dxa" w:w="40"/>
+              <w:left w:type="dxa" w:w="40"/>
+              <w:bottom w:type="dxa" w:w="40"/>
+              <w:right w:type="dxa" w:w="40"/>
+            </w:tcMar>
+            <w:vAlign w:val="center"/>
+          </w:tcPr>
+          <w:p>
+            <w:pPr>
+              <w:spacing w:after="200" w:before="200"/>
+              <w:jc w:val="center"/>
+            </w:pPr>
+            <w:r>
+              <w:rPr>
+                <w:rFonts w:ascii="Calibri" w:cs="Calibri" w:eastAsia="Calibri" w:hAnsi="Calibri"/>
+                <w:i/>
+                <w:iCs/>
+                <w:color w:val="7A7974"/>
+                <w:sz w:val="20"/>
+                <w:szCs w:val="20"/>
+              </w:rPr>
+              <w:t xml:space="preserve">Place Notary Seal Here</w:t>
+            </w:r>
+          </w:p>
+        </w:tc>
+      </w:tr>
+    </w:tbl>
     <w:sectPr>
       <w:footerReference w:type="default" r:id="rId7"/>
       <w:pgSz w:w="11906" w:h="16838" w:orient="portrait"/>

</xml_diff>

<commit_message>
Travel consent — widen name/address lines, restructure CA §1189 ack to NNA layout (notary title + 2 signer lines), move parentheticals to hint text under fields
</commit_message>
<xml_diff>
--- a/assets/forms/travel_consent_complex.docx
+++ b/assets/forms/travel_consent_complex.docx
@@ -390,39 +390,104 @@
     </w:p>
     <w:p>
       <w:pPr>
-        <w:spacing w:after="160"/>
-      </w:pPr>
-      <w:r>
-        <w:rPr>
-          <w:rFonts w:ascii="Calibri" w:cs="Calibri" w:eastAsia="Calibri" w:hAnsi="Calibri"/>
-          <w:color w:val="28251D"/>
-          <w:sz w:val="22"/>
-          <w:szCs w:val="22"/>
-        </w:rPr>
-        <w:t xml:space="preserve">Full legal name: </w:t>
-      </w:r>
-      <w:r>
-        <w:rPr>
-          <w:rFonts w:ascii="Calibri" w:cs="Calibri" w:eastAsia="Calibri" w:hAnsi="Calibri"/>
-          <w:sz w:val="22"/>
-          <w:szCs w:val="22"/>
-          <w:u w:val="single" w:color="28251D"/>
-        </w:rPr>
-        <w:t xml:space="preserve">                                                            </w:t>
-      </w:r>
-    </w:p>
-    <w:p>
-      <w:pPr>
-        <w:spacing w:after="160"/>
-      </w:pPr>
-      <w:r>
-        <w:rPr>
-          <w:rFonts w:ascii="Calibri" w:cs="Calibri" w:eastAsia="Calibri" w:hAnsi="Calibri"/>
-          <w:color w:val="28251D"/>
-          <w:sz w:val="22"/>
-          <w:szCs w:val="22"/>
-        </w:rPr>
-        <w:t xml:space="preserve">Residence address: </w:t>
+        <w:spacing w:after="20"/>
+      </w:pPr>
+      <w:r>
+        <w:rPr>
+          <w:rFonts w:ascii="Calibri" w:cs="Calibri" w:eastAsia="Calibri" w:hAnsi="Calibri"/>
+          <w:color w:val="28251D"/>
+          <w:sz w:val="22"/>
+          <w:szCs w:val="22"/>
+        </w:rPr>
+        <w:t xml:space="preserve">Full legal name:</w:t>
+      </w:r>
+    </w:p>
+    <w:p>
+      <w:pPr>
+        <w:spacing w:after="160"/>
+      </w:pPr>
+      <w:r>
+        <w:rPr>
+          <w:rFonts w:ascii="Calibri" w:cs="Calibri" w:eastAsia="Calibri" w:hAnsi="Calibri"/>
+          <w:sz w:val="22"/>
+          <w:szCs w:val="22"/>
+          <w:u w:val="single" w:color="28251D"/>
+        </w:rPr>
+        <w:t xml:space="preserve">                                                                                                    </w:t>
+      </w:r>
+    </w:p>
+    <w:p>
+      <w:pPr>
+        <w:spacing w:after="20"/>
+      </w:pPr>
+      <w:r>
+        <w:rPr>
+          <w:rFonts w:ascii="Calibri" w:cs="Calibri" w:eastAsia="Calibri" w:hAnsi="Calibri"/>
+          <w:color w:val="28251D"/>
+          <w:sz w:val="22"/>
+          <w:szCs w:val="22"/>
+        </w:rPr>
+        <w:t xml:space="preserve">Residence address:</w:t>
+      </w:r>
+    </w:p>
+    <w:p>
+      <w:pPr>
+        <w:spacing w:after="40"/>
+      </w:pPr>
+      <w:r>
+        <w:rPr>
+          <w:rFonts w:ascii="Calibri" w:cs="Calibri" w:eastAsia="Calibri" w:hAnsi="Calibri"/>
+          <w:color w:val="7A7974"/>
+          <w:sz w:val="20"/>
+          <w:szCs w:val="20"/>
+        </w:rPr>
+        <w:t xml:space="preserve">Street: </w:t>
+      </w:r>
+      <w:r>
+        <w:rPr>
+          <w:rFonts w:ascii="Calibri" w:cs="Calibri" w:eastAsia="Calibri" w:hAnsi="Calibri"/>
+          <w:sz w:val="22"/>
+          <w:szCs w:val="22"/>
+          <w:u w:val="single" w:color="28251D"/>
+        </w:rPr>
+        <w:t xml:space="preserve">                                                                                          </w:t>
+      </w:r>
+    </w:p>
+    <w:p>
+      <w:pPr>
+        <w:spacing w:after="40"/>
+      </w:pPr>
+      <w:r>
+        <w:rPr>
+          <w:rFonts w:ascii="Calibri" w:cs="Calibri" w:eastAsia="Calibri" w:hAnsi="Calibri"/>
+          <w:color w:val="7A7974"/>
+          <w:sz w:val="20"/>
+          <w:szCs w:val="20"/>
+        </w:rPr>
+        <w:t xml:space="preserve">City, State, Zip: </w:t>
+      </w:r>
+      <w:r>
+        <w:rPr>
+          <w:rFonts w:ascii="Calibri" w:cs="Calibri" w:eastAsia="Calibri" w:hAnsi="Calibri"/>
+          <w:sz w:val="22"/>
+          <w:szCs w:val="22"/>
+          <w:u w:val="single" w:color="28251D"/>
+        </w:rPr>
+        <w:t xml:space="preserve">                                                                                </w:t>
+      </w:r>
+    </w:p>
+    <w:p>
+      <w:pPr>
+        <w:spacing w:after="180"/>
+      </w:pPr>
+      <w:r>
+        <w:rPr>
+          <w:rFonts w:ascii="Calibri" w:cs="Calibri" w:eastAsia="Calibri" w:hAnsi="Calibri"/>
+          <w:color w:val="7A7974"/>
+          <w:sz w:val="20"/>
+          <w:szCs w:val="20"/>
+        </w:rPr>
+        <w:t xml:space="preserve">Country (if outside US): </w:t>
       </w:r>
       <w:r>
         <w:rPr>
@@ -436,6 +501,7 @@
     </w:p>
     <w:p>
       <w:pPr>
+        <w:keepNext w:val="false"/>
         <w:spacing w:after="160"/>
       </w:pPr>
       <w:r>
@@ -459,6 +525,7 @@
     </w:p>
     <w:p>
       <w:pPr>
+        <w:keepNext w:val="false"/>
         <w:spacing w:after="160"/>
       </w:pPr>
       <w:r>
@@ -509,39 +576,104 @@
     </w:p>
     <w:p>
       <w:pPr>
-        <w:spacing w:after="160"/>
-      </w:pPr>
-      <w:r>
-        <w:rPr>
-          <w:rFonts w:ascii="Calibri" w:cs="Calibri" w:eastAsia="Calibri" w:hAnsi="Calibri"/>
-          <w:color w:val="28251D"/>
-          <w:sz w:val="22"/>
-          <w:szCs w:val="22"/>
-        </w:rPr>
-        <w:t xml:space="preserve">Full legal name: </w:t>
-      </w:r>
-      <w:r>
-        <w:rPr>
-          <w:rFonts w:ascii="Calibri" w:cs="Calibri" w:eastAsia="Calibri" w:hAnsi="Calibri"/>
-          <w:sz w:val="22"/>
-          <w:szCs w:val="22"/>
-          <w:u w:val="single" w:color="28251D"/>
-        </w:rPr>
-        <w:t xml:space="preserve">                                                            </w:t>
-      </w:r>
-    </w:p>
-    <w:p>
-      <w:pPr>
-        <w:spacing w:after="160"/>
-      </w:pPr>
-      <w:r>
-        <w:rPr>
-          <w:rFonts w:ascii="Calibri" w:cs="Calibri" w:eastAsia="Calibri" w:hAnsi="Calibri"/>
-          <w:color w:val="28251D"/>
-          <w:sz w:val="22"/>
-          <w:szCs w:val="22"/>
-        </w:rPr>
-        <w:t xml:space="preserve">Residence address: </w:t>
+        <w:spacing w:after="20"/>
+      </w:pPr>
+      <w:r>
+        <w:rPr>
+          <w:rFonts w:ascii="Calibri" w:cs="Calibri" w:eastAsia="Calibri" w:hAnsi="Calibri"/>
+          <w:color w:val="28251D"/>
+          <w:sz w:val="22"/>
+          <w:szCs w:val="22"/>
+        </w:rPr>
+        <w:t xml:space="preserve">Full legal name:</w:t>
+      </w:r>
+    </w:p>
+    <w:p>
+      <w:pPr>
+        <w:spacing w:after="160"/>
+      </w:pPr>
+      <w:r>
+        <w:rPr>
+          <w:rFonts w:ascii="Calibri" w:cs="Calibri" w:eastAsia="Calibri" w:hAnsi="Calibri"/>
+          <w:sz w:val="22"/>
+          <w:szCs w:val="22"/>
+          <w:u w:val="single" w:color="28251D"/>
+        </w:rPr>
+        <w:t xml:space="preserve">                                                                                                    </w:t>
+      </w:r>
+    </w:p>
+    <w:p>
+      <w:pPr>
+        <w:spacing w:after="20"/>
+      </w:pPr>
+      <w:r>
+        <w:rPr>
+          <w:rFonts w:ascii="Calibri" w:cs="Calibri" w:eastAsia="Calibri" w:hAnsi="Calibri"/>
+          <w:color w:val="28251D"/>
+          <w:sz w:val="22"/>
+          <w:szCs w:val="22"/>
+        </w:rPr>
+        <w:t xml:space="preserve">Residence address:</w:t>
+      </w:r>
+    </w:p>
+    <w:p>
+      <w:pPr>
+        <w:spacing w:after="40"/>
+      </w:pPr>
+      <w:r>
+        <w:rPr>
+          <w:rFonts w:ascii="Calibri" w:cs="Calibri" w:eastAsia="Calibri" w:hAnsi="Calibri"/>
+          <w:color w:val="7A7974"/>
+          <w:sz w:val="20"/>
+          <w:szCs w:val="20"/>
+        </w:rPr>
+        <w:t xml:space="preserve">Street: </w:t>
+      </w:r>
+      <w:r>
+        <w:rPr>
+          <w:rFonts w:ascii="Calibri" w:cs="Calibri" w:eastAsia="Calibri" w:hAnsi="Calibri"/>
+          <w:sz w:val="22"/>
+          <w:szCs w:val="22"/>
+          <w:u w:val="single" w:color="28251D"/>
+        </w:rPr>
+        <w:t xml:space="preserve">                                                                                          </w:t>
+      </w:r>
+    </w:p>
+    <w:p>
+      <w:pPr>
+        <w:spacing w:after="40"/>
+      </w:pPr>
+      <w:r>
+        <w:rPr>
+          <w:rFonts w:ascii="Calibri" w:cs="Calibri" w:eastAsia="Calibri" w:hAnsi="Calibri"/>
+          <w:color w:val="7A7974"/>
+          <w:sz w:val="20"/>
+          <w:szCs w:val="20"/>
+        </w:rPr>
+        <w:t xml:space="preserve">City, State, Zip: </w:t>
+      </w:r>
+      <w:r>
+        <w:rPr>
+          <w:rFonts w:ascii="Calibri" w:cs="Calibri" w:eastAsia="Calibri" w:hAnsi="Calibri"/>
+          <w:sz w:val="22"/>
+          <w:szCs w:val="22"/>
+          <w:u w:val="single" w:color="28251D"/>
+        </w:rPr>
+        <w:t xml:space="preserve">                                                                                </w:t>
+      </w:r>
+    </w:p>
+    <w:p>
+      <w:pPr>
+        <w:spacing w:after="180"/>
+      </w:pPr>
+      <w:r>
+        <w:rPr>
+          <w:rFonts w:ascii="Calibri" w:cs="Calibri" w:eastAsia="Calibri" w:hAnsi="Calibri"/>
+          <w:color w:val="7A7974"/>
+          <w:sz w:val="20"/>
+          <w:szCs w:val="20"/>
+        </w:rPr>
+        <w:t xml:space="preserve">Country (if outside US): </w:t>
       </w:r>
       <w:r>
         <w:rPr>
@@ -555,6 +687,7 @@
     </w:p>
     <w:p>
       <w:pPr>
+        <w:keepNext w:val="false"/>
         <w:spacing w:after="160"/>
       </w:pPr>
       <w:r>
@@ -578,6 +711,7 @@
     </w:p>
     <w:p>
       <w:pPr>
+        <w:keepNext w:val="false"/>
         <w:spacing w:after="160"/>
       </w:pPr>
       <w:r>
@@ -646,39 +780,104 @@
     </w:p>
     <w:p>
       <w:pPr>
-        <w:spacing w:after="160"/>
-      </w:pPr>
-      <w:r>
-        <w:rPr>
-          <w:rFonts w:ascii="Calibri" w:cs="Calibri" w:eastAsia="Calibri" w:hAnsi="Calibri"/>
-          <w:color w:val="28251D"/>
-          <w:sz w:val="22"/>
-          <w:szCs w:val="22"/>
-        </w:rPr>
-        <w:t xml:space="preserve">Full legal name: </w:t>
-      </w:r>
-      <w:r>
-        <w:rPr>
-          <w:rFonts w:ascii="Calibri" w:cs="Calibri" w:eastAsia="Calibri" w:hAnsi="Calibri"/>
-          <w:sz w:val="22"/>
-          <w:szCs w:val="22"/>
-          <w:u w:val="single" w:color="28251D"/>
-        </w:rPr>
-        <w:t xml:space="preserve">                                                            </w:t>
-      </w:r>
-    </w:p>
-    <w:p>
-      <w:pPr>
-        <w:spacing w:after="160"/>
-      </w:pPr>
-      <w:r>
-        <w:rPr>
-          <w:rFonts w:ascii="Calibri" w:cs="Calibri" w:eastAsia="Calibri" w:hAnsi="Calibri"/>
-          <w:color w:val="28251D"/>
-          <w:sz w:val="22"/>
-          <w:szCs w:val="22"/>
-        </w:rPr>
-        <w:t xml:space="preserve">Residence address: </w:t>
+        <w:spacing w:after="20"/>
+      </w:pPr>
+      <w:r>
+        <w:rPr>
+          <w:rFonts w:ascii="Calibri" w:cs="Calibri" w:eastAsia="Calibri" w:hAnsi="Calibri"/>
+          <w:color w:val="28251D"/>
+          <w:sz w:val="22"/>
+          <w:szCs w:val="22"/>
+        </w:rPr>
+        <w:t xml:space="preserve">Full legal name:</w:t>
+      </w:r>
+    </w:p>
+    <w:p>
+      <w:pPr>
+        <w:spacing w:after="160"/>
+      </w:pPr>
+      <w:r>
+        <w:rPr>
+          <w:rFonts w:ascii="Calibri" w:cs="Calibri" w:eastAsia="Calibri" w:hAnsi="Calibri"/>
+          <w:sz w:val="22"/>
+          <w:szCs w:val="22"/>
+          <w:u w:val="single" w:color="28251D"/>
+        </w:rPr>
+        <w:t xml:space="preserve">                                                                                                    </w:t>
+      </w:r>
+    </w:p>
+    <w:p>
+      <w:pPr>
+        <w:spacing w:after="20"/>
+      </w:pPr>
+      <w:r>
+        <w:rPr>
+          <w:rFonts w:ascii="Calibri" w:cs="Calibri" w:eastAsia="Calibri" w:hAnsi="Calibri"/>
+          <w:color w:val="28251D"/>
+          <w:sz w:val="22"/>
+          <w:szCs w:val="22"/>
+        </w:rPr>
+        <w:t xml:space="preserve">Residence address:</w:t>
+      </w:r>
+    </w:p>
+    <w:p>
+      <w:pPr>
+        <w:spacing w:after="40"/>
+      </w:pPr>
+      <w:r>
+        <w:rPr>
+          <w:rFonts w:ascii="Calibri" w:cs="Calibri" w:eastAsia="Calibri" w:hAnsi="Calibri"/>
+          <w:color w:val="7A7974"/>
+          <w:sz w:val="20"/>
+          <w:szCs w:val="20"/>
+        </w:rPr>
+        <w:t xml:space="preserve">Street: </w:t>
+      </w:r>
+      <w:r>
+        <w:rPr>
+          <w:rFonts w:ascii="Calibri" w:cs="Calibri" w:eastAsia="Calibri" w:hAnsi="Calibri"/>
+          <w:sz w:val="22"/>
+          <w:szCs w:val="22"/>
+          <w:u w:val="single" w:color="28251D"/>
+        </w:rPr>
+        <w:t xml:space="preserve">                                                                                          </w:t>
+      </w:r>
+    </w:p>
+    <w:p>
+      <w:pPr>
+        <w:spacing w:after="40"/>
+      </w:pPr>
+      <w:r>
+        <w:rPr>
+          <w:rFonts w:ascii="Calibri" w:cs="Calibri" w:eastAsia="Calibri" w:hAnsi="Calibri"/>
+          <w:color w:val="7A7974"/>
+          <w:sz w:val="20"/>
+          <w:szCs w:val="20"/>
+        </w:rPr>
+        <w:t xml:space="preserve">City, State, Zip: </w:t>
+      </w:r>
+      <w:r>
+        <w:rPr>
+          <w:rFonts w:ascii="Calibri" w:cs="Calibri" w:eastAsia="Calibri" w:hAnsi="Calibri"/>
+          <w:sz w:val="22"/>
+          <w:szCs w:val="22"/>
+          <w:u w:val="single" w:color="28251D"/>
+        </w:rPr>
+        <w:t xml:space="preserve">                                                                                </w:t>
+      </w:r>
+    </w:p>
+    <w:p>
+      <w:pPr>
+        <w:spacing w:after="180"/>
+      </w:pPr>
+      <w:r>
+        <w:rPr>
+          <w:rFonts w:ascii="Calibri" w:cs="Calibri" w:eastAsia="Calibri" w:hAnsi="Calibri"/>
+          <w:color w:val="7A7974"/>
+          <w:sz w:val="20"/>
+          <w:szCs w:val="20"/>
+        </w:rPr>
+        <w:t xml:space="preserve">Country (if outside US): </w:t>
       </w:r>
       <w:r>
         <w:rPr>
@@ -692,6 +891,7 @@
     </w:p>
     <w:p>
       <w:pPr>
+        <w:keepNext w:val="false"/>
         <w:spacing w:after="160"/>
       </w:pPr>
       <w:r>
@@ -715,6 +915,7 @@
     </w:p>
     <w:p>
       <w:pPr>
+        <w:keepNext w:val="false"/>
         <w:spacing w:after="160"/>
       </w:pPr>
       <w:r>
@@ -765,25 +966,42 @@
     </w:p>
     <w:p>
       <w:pPr>
-        <w:spacing w:after="160"/>
-      </w:pPr>
-      <w:r>
-        <w:rPr>
-          <w:rFonts w:ascii="Calibri" w:cs="Calibri" w:eastAsia="Calibri" w:hAnsi="Calibri"/>
-          <w:color w:val="28251D"/>
-          <w:sz w:val="22"/>
-          <w:szCs w:val="22"/>
-        </w:rPr>
-        <w:t xml:space="preserve">Sole legal custody / other parent deceased / other parent whereabouts unknown / other: </w:t>
-      </w:r>
-      <w:r>
-        <w:rPr>
-          <w:rFonts w:ascii="Calibri" w:cs="Calibri" w:eastAsia="Calibri" w:hAnsi="Calibri"/>
-          <w:sz w:val="22"/>
-          <w:szCs w:val="22"/>
-          <w:u w:val="single" w:color="28251D"/>
-        </w:rPr>
-        <w:t xml:space="preserve">                                                            </w:t>
+        <w:keepNext/>
+        <w:spacing w:after="20"/>
+      </w:pPr>
+      <w:r>
+        <w:rPr>
+          <w:rFonts w:ascii="Calibri" w:cs="Calibri" w:eastAsia="Calibri" w:hAnsi="Calibri"/>
+          <w:color w:val="28251D"/>
+          <w:sz w:val="22"/>
+          <w:szCs w:val="22"/>
+        </w:rPr>
+        <w:t xml:space="preserve">Basis: </w:t>
+      </w:r>
+      <w:r>
+        <w:rPr>
+          <w:rFonts w:ascii="Calibri" w:cs="Calibri" w:eastAsia="Calibri" w:hAnsi="Calibri"/>
+          <w:sz w:val="22"/>
+          <w:szCs w:val="22"/>
+          <w:u w:val="single" w:color="28251D"/>
+        </w:rPr>
+        <w:t xml:space="preserve">                                                                                          </w:t>
+      </w:r>
+    </w:p>
+    <w:p>
+      <w:pPr>
+        <w:spacing w:after="160"/>
+      </w:pPr>
+      <w:r>
+        <w:rPr>
+          <w:rFonts w:ascii="Calibri" w:cs="Calibri" w:eastAsia="Calibri" w:hAnsi="Calibri"/>
+          <w:i/>
+          <w:iCs/>
+          <w:color w:val="7A7974"/>
+          <w:sz w:val="16"/>
+          <w:szCs w:val="16"/>
+        </w:rPr>
+        <w:t xml:space="preserve">sole legal custody / other parent deceased / other parent whereabouts unknown / other — describe</w:t>
       </w:r>
     </w:p>
     <w:p>
@@ -852,16 +1070,189 @@
     </w:p>
     <w:p>
       <w:pPr>
-        <w:spacing w:after="160"/>
-      </w:pPr>
-      <w:r>
-        <w:rPr>
-          <w:rFonts w:ascii="Calibri" w:cs="Calibri" w:eastAsia="Calibri" w:hAnsi="Calibri"/>
-          <w:color w:val="28251D"/>
-          <w:sz w:val="22"/>
-          <w:szCs w:val="22"/>
-        </w:rPr>
-        <w:t xml:space="preserve">Full legal name of guardian: </w:t>
+        <w:spacing w:after="20"/>
+      </w:pPr>
+      <w:r>
+        <w:rPr>
+          <w:rFonts w:ascii="Calibri" w:cs="Calibri" w:eastAsia="Calibri" w:hAnsi="Calibri"/>
+          <w:color w:val="28251D"/>
+          <w:sz w:val="22"/>
+          <w:szCs w:val="22"/>
+        </w:rPr>
+        <w:t xml:space="preserve">Full legal name of guardian:</w:t>
+      </w:r>
+    </w:p>
+    <w:p>
+      <w:pPr>
+        <w:spacing w:after="160"/>
+      </w:pPr>
+      <w:r>
+        <w:rPr>
+          <w:rFonts w:ascii="Calibri" w:cs="Calibri" w:eastAsia="Calibri" w:hAnsi="Calibri"/>
+          <w:sz w:val="22"/>
+          <w:szCs w:val="22"/>
+          <w:u w:val="single" w:color="28251D"/>
+        </w:rPr>
+        <w:t xml:space="preserve">                                                                                                    </w:t>
+      </w:r>
+    </w:p>
+    <w:p>
+      <w:pPr>
+        <w:spacing w:after="20"/>
+      </w:pPr>
+      <w:r>
+        <w:rPr>
+          <w:rFonts w:ascii="Calibri" w:cs="Calibri" w:eastAsia="Calibri" w:hAnsi="Calibri"/>
+          <w:color w:val="28251D"/>
+          <w:sz w:val="22"/>
+          <w:szCs w:val="22"/>
+        </w:rPr>
+        <w:t xml:space="preserve">Residence address:</w:t>
+      </w:r>
+    </w:p>
+    <w:p>
+      <w:pPr>
+        <w:spacing w:after="40"/>
+      </w:pPr>
+      <w:r>
+        <w:rPr>
+          <w:rFonts w:ascii="Calibri" w:cs="Calibri" w:eastAsia="Calibri" w:hAnsi="Calibri"/>
+          <w:color w:val="7A7974"/>
+          <w:sz w:val="20"/>
+          <w:szCs w:val="20"/>
+        </w:rPr>
+        <w:t xml:space="preserve">Street: </w:t>
+      </w:r>
+      <w:r>
+        <w:rPr>
+          <w:rFonts w:ascii="Calibri" w:cs="Calibri" w:eastAsia="Calibri" w:hAnsi="Calibri"/>
+          <w:sz w:val="22"/>
+          <w:szCs w:val="22"/>
+          <w:u w:val="single" w:color="28251D"/>
+        </w:rPr>
+        <w:t xml:space="preserve">                                                                                          </w:t>
+      </w:r>
+    </w:p>
+    <w:p>
+      <w:pPr>
+        <w:spacing w:after="40"/>
+      </w:pPr>
+      <w:r>
+        <w:rPr>
+          <w:rFonts w:ascii="Calibri" w:cs="Calibri" w:eastAsia="Calibri" w:hAnsi="Calibri"/>
+          <w:color w:val="7A7974"/>
+          <w:sz w:val="20"/>
+          <w:szCs w:val="20"/>
+        </w:rPr>
+        <w:t xml:space="preserve">City, State, Zip: </w:t>
+      </w:r>
+      <w:r>
+        <w:rPr>
+          <w:rFonts w:ascii="Calibri" w:cs="Calibri" w:eastAsia="Calibri" w:hAnsi="Calibri"/>
+          <w:sz w:val="22"/>
+          <w:szCs w:val="22"/>
+          <w:u w:val="single" w:color="28251D"/>
+        </w:rPr>
+        <w:t xml:space="preserve">                                                                                </w:t>
+      </w:r>
+    </w:p>
+    <w:p>
+      <w:pPr>
+        <w:spacing w:after="180"/>
+      </w:pPr>
+      <w:r>
+        <w:rPr>
+          <w:rFonts w:ascii="Calibri" w:cs="Calibri" w:eastAsia="Calibri" w:hAnsi="Calibri"/>
+          <w:color w:val="7A7974"/>
+          <w:sz w:val="20"/>
+          <w:szCs w:val="20"/>
+        </w:rPr>
+        <w:t xml:space="preserve">Country (if outside US): </w:t>
+      </w:r>
+      <w:r>
+        <w:rPr>
+          <w:rFonts w:ascii="Calibri" w:cs="Calibri" w:eastAsia="Calibri" w:hAnsi="Calibri"/>
+          <w:sz w:val="22"/>
+          <w:szCs w:val="22"/>
+          <w:u w:val="single" w:color="28251D"/>
+        </w:rPr>
+        <w:t xml:space="preserve">                                                                      </w:t>
+      </w:r>
+    </w:p>
+    <w:p>
+      <w:pPr>
+        <w:keepNext w:val="false"/>
+        <w:spacing w:after="160"/>
+      </w:pPr>
+      <w:r>
+        <w:rPr>
+          <w:rFonts w:ascii="Calibri" w:cs="Calibri" w:eastAsia="Calibri" w:hAnsi="Calibri"/>
+          <w:color w:val="28251D"/>
+          <w:sz w:val="22"/>
+          <w:szCs w:val="22"/>
+        </w:rPr>
+        <w:t xml:space="preserve">Date of birth: </w:t>
+      </w:r>
+      <w:r>
+        <w:rPr>
+          <w:rFonts w:ascii="Calibri" w:cs="Calibri" w:eastAsia="Calibri" w:hAnsi="Calibri"/>
+          <w:sz w:val="22"/>
+          <w:szCs w:val="22"/>
+          <w:u w:val="single" w:color="28251D"/>
+        </w:rPr>
+        <w:t xml:space="preserve">                    </w:t>
+      </w:r>
+    </w:p>
+    <w:p>
+      <w:pPr>
+        <w:keepNext w:val="false"/>
+        <w:spacing w:after="160"/>
+      </w:pPr>
+      <w:r>
+        <w:rPr>
+          <w:rFonts w:ascii="Calibri" w:cs="Calibri" w:eastAsia="Calibri" w:hAnsi="Calibri"/>
+          <w:color w:val="28251D"/>
+          <w:sz w:val="22"/>
+          <w:szCs w:val="22"/>
+        </w:rPr>
+        <w:t xml:space="preserve">Passport or driver's license number: </w:t>
+      </w:r>
+      <w:r>
+        <w:rPr>
+          <w:rFonts w:ascii="Calibri" w:cs="Calibri" w:eastAsia="Calibri" w:hAnsi="Calibri"/>
+          <w:sz w:val="22"/>
+          <w:szCs w:val="22"/>
+          <w:u w:val="single" w:color="28251D"/>
+        </w:rPr>
+        <w:t xml:space="preserve">                                        </w:t>
+      </w:r>
+    </w:p>
+    <w:p>
+      <w:pPr>
+        <w:spacing w:after="120"/>
+      </w:pPr>
+      <w:r>
+        <w:rPr>
+          <w:rFonts w:ascii="Calibri" w:cs="Calibri" w:eastAsia="Calibri" w:hAnsi="Calibri"/>
+          <w:sz w:val="22"/>
+          <w:szCs w:val="22"/>
+        </w:rPr>
+        <w:t xml:space="preserve"/>
+      </w:r>
+    </w:p>
+    <w:p>
+      <w:pPr>
+        <w:keepNext w:val="false"/>
+        <w:spacing w:after="160"/>
+      </w:pPr>
+      <w:r>
+        <w:rPr>
+          <w:rFonts w:ascii="Calibri" w:cs="Calibri" w:eastAsia="Calibri" w:hAnsi="Calibri"/>
+          <w:color w:val="28251D"/>
+          <w:sz w:val="22"/>
+          <w:szCs w:val="22"/>
+        </w:rPr>
+        <w:t xml:space="preserve">Appointing court: </w:t>
       </w:r>
       <w:r>
         <w:rPr>
@@ -875,62 +1266,17 @@
     </w:p>
     <w:p>
       <w:pPr>
-        <w:spacing w:after="160"/>
-      </w:pPr>
-      <w:r>
-        <w:rPr>
-          <w:rFonts w:ascii="Calibri" w:cs="Calibri" w:eastAsia="Calibri" w:hAnsi="Calibri"/>
-          <w:color w:val="28251D"/>
-          <w:sz w:val="22"/>
-          <w:szCs w:val="22"/>
-        </w:rPr>
-        <w:t xml:space="preserve">Residence address: </w:t>
-      </w:r>
-      <w:r>
-        <w:rPr>
-          <w:rFonts w:ascii="Calibri" w:cs="Calibri" w:eastAsia="Calibri" w:hAnsi="Calibri"/>
-          <w:sz w:val="22"/>
-          <w:szCs w:val="22"/>
-          <w:u w:val="single" w:color="28251D"/>
-        </w:rPr>
-        <w:t xml:space="preserve">                                                                      </w:t>
-      </w:r>
-    </w:p>
-    <w:p>
-      <w:pPr>
-        <w:spacing w:after="160"/>
-      </w:pPr>
-      <w:r>
-        <w:rPr>
-          <w:rFonts w:ascii="Calibri" w:cs="Calibri" w:eastAsia="Calibri" w:hAnsi="Calibri"/>
-          <w:color w:val="28251D"/>
-          <w:sz w:val="22"/>
-          <w:szCs w:val="22"/>
-        </w:rPr>
-        <w:t xml:space="preserve">Date of birth: </w:t>
-      </w:r>
-      <w:r>
-        <w:rPr>
-          <w:rFonts w:ascii="Calibri" w:cs="Calibri" w:eastAsia="Calibri" w:hAnsi="Calibri"/>
-          <w:sz w:val="22"/>
-          <w:szCs w:val="22"/>
-          <w:u w:val="single" w:color="28251D"/>
-        </w:rPr>
-        <w:t xml:space="preserve">                    </w:t>
-      </w:r>
-    </w:p>
-    <w:p>
-      <w:pPr>
-        <w:spacing w:after="160"/>
-      </w:pPr>
-      <w:r>
-        <w:rPr>
-          <w:rFonts w:ascii="Calibri" w:cs="Calibri" w:eastAsia="Calibri" w:hAnsi="Calibri"/>
-          <w:color w:val="28251D"/>
-          <w:sz w:val="22"/>
-          <w:szCs w:val="22"/>
-        </w:rPr>
-        <w:t xml:space="preserve">Passport or driver's license number: </w:t>
+        <w:keepNext w:val="false"/>
+        <w:spacing w:after="160"/>
+      </w:pPr>
+      <w:r>
+        <w:rPr>
+          <w:rFonts w:ascii="Calibri" w:cs="Calibri" w:eastAsia="Calibri" w:hAnsi="Calibri"/>
+          <w:color w:val="28251D"/>
+          <w:sz w:val="22"/>
+          <w:szCs w:val="22"/>
+        </w:rPr>
+        <w:t xml:space="preserve">Case number: </w:t>
       </w:r>
       <w:r>
         <w:rPr>
@@ -944,65 +1290,7 @@
     </w:p>
     <w:p>
       <w:pPr>
-        <w:spacing w:after="120"/>
-      </w:pPr>
-      <w:r>
-        <w:rPr>
-          <w:rFonts w:ascii="Calibri" w:cs="Calibri" w:eastAsia="Calibri" w:hAnsi="Calibri"/>
-          <w:sz w:val="22"/>
-          <w:szCs w:val="22"/>
-        </w:rPr>
-        <w:t xml:space="preserve"/>
-      </w:r>
-    </w:p>
-    <w:p>
-      <w:pPr>
-        <w:spacing w:after="160"/>
-      </w:pPr>
-      <w:r>
-        <w:rPr>
-          <w:rFonts w:ascii="Calibri" w:cs="Calibri" w:eastAsia="Calibri" w:hAnsi="Calibri"/>
-          <w:color w:val="28251D"/>
-          <w:sz w:val="22"/>
-          <w:szCs w:val="22"/>
-        </w:rPr>
-        <w:t xml:space="preserve">Appointing court: </w:t>
-      </w:r>
-      <w:r>
-        <w:rPr>
-          <w:rFonts w:ascii="Calibri" w:cs="Calibri" w:eastAsia="Calibri" w:hAnsi="Calibri"/>
-          <w:sz w:val="22"/>
-          <w:szCs w:val="22"/>
-          <w:u w:val="single" w:color="28251D"/>
-        </w:rPr>
-        <w:t xml:space="preserve">                                                            </w:t>
-      </w:r>
-    </w:p>
-    <w:p>
-      <w:pPr>
-        <w:spacing w:after="160"/>
-      </w:pPr>
-      <w:r>
-        <w:rPr>
-          <w:rFonts w:ascii="Calibri" w:cs="Calibri" w:eastAsia="Calibri" w:hAnsi="Calibri"/>
-          <w:color w:val="28251D"/>
-          <w:sz w:val="22"/>
-          <w:szCs w:val="22"/>
-        </w:rPr>
-        <w:t xml:space="preserve">Case number: </w:t>
-      </w:r>
-      <w:r>
-        <w:rPr>
-          <w:rFonts w:ascii="Calibri" w:cs="Calibri" w:eastAsia="Calibri" w:hAnsi="Calibri"/>
-          <w:sz w:val="22"/>
-          <w:szCs w:val="22"/>
-          <w:u w:val="single" w:color="28251D"/>
-        </w:rPr>
-        <w:t xml:space="preserve">                                        </w:t>
-      </w:r>
-    </w:p>
-    <w:p>
-      <w:pPr>
+        <w:keepNext w:val="false"/>
         <w:spacing w:after="160"/>
       </w:pPr>
       <w:r>
@@ -1118,29 +1406,35 @@
     </w:p>
     <w:p>
       <w:pPr>
-        <w:spacing w:after="160"/>
-      </w:pPr>
-      <w:r>
-        <w:rPr>
-          <w:rFonts w:ascii="Calibri" w:cs="Calibri" w:eastAsia="Calibri" w:hAnsi="Calibri"/>
-          <w:color w:val="28251D"/>
-          <w:sz w:val="22"/>
-          <w:szCs w:val="22"/>
-        </w:rPr>
-        <w:t xml:space="preserve">Full legal name: </w:t>
-      </w:r>
-      <w:r>
-        <w:rPr>
-          <w:rFonts w:ascii="Calibri" w:cs="Calibri" w:eastAsia="Calibri" w:hAnsi="Calibri"/>
-          <w:sz w:val="22"/>
-          <w:szCs w:val="22"/>
-          <w:u w:val="single" w:color="28251D"/>
-        </w:rPr>
-        <w:t xml:space="preserve">                                                            </w:t>
-      </w:r>
-    </w:p>
-    <w:p>
-      <w:pPr>
+        <w:spacing w:after="20"/>
+      </w:pPr>
+      <w:r>
+        <w:rPr>
+          <w:rFonts w:ascii="Calibri" w:cs="Calibri" w:eastAsia="Calibri" w:hAnsi="Calibri"/>
+          <w:color w:val="28251D"/>
+          <w:sz w:val="22"/>
+          <w:szCs w:val="22"/>
+        </w:rPr>
+        <w:t xml:space="preserve">Full legal name:</w:t>
+      </w:r>
+    </w:p>
+    <w:p>
+      <w:pPr>
+        <w:spacing w:after="160"/>
+      </w:pPr>
+      <w:r>
+        <w:rPr>
+          <w:rFonts w:ascii="Calibri" w:cs="Calibri" w:eastAsia="Calibri" w:hAnsi="Calibri"/>
+          <w:sz w:val="22"/>
+          <w:szCs w:val="22"/>
+          <w:u w:val="single" w:color="28251D"/>
+        </w:rPr>
+        <w:t xml:space="preserve">                                                                                                    </w:t>
+      </w:r>
+    </w:p>
+    <w:p>
+      <w:pPr>
+        <w:keepNext w:val="false"/>
         <w:spacing w:after="160"/>
       </w:pPr>
       <w:r>
@@ -1164,16 +1458,17 @@
     </w:p>
     <w:p>
       <w:pPr>
-        <w:spacing w:after="160"/>
-      </w:pPr>
-      <w:r>
-        <w:rPr>
-          <w:rFonts w:ascii="Calibri" w:cs="Calibri" w:eastAsia="Calibri" w:hAnsi="Calibri"/>
-          <w:color w:val="28251D"/>
-          <w:sz w:val="22"/>
-          <w:szCs w:val="22"/>
-        </w:rPr>
-        <w:t xml:space="preserve">Place of birth (city, state, country): </w:t>
+        <w:keepNext/>
+        <w:spacing w:after="20"/>
+      </w:pPr>
+      <w:r>
+        <w:rPr>
+          <w:rFonts w:ascii="Calibri" w:cs="Calibri" w:eastAsia="Calibri" w:hAnsi="Calibri"/>
+          <w:color w:val="28251D"/>
+          <w:sz w:val="22"/>
+          <w:szCs w:val="22"/>
+        </w:rPr>
+        <w:t xml:space="preserve">Place of birth: </w:t>
       </w:r>
       <w:r>
         <w:rPr>
@@ -1192,6 +1487,23 @@
       <w:r>
         <w:rPr>
           <w:rFonts w:ascii="Calibri" w:cs="Calibri" w:eastAsia="Calibri" w:hAnsi="Calibri"/>
+          <w:i/>
+          <w:iCs/>
+          <w:color w:val="7A7974"/>
+          <w:sz w:val="16"/>
+          <w:szCs w:val="16"/>
+        </w:rPr>
+        <w:t xml:space="preserve">City, State, Country</w:t>
+      </w:r>
+    </w:p>
+    <w:p>
+      <w:pPr>
+        <w:keepNext w:val="false"/>
+        <w:spacing w:after="160"/>
+      </w:pPr>
+      <w:r>
+        <w:rPr>
+          <w:rFonts w:ascii="Calibri" w:cs="Calibri" w:eastAsia="Calibri" w:hAnsi="Calibri"/>
           <w:color w:val="28251D"/>
           <w:sz w:val="22"/>
           <w:szCs w:val="22"/>
@@ -1210,6 +1522,7 @@
     </w:p>
     <w:p>
       <w:pPr>
+        <w:keepNext w:val="false"/>
         <w:spacing w:after="160"/>
       </w:pPr>
       <w:r>
@@ -1233,25 +1546,42 @@
     </w:p>
     <w:p>
       <w:pPr>
-        <w:spacing w:after="160"/>
-      </w:pPr>
-      <w:r>
-        <w:rPr>
-          <w:rFonts w:ascii="Calibri" w:cs="Calibri" w:eastAsia="Calibri" w:hAnsi="Calibri"/>
-          <w:color w:val="28251D"/>
-          <w:sz w:val="22"/>
-          <w:szCs w:val="22"/>
-        </w:rPr>
-        <w:t xml:space="preserve">Relationship to consenting party (son / daughter / ward): </w:t>
-      </w:r>
-      <w:r>
-        <w:rPr>
-          <w:rFonts w:ascii="Calibri" w:cs="Calibri" w:eastAsia="Calibri" w:hAnsi="Calibri"/>
-          <w:sz w:val="22"/>
-          <w:szCs w:val="22"/>
-          <w:u w:val="single" w:color="28251D"/>
-        </w:rPr>
-        <w:t xml:space="preserve">                    </w:t>
+        <w:keepNext/>
+        <w:spacing w:after="20"/>
+      </w:pPr>
+      <w:r>
+        <w:rPr>
+          <w:rFonts w:ascii="Calibri" w:cs="Calibri" w:eastAsia="Calibri" w:hAnsi="Calibri"/>
+          <w:color w:val="28251D"/>
+          <w:sz w:val="22"/>
+          <w:szCs w:val="22"/>
+        </w:rPr>
+        <w:t xml:space="preserve">Relationship to consenting party: </w:t>
+      </w:r>
+      <w:r>
+        <w:rPr>
+          <w:rFonts w:ascii="Calibri" w:cs="Calibri" w:eastAsia="Calibri" w:hAnsi="Calibri"/>
+          <w:sz w:val="22"/>
+          <w:szCs w:val="22"/>
+          <w:u w:val="single" w:color="28251D"/>
+        </w:rPr>
+        <w:t xml:space="preserve">                                        </w:t>
+      </w:r>
+    </w:p>
+    <w:p>
+      <w:pPr>
+        <w:spacing w:after="160"/>
+      </w:pPr>
+      <w:r>
+        <w:rPr>
+          <w:rFonts w:ascii="Calibri" w:cs="Calibri" w:eastAsia="Calibri" w:hAnsi="Calibri"/>
+          <w:i/>
+          <w:iCs/>
+          <w:color w:val="7A7974"/>
+          <w:sz w:val="16"/>
+          <w:szCs w:val="16"/>
+        </w:rPr>
+        <w:t xml:space="preserve">son / daughter / ward</w:t>
       </w:r>
     </w:p>
     <w:p>
@@ -1285,29 +1615,35 @@
     </w:p>
     <w:p>
       <w:pPr>
-        <w:spacing w:after="160"/>
-      </w:pPr>
-      <w:r>
-        <w:rPr>
-          <w:rFonts w:ascii="Calibri" w:cs="Calibri" w:eastAsia="Calibri" w:hAnsi="Calibri"/>
-          <w:color w:val="28251D"/>
-          <w:sz w:val="22"/>
-          <w:szCs w:val="22"/>
-        </w:rPr>
-        <w:t xml:space="preserve">Full legal name: </w:t>
-      </w:r>
-      <w:r>
-        <w:rPr>
-          <w:rFonts w:ascii="Calibri" w:cs="Calibri" w:eastAsia="Calibri" w:hAnsi="Calibri"/>
-          <w:sz w:val="22"/>
-          <w:szCs w:val="22"/>
-          <w:u w:val="single" w:color="28251D"/>
-        </w:rPr>
-        <w:t xml:space="preserve">                                                            </w:t>
-      </w:r>
-    </w:p>
-    <w:p>
-      <w:pPr>
+        <w:spacing w:after="20"/>
+      </w:pPr>
+      <w:r>
+        <w:rPr>
+          <w:rFonts w:ascii="Calibri" w:cs="Calibri" w:eastAsia="Calibri" w:hAnsi="Calibri"/>
+          <w:color w:val="28251D"/>
+          <w:sz w:val="22"/>
+          <w:szCs w:val="22"/>
+        </w:rPr>
+        <w:t xml:space="preserve">Full legal name:</w:t>
+      </w:r>
+    </w:p>
+    <w:p>
+      <w:pPr>
+        <w:spacing w:after="160"/>
+      </w:pPr>
+      <w:r>
+        <w:rPr>
+          <w:rFonts w:ascii="Calibri" w:cs="Calibri" w:eastAsia="Calibri" w:hAnsi="Calibri"/>
+          <w:sz w:val="22"/>
+          <w:szCs w:val="22"/>
+          <w:u w:val="single" w:color="28251D"/>
+        </w:rPr>
+        <w:t xml:space="preserve">                                                                                                    </w:t>
+      </w:r>
+    </w:p>
+    <w:p>
+      <w:pPr>
+        <w:keepNext w:val="false"/>
         <w:spacing w:after="160"/>
       </w:pPr>
       <w:r>
@@ -1331,16 +1667,17 @@
     </w:p>
     <w:p>
       <w:pPr>
-        <w:spacing w:after="160"/>
-      </w:pPr>
-      <w:r>
-        <w:rPr>
-          <w:rFonts w:ascii="Calibri" w:cs="Calibri" w:eastAsia="Calibri" w:hAnsi="Calibri"/>
-          <w:color w:val="28251D"/>
-          <w:sz w:val="22"/>
-          <w:szCs w:val="22"/>
-        </w:rPr>
-        <w:t xml:space="preserve">Place of birth (city, state, country): </w:t>
+        <w:keepNext/>
+        <w:spacing w:after="20"/>
+      </w:pPr>
+      <w:r>
+        <w:rPr>
+          <w:rFonts w:ascii="Calibri" w:cs="Calibri" w:eastAsia="Calibri" w:hAnsi="Calibri"/>
+          <w:color w:val="28251D"/>
+          <w:sz w:val="22"/>
+          <w:szCs w:val="22"/>
+        </w:rPr>
+        <w:t xml:space="preserve">Place of birth: </w:t>
       </w:r>
       <w:r>
         <w:rPr>
@@ -1359,6 +1696,23 @@
       <w:r>
         <w:rPr>
           <w:rFonts w:ascii="Calibri" w:cs="Calibri" w:eastAsia="Calibri" w:hAnsi="Calibri"/>
+          <w:i/>
+          <w:iCs/>
+          <w:color w:val="7A7974"/>
+          <w:sz w:val="16"/>
+          <w:szCs w:val="16"/>
+        </w:rPr>
+        <w:t xml:space="preserve">City, State, Country</w:t>
+      </w:r>
+    </w:p>
+    <w:p>
+      <w:pPr>
+        <w:keepNext w:val="false"/>
+        <w:spacing w:after="160"/>
+      </w:pPr>
+      <w:r>
+        <w:rPr>
+          <w:rFonts w:ascii="Calibri" w:cs="Calibri" w:eastAsia="Calibri" w:hAnsi="Calibri"/>
           <w:color w:val="28251D"/>
           <w:sz w:val="22"/>
           <w:szCs w:val="22"/>
@@ -1377,6 +1731,7 @@
     </w:p>
     <w:p>
       <w:pPr>
+        <w:keepNext w:val="false"/>
         <w:spacing w:after="160"/>
       </w:pPr>
       <w:r>
@@ -1400,7 +1755,8 @@
     </w:p>
     <w:p>
       <w:pPr>
-        <w:spacing w:after="160"/>
+        <w:keepNext/>
+        <w:spacing w:after="20"/>
       </w:pPr>
       <w:r>
         <w:rPr>
@@ -1418,7 +1774,23 @@
           <w:szCs w:val="22"/>
           <w:u w:val="single" w:color="28251D"/>
         </w:rPr>
-        <w:t xml:space="preserve">                    </w:t>
+        <w:t xml:space="preserve">                                        </w:t>
+      </w:r>
+    </w:p>
+    <w:p>
+      <w:pPr>
+        <w:spacing w:after="160"/>
+      </w:pPr>
+      <w:r>
+        <w:rPr>
+          <w:rFonts w:ascii="Calibri" w:cs="Calibri" w:eastAsia="Calibri" w:hAnsi="Calibri"/>
+          <w:i/>
+          <w:iCs/>
+          <w:color w:val="7A7974"/>
+          <w:sz w:val="16"/>
+          <w:szCs w:val="16"/>
+        </w:rPr>
+        <w:t xml:space="preserve">son / daughter / ward</w:t>
       </w:r>
     </w:p>
     <w:p>
@@ -1452,29 +1824,35 @@
     </w:p>
     <w:p>
       <w:pPr>
-        <w:spacing w:after="160"/>
-      </w:pPr>
-      <w:r>
-        <w:rPr>
-          <w:rFonts w:ascii="Calibri" w:cs="Calibri" w:eastAsia="Calibri" w:hAnsi="Calibri"/>
-          <w:color w:val="28251D"/>
-          <w:sz w:val="22"/>
-          <w:szCs w:val="22"/>
-        </w:rPr>
-        <w:t xml:space="preserve">Full legal name: </w:t>
-      </w:r>
-      <w:r>
-        <w:rPr>
-          <w:rFonts w:ascii="Calibri" w:cs="Calibri" w:eastAsia="Calibri" w:hAnsi="Calibri"/>
-          <w:sz w:val="22"/>
-          <w:szCs w:val="22"/>
-          <w:u w:val="single" w:color="28251D"/>
-        </w:rPr>
-        <w:t xml:space="preserve">                                                            </w:t>
-      </w:r>
-    </w:p>
-    <w:p>
-      <w:pPr>
+        <w:spacing w:after="20"/>
+      </w:pPr>
+      <w:r>
+        <w:rPr>
+          <w:rFonts w:ascii="Calibri" w:cs="Calibri" w:eastAsia="Calibri" w:hAnsi="Calibri"/>
+          <w:color w:val="28251D"/>
+          <w:sz w:val="22"/>
+          <w:szCs w:val="22"/>
+        </w:rPr>
+        <w:t xml:space="preserve">Full legal name:</w:t>
+      </w:r>
+    </w:p>
+    <w:p>
+      <w:pPr>
+        <w:spacing w:after="160"/>
+      </w:pPr>
+      <w:r>
+        <w:rPr>
+          <w:rFonts w:ascii="Calibri" w:cs="Calibri" w:eastAsia="Calibri" w:hAnsi="Calibri"/>
+          <w:sz w:val="22"/>
+          <w:szCs w:val="22"/>
+          <w:u w:val="single" w:color="28251D"/>
+        </w:rPr>
+        <w:t xml:space="preserve">                                                                                                    </w:t>
+      </w:r>
+    </w:p>
+    <w:p>
+      <w:pPr>
+        <w:keepNext w:val="false"/>
         <w:spacing w:after="160"/>
       </w:pPr>
       <w:r>
@@ -1498,16 +1876,17 @@
     </w:p>
     <w:p>
       <w:pPr>
-        <w:spacing w:after="160"/>
-      </w:pPr>
-      <w:r>
-        <w:rPr>
-          <w:rFonts w:ascii="Calibri" w:cs="Calibri" w:eastAsia="Calibri" w:hAnsi="Calibri"/>
-          <w:color w:val="28251D"/>
-          <w:sz w:val="22"/>
-          <w:szCs w:val="22"/>
-        </w:rPr>
-        <w:t xml:space="preserve">Place of birth (city, state, country): </w:t>
+        <w:keepNext/>
+        <w:spacing w:after="20"/>
+      </w:pPr>
+      <w:r>
+        <w:rPr>
+          <w:rFonts w:ascii="Calibri" w:cs="Calibri" w:eastAsia="Calibri" w:hAnsi="Calibri"/>
+          <w:color w:val="28251D"/>
+          <w:sz w:val="22"/>
+          <w:szCs w:val="22"/>
+        </w:rPr>
+        <w:t xml:space="preserve">Place of birth: </w:t>
       </w:r>
       <w:r>
         <w:rPr>
@@ -1526,6 +1905,23 @@
       <w:r>
         <w:rPr>
           <w:rFonts w:ascii="Calibri" w:cs="Calibri" w:eastAsia="Calibri" w:hAnsi="Calibri"/>
+          <w:i/>
+          <w:iCs/>
+          <w:color w:val="7A7974"/>
+          <w:sz w:val="16"/>
+          <w:szCs w:val="16"/>
+        </w:rPr>
+        <w:t xml:space="preserve">City, State, Country</w:t>
+      </w:r>
+    </w:p>
+    <w:p>
+      <w:pPr>
+        <w:keepNext w:val="false"/>
+        <w:spacing w:after="160"/>
+      </w:pPr>
+      <w:r>
+        <w:rPr>
+          <w:rFonts w:ascii="Calibri" w:cs="Calibri" w:eastAsia="Calibri" w:hAnsi="Calibri"/>
           <w:color w:val="28251D"/>
           <w:sz w:val="22"/>
           <w:szCs w:val="22"/>
@@ -1544,6 +1940,7 @@
     </w:p>
     <w:p>
       <w:pPr>
+        <w:keepNext w:val="false"/>
         <w:spacing w:after="160"/>
       </w:pPr>
       <w:r>
@@ -1567,7 +1964,8 @@
     </w:p>
     <w:p>
       <w:pPr>
-        <w:spacing w:after="160"/>
+        <w:keepNext/>
+        <w:spacing w:after="20"/>
       </w:pPr>
       <w:r>
         <w:rPr>
@@ -1585,7 +1983,23 @@
           <w:szCs w:val="22"/>
           <w:u w:val="single" w:color="28251D"/>
         </w:rPr>
-        <w:t xml:space="preserve">                    </w:t>
+        <w:t xml:space="preserve">                                        </w:t>
+      </w:r>
+    </w:p>
+    <w:p>
+      <w:pPr>
+        <w:spacing w:after="160"/>
+      </w:pPr>
+      <w:r>
+        <w:rPr>
+          <w:rFonts w:ascii="Calibri" w:cs="Calibri" w:eastAsia="Calibri" w:hAnsi="Calibri"/>
+          <w:i/>
+          <w:iCs/>
+          <w:color w:val="7A7974"/>
+          <w:sz w:val="16"/>
+          <w:szCs w:val="16"/>
+        </w:rPr>
+        <w:t xml:space="preserve">son / daughter / ward</w:t>
       </w:r>
     </w:p>
     <w:p>
@@ -1655,25 +2069,30 @@
     </w:p>
     <w:p>
       <w:pPr>
-        <w:spacing w:after="160"/>
-      </w:pPr>
-      <w:r>
-        <w:rPr>
-          <w:rFonts w:ascii="Calibri" w:cs="Calibri" w:eastAsia="Calibri" w:hAnsi="Calibri"/>
-          <w:color w:val="28251D"/>
-          <w:sz w:val="22"/>
-          <w:szCs w:val="22"/>
-        </w:rPr>
-        <w:t xml:space="preserve">Name of the accompanying parent: </w:t>
-      </w:r>
-      <w:r>
-        <w:rPr>
-          <w:rFonts w:ascii="Calibri" w:cs="Calibri" w:eastAsia="Calibri" w:hAnsi="Calibri"/>
-          <w:sz w:val="22"/>
-          <w:szCs w:val="22"/>
-          <w:u w:val="single" w:color="28251D"/>
-        </w:rPr>
-        <w:t xml:space="preserve">                                                            </w:t>
+        <w:spacing w:after="20"/>
+      </w:pPr>
+      <w:r>
+        <w:rPr>
+          <w:rFonts w:ascii="Calibri" w:cs="Calibri" w:eastAsia="Calibri" w:hAnsi="Calibri"/>
+          <w:color w:val="28251D"/>
+          <w:sz w:val="22"/>
+          <w:szCs w:val="22"/>
+        </w:rPr>
+        <w:t xml:space="preserve">Name of the accompanying parent:</w:t>
+      </w:r>
+    </w:p>
+    <w:p>
+      <w:pPr>
+        <w:spacing w:after="160"/>
+      </w:pPr>
+      <w:r>
+        <w:rPr>
+          <w:rFonts w:ascii="Calibri" w:cs="Calibri" w:eastAsia="Calibri" w:hAnsi="Calibri"/>
+          <w:sz w:val="22"/>
+          <w:szCs w:val="22"/>
+          <w:u w:val="single" w:color="28251D"/>
+        </w:rPr>
+        <w:t xml:space="preserve">                                                                                                    </w:t>
       </w:r>
     </w:p>
     <w:p>
@@ -1723,29 +2142,35 @@
     </w:p>
     <w:p>
       <w:pPr>
-        <w:spacing w:after="160"/>
-      </w:pPr>
-      <w:r>
-        <w:rPr>
-          <w:rFonts w:ascii="Calibri" w:cs="Calibri" w:eastAsia="Calibri" w:hAnsi="Calibri"/>
-          <w:color w:val="28251D"/>
-          <w:sz w:val="22"/>
-          <w:szCs w:val="22"/>
-        </w:rPr>
-        <w:t xml:space="preserve">Full legal name: </w:t>
-      </w:r>
-      <w:r>
-        <w:rPr>
-          <w:rFonts w:ascii="Calibri" w:cs="Calibri" w:eastAsia="Calibri" w:hAnsi="Calibri"/>
-          <w:sz w:val="22"/>
-          <w:szCs w:val="22"/>
-          <w:u w:val="single" w:color="28251D"/>
-        </w:rPr>
-        <w:t xml:space="preserve">                                                            </w:t>
-      </w:r>
-    </w:p>
-    <w:p>
-      <w:pPr>
+        <w:spacing w:after="20"/>
+      </w:pPr>
+      <w:r>
+        <w:rPr>
+          <w:rFonts w:ascii="Calibri" w:cs="Calibri" w:eastAsia="Calibri" w:hAnsi="Calibri"/>
+          <w:color w:val="28251D"/>
+          <w:sz w:val="22"/>
+          <w:szCs w:val="22"/>
+        </w:rPr>
+        <w:t xml:space="preserve">Full legal name:</w:t>
+      </w:r>
+    </w:p>
+    <w:p>
+      <w:pPr>
+        <w:spacing w:after="160"/>
+      </w:pPr>
+      <w:r>
+        <w:rPr>
+          <w:rFonts w:ascii="Calibri" w:cs="Calibri" w:eastAsia="Calibri" w:hAnsi="Calibri"/>
+          <w:sz w:val="22"/>
+          <w:szCs w:val="22"/>
+          <w:u w:val="single" w:color="28251D"/>
+        </w:rPr>
+        <w:t xml:space="preserve">                                                                                                    </w:t>
+      </w:r>
+    </w:p>
+    <w:p>
+      <w:pPr>
+        <w:keepNext w:val="false"/>
         <w:spacing w:after="160"/>
       </w:pPr>
       <w:r>
@@ -1769,16 +2194,76 @@
     </w:p>
     <w:p>
       <w:pPr>
-        <w:spacing w:after="160"/>
-      </w:pPr>
-      <w:r>
-        <w:rPr>
-          <w:rFonts w:ascii="Calibri" w:cs="Calibri" w:eastAsia="Calibri" w:hAnsi="Calibri"/>
-          <w:color w:val="28251D"/>
-          <w:sz w:val="22"/>
-          <w:szCs w:val="22"/>
-        </w:rPr>
-        <w:t xml:space="preserve">Residence address: </w:t>
+        <w:spacing w:after="20"/>
+      </w:pPr>
+      <w:r>
+        <w:rPr>
+          <w:rFonts w:ascii="Calibri" w:cs="Calibri" w:eastAsia="Calibri" w:hAnsi="Calibri"/>
+          <w:color w:val="28251D"/>
+          <w:sz w:val="22"/>
+          <w:szCs w:val="22"/>
+        </w:rPr>
+        <w:t xml:space="preserve">Residence address:</w:t>
+      </w:r>
+    </w:p>
+    <w:p>
+      <w:pPr>
+        <w:spacing w:after="40"/>
+      </w:pPr>
+      <w:r>
+        <w:rPr>
+          <w:rFonts w:ascii="Calibri" w:cs="Calibri" w:eastAsia="Calibri" w:hAnsi="Calibri"/>
+          <w:color w:val="7A7974"/>
+          <w:sz w:val="20"/>
+          <w:szCs w:val="20"/>
+        </w:rPr>
+        <w:t xml:space="preserve">Street: </w:t>
+      </w:r>
+      <w:r>
+        <w:rPr>
+          <w:rFonts w:ascii="Calibri" w:cs="Calibri" w:eastAsia="Calibri" w:hAnsi="Calibri"/>
+          <w:sz w:val="22"/>
+          <w:szCs w:val="22"/>
+          <w:u w:val="single" w:color="28251D"/>
+        </w:rPr>
+        <w:t xml:space="preserve">                                                                                          </w:t>
+      </w:r>
+    </w:p>
+    <w:p>
+      <w:pPr>
+        <w:spacing w:after="40"/>
+      </w:pPr>
+      <w:r>
+        <w:rPr>
+          <w:rFonts w:ascii="Calibri" w:cs="Calibri" w:eastAsia="Calibri" w:hAnsi="Calibri"/>
+          <w:color w:val="7A7974"/>
+          <w:sz w:val="20"/>
+          <w:szCs w:val="20"/>
+        </w:rPr>
+        <w:t xml:space="preserve">City, State, Zip: </w:t>
+      </w:r>
+      <w:r>
+        <w:rPr>
+          <w:rFonts w:ascii="Calibri" w:cs="Calibri" w:eastAsia="Calibri" w:hAnsi="Calibri"/>
+          <w:sz w:val="22"/>
+          <w:szCs w:val="22"/>
+          <w:u w:val="single" w:color="28251D"/>
+        </w:rPr>
+        <w:t xml:space="preserve">                                                                                </w:t>
+      </w:r>
+    </w:p>
+    <w:p>
+      <w:pPr>
+        <w:spacing w:after="180"/>
+      </w:pPr>
+      <w:r>
+        <w:rPr>
+          <w:rFonts w:ascii="Calibri" w:cs="Calibri" w:eastAsia="Calibri" w:hAnsi="Calibri"/>
+          <w:color w:val="7A7974"/>
+          <w:sz w:val="20"/>
+          <w:szCs w:val="20"/>
+        </w:rPr>
+        <w:t xml:space="preserve">Country (if outside US): </w:t>
       </w:r>
       <w:r>
         <w:rPr>
@@ -1792,6 +2277,7 @@
     </w:p>
     <w:p>
       <w:pPr>
+        <w:keepNext w:val="false"/>
         <w:spacing w:after="160"/>
       </w:pPr>
       <w:r>
@@ -1815,6 +2301,7 @@
     </w:p>
     <w:p>
       <w:pPr>
+        <w:keepNext w:val="false"/>
         <w:spacing w:after="160"/>
       </w:pPr>
       <w:r>
@@ -1838,6 +2325,7 @@
     </w:p>
     <w:p>
       <w:pPr>
+        <w:keepNext w:val="false"/>
         <w:spacing w:after="160"/>
       </w:pPr>
       <w:r>
@@ -1861,6 +2349,7 @@
     </w:p>
     <w:p>
       <w:pPr>
+        <w:keepNext w:val="false"/>
         <w:spacing w:after="160"/>
       </w:pPr>
       <w:r>
@@ -1929,6 +2418,7 @@
     </w:p>
     <w:p>
       <w:pPr>
+        <w:keepNext w:val="false"/>
         <w:spacing w:after="160"/>
       </w:pPr>
       <w:r>
@@ -2008,29 +2498,35 @@
     </w:p>
     <w:p>
       <w:pPr>
-        <w:spacing w:after="160"/>
-      </w:pPr>
-      <w:r>
-        <w:rPr>
-          <w:rFonts w:ascii="Calibri" w:cs="Calibri" w:eastAsia="Calibri" w:hAnsi="Calibri"/>
-          <w:color w:val="28251D"/>
-          <w:sz w:val="22"/>
-          <w:szCs w:val="22"/>
-        </w:rPr>
-        <w:t xml:space="preserve">Full legal name: </w:t>
-      </w:r>
-      <w:r>
-        <w:rPr>
-          <w:rFonts w:ascii="Calibri" w:cs="Calibri" w:eastAsia="Calibri" w:hAnsi="Calibri"/>
-          <w:sz w:val="22"/>
-          <w:szCs w:val="22"/>
-          <w:u w:val="single" w:color="28251D"/>
-        </w:rPr>
-        <w:t xml:space="preserve">                                                            </w:t>
-      </w:r>
-    </w:p>
-    <w:p>
-      <w:pPr>
+        <w:spacing w:after="20"/>
+      </w:pPr>
+      <w:r>
+        <w:rPr>
+          <w:rFonts w:ascii="Calibri" w:cs="Calibri" w:eastAsia="Calibri" w:hAnsi="Calibri"/>
+          <w:color w:val="28251D"/>
+          <w:sz w:val="22"/>
+          <w:szCs w:val="22"/>
+        </w:rPr>
+        <w:t xml:space="preserve">Full legal name:</w:t>
+      </w:r>
+    </w:p>
+    <w:p>
+      <w:pPr>
+        <w:spacing w:after="160"/>
+      </w:pPr>
+      <w:r>
+        <w:rPr>
+          <w:rFonts w:ascii="Calibri" w:cs="Calibri" w:eastAsia="Calibri" w:hAnsi="Calibri"/>
+          <w:sz w:val="22"/>
+          <w:szCs w:val="22"/>
+          <w:u w:val="single" w:color="28251D"/>
+        </w:rPr>
+        <w:t xml:space="preserve">                                                                                                    </w:t>
+      </w:r>
+    </w:p>
+    <w:p>
+      <w:pPr>
+        <w:keepNext w:val="false"/>
         <w:spacing w:after="160"/>
       </w:pPr>
       <w:r>
@@ -2054,6 +2550,7 @@
     </w:p>
     <w:p>
       <w:pPr>
+        <w:keepNext w:val="false"/>
         <w:spacing w:after="160"/>
       </w:pPr>
       <w:r>
@@ -2126,6 +2623,7 @@
     </w:p>
     <w:p>
       <w:pPr>
+        <w:keepNext w:val="false"/>
         <w:spacing w:after="160"/>
       </w:pPr>
       <w:r>
@@ -2149,6 +2647,7 @@
     </w:p>
     <w:p>
       <w:pPr>
+        <w:keepNext w:val="false"/>
         <w:spacing w:after="160"/>
       </w:pPr>
       <w:r>
@@ -2172,6 +2671,7 @@
     </w:p>
     <w:p>
       <w:pPr>
+        <w:keepNext w:val="false"/>
         <w:spacing w:after="160"/>
       </w:pPr>
       <w:r>
@@ -2195,25 +2695,42 @@
     </w:p>
     <w:p>
       <w:pPr>
-        <w:spacing w:after="160"/>
-      </w:pPr>
-      <w:r>
-        <w:rPr>
-          <w:rFonts w:ascii="Calibri" w:cs="Calibri" w:eastAsia="Calibri" w:hAnsi="Calibri"/>
-          <w:color w:val="28251D"/>
-          <w:sz w:val="22"/>
-          <w:szCs w:val="22"/>
-        </w:rPr>
-        <w:t xml:space="preserve">Purpose of travel (vacation / family visit / education / medical / other): </w:t>
-      </w:r>
-      <w:r>
-        <w:rPr>
-          <w:rFonts w:ascii="Calibri" w:cs="Calibri" w:eastAsia="Calibri" w:hAnsi="Calibri"/>
-          <w:sz w:val="22"/>
-          <w:szCs w:val="22"/>
-          <w:u w:val="single" w:color="28251D"/>
-        </w:rPr>
-        <w:t xml:space="preserve">                                                  </w:t>
+        <w:keepNext/>
+        <w:spacing w:after="20"/>
+      </w:pPr>
+      <w:r>
+        <w:rPr>
+          <w:rFonts w:ascii="Calibri" w:cs="Calibri" w:eastAsia="Calibri" w:hAnsi="Calibri"/>
+          <w:color w:val="28251D"/>
+          <w:sz w:val="22"/>
+          <w:szCs w:val="22"/>
+        </w:rPr>
+        <w:t xml:space="preserve">Purpose of travel: </w:t>
+      </w:r>
+      <w:r>
+        <w:rPr>
+          <w:rFonts w:ascii="Calibri" w:cs="Calibri" w:eastAsia="Calibri" w:hAnsi="Calibri"/>
+          <w:sz w:val="22"/>
+          <w:szCs w:val="22"/>
+          <w:u w:val="single" w:color="28251D"/>
+        </w:rPr>
+        <w:t xml:space="preserve">                                                            </w:t>
+      </w:r>
+    </w:p>
+    <w:p>
+      <w:pPr>
+        <w:spacing w:after="160"/>
+      </w:pPr>
+      <w:r>
+        <w:rPr>
+          <w:rFonts w:ascii="Calibri" w:cs="Calibri" w:eastAsia="Calibri" w:hAnsi="Calibri"/>
+          <w:i/>
+          <w:iCs/>
+          <w:color w:val="7A7974"/>
+          <w:sz w:val="16"/>
+          <w:szCs w:val="16"/>
+        </w:rPr>
+        <w:t xml:space="preserve">vacation / family visit / education / medical / other</w:t>
       </w:r>
     </w:p>
     <w:p>
@@ -2247,6 +2764,7 @@
     </w:p>
     <w:p>
       <w:pPr>
+        <w:keepNext w:val="false"/>
         <w:spacing w:after="160"/>
       </w:pPr>
       <w:r>
@@ -2270,6 +2788,7 @@
     </w:p>
     <w:p>
       <w:pPr>
+        <w:keepNext w:val="false"/>
         <w:spacing w:after="160"/>
       </w:pPr>
       <w:r>
@@ -2293,6 +2812,7 @@
     </w:p>
     <w:p>
       <w:pPr>
+        <w:keepNext w:val="false"/>
         <w:spacing w:after="160"/>
       </w:pPr>
       <w:r>
@@ -2316,6 +2836,7 @@
     </w:p>
     <w:p>
       <w:pPr>
+        <w:keepNext w:val="false"/>
         <w:spacing w:after="160"/>
       </w:pPr>
       <w:r>
@@ -2339,6 +2860,7 @@
     </w:p>
     <w:p>
       <w:pPr>
+        <w:keepNext w:val="false"/>
         <w:spacing w:after="160"/>
       </w:pPr>
       <w:r>
@@ -2378,6 +2900,7 @@
     </w:p>
     <w:p>
       <w:pPr>
+        <w:keepNext w:val="false"/>
         <w:spacing w:after="160"/>
       </w:pPr>
       <w:r>
@@ -2401,6 +2924,7 @@
     </w:p>
     <w:p>
       <w:pPr>
+        <w:keepNext w:val="false"/>
         <w:spacing w:after="160"/>
       </w:pPr>
       <w:r>
@@ -2424,6 +2948,7 @@
     </w:p>
     <w:p>
       <w:pPr>
+        <w:keepNext w:val="false"/>
         <w:spacing w:after="160"/>
       </w:pPr>
       <w:r>
@@ -2447,6 +2972,7 @@
     </w:p>
     <w:p>
       <w:pPr>
+        <w:keepNext w:val="false"/>
         <w:spacing w:after="160"/>
       </w:pPr>
       <w:r>
@@ -2470,6 +2996,7 @@
     </w:p>
     <w:p>
       <w:pPr>
+        <w:keepNext w:val="false"/>
         <w:spacing w:after="160"/>
       </w:pPr>
       <w:r>
@@ -2509,6 +3036,7 @@
     </w:p>
     <w:p>
       <w:pPr>
+        <w:keepNext w:val="false"/>
         <w:spacing w:after="160"/>
       </w:pPr>
       <w:r>
@@ -2532,6 +3060,7 @@
     </w:p>
     <w:p>
       <w:pPr>
+        <w:keepNext w:val="false"/>
         <w:spacing w:after="160"/>
       </w:pPr>
       <w:r>
@@ -2555,6 +3084,7 @@
     </w:p>
     <w:p>
       <w:pPr>
+        <w:keepNext w:val="false"/>
         <w:spacing w:after="160"/>
       </w:pPr>
       <w:r>
@@ -2578,6 +3108,7 @@
     </w:p>
     <w:p>
       <w:pPr>
+        <w:keepNext w:val="false"/>
         <w:spacing w:after="160"/>
       </w:pPr>
       <w:r>
@@ -2601,6 +3132,7 @@
     </w:p>
     <w:p>
       <w:pPr>
+        <w:keepNext w:val="false"/>
         <w:spacing w:after="160"/>
       </w:pPr>
       <w:r>
@@ -2640,6 +3172,7 @@
     </w:p>
     <w:p>
       <w:pPr>
+        <w:keepNext w:val="false"/>
         <w:spacing w:after="160"/>
       </w:pPr>
       <w:r>
@@ -2663,6 +3196,7 @@
     </w:p>
     <w:p>
       <w:pPr>
+        <w:keepNext w:val="false"/>
         <w:spacing w:after="160"/>
       </w:pPr>
       <w:r>
@@ -2686,6 +3220,7 @@
     </w:p>
     <w:p>
       <w:pPr>
+        <w:keepNext w:val="false"/>
         <w:spacing w:after="160"/>
       </w:pPr>
       <w:r>
@@ -2709,6 +3244,7 @@
     </w:p>
     <w:p>
       <w:pPr>
+        <w:keepNext w:val="false"/>
         <w:spacing w:after="160"/>
       </w:pPr>
       <w:r>
@@ -2732,6 +3268,7 @@
     </w:p>
     <w:p>
       <w:pPr>
+        <w:keepNext w:val="false"/>
         <w:spacing w:after="160"/>
       </w:pPr>
       <w:r>
@@ -2771,6 +3308,7 @@
     </w:p>
     <w:p>
       <w:pPr>
+        <w:keepNext w:val="false"/>
         <w:spacing w:after="160"/>
       </w:pPr>
       <w:r>
@@ -2794,6 +3332,7 @@
     </w:p>
     <w:p>
       <w:pPr>
+        <w:keepNext w:val="false"/>
         <w:spacing w:after="160"/>
       </w:pPr>
       <w:r>
@@ -2817,6 +3356,7 @@
     </w:p>
     <w:p>
       <w:pPr>
+        <w:keepNext w:val="false"/>
         <w:spacing w:after="160"/>
       </w:pPr>
       <w:r>
@@ -2840,6 +3380,7 @@
     </w:p>
     <w:p>
       <w:pPr>
+        <w:keepNext w:val="false"/>
         <w:spacing w:after="160"/>
       </w:pPr>
       <w:r>
@@ -2863,6 +3404,7 @@
     </w:p>
     <w:p>
       <w:pPr>
+        <w:keepNext w:val="false"/>
         <w:spacing w:after="160"/>
       </w:pPr>
       <w:r>
@@ -2899,6 +3441,7 @@
     </w:p>
     <w:p>
       <w:pPr>
+        <w:keepNext w:val="false"/>
         <w:spacing w:after="160"/>
       </w:pPr>
       <w:r>
@@ -3039,6 +3582,7 @@
     </w:p>
     <w:p>
       <w:pPr>
+        <w:keepNext w:val="false"/>
         <w:spacing w:after="160"/>
       </w:pPr>
       <w:r>
@@ -3062,6 +3606,7 @@
     </w:p>
     <w:p>
       <w:pPr>
+        <w:keepNext w:val="false"/>
         <w:spacing w:after="160"/>
       </w:pPr>
       <w:r>
@@ -3116,29 +3661,35 @@
     </w:p>
     <w:p>
       <w:pPr>
-        <w:spacing w:after="160"/>
-      </w:pPr>
-      <w:r>
-        <w:rPr>
-          <w:rFonts w:ascii="Calibri" w:cs="Calibri" w:eastAsia="Calibri" w:hAnsi="Calibri"/>
-          <w:color w:val="28251D"/>
-          <w:sz w:val="22"/>
-          <w:szCs w:val="22"/>
-        </w:rPr>
-        <w:t xml:space="preserve">Full name: </w:t>
-      </w:r>
-      <w:r>
-        <w:rPr>
-          <w:rFonts w:ascii="Calibri" w:cs="Calibri" w:eastAsia="Calibri" w:hAnsi="Calibri"/>
-          <w:sz w:val="22"/>
-          <w:szCs w:val="22"/>
-          <w:u w:val="single" w:color="28251D"/>
-        </w:rPr>
-        <w:t xml:space="preserve">                                                  </w:t>
-      </w:r>
-    </w:p>
-    <w:p>
-      <w:pPr>
+        <w:spacing w:after="20"/>
+      </w:pPr>
+      <w:r>
+        <w:rPr>
+          <w:rFonts w:ascii="Calibri" w:cs="Calibri" w:eastAsia="Calibri" w:hAnsi="Calibri"/>
+          <w:color w:val="28251D"/>
+          <w:sz w:val="22"/>
+          <w:szCs w:val="22"/>
+        </w:rPr>
+        <w:t xml:space="preserve">Full name:</w:t>
+      </w:r>
+    </w:p>
+    <w:p>
+      <w:pPr>
+        <w:spacing w:after="160"/>
+      </w:pPr>
+      <w:r>
+        <w:rPr>
+          <w:rFonts w:ascii="Calibri" w:cs="Calibri" w:eastAsia="Calibri" w:hAnsi="Calibri"/>
+          <w:sz w:val="22"/>
+          <w:szCs w:val="22"/>
+          <w:u w:val="single" w:color="28251D"/>
+        </w:rPr>
+        <w:t xml:space="preserve">                                                                                                    </w:t>
+      </w:r>
+    </w:p>
+    <w:p>
+      <w:pPr>
+        <w:keepNext w:val="false"/>
         <w:spacing w:after="160"/>
       </w:pPr>
       <w:r>
@@ -3162,6 +3713,7 @@
     </w:p>
     <w:p>
       <w:pPr>
+        <w:keepNext w:val="false"/>
         <w:spacing w:after="160"/>
       </w:pPr>
       <w:r>
@@ -3212,29 +3764,35 @@
     </w:p>
     <w:p>
       <w:pPr>
-        <w:spacing w:after="160"/>
-      </w:pPr>
-      <w:r>
-        <w:rPr>
-          <w:rFonts w:ascii="Calibri" w:cs="Calibri" w:eastAsia="Calibri" w:hAnsi="Calibri"/>
-          <w:color w:val="28251D"/>
-          <w:sz w:val="22"/>
-          <w:szCs w:val="22"/>
-        </w:rPr>
-        <w:t xml:space="preserve">Full name: </w:t>
-      </w:r>
-      <w:r>
-        <w:rPr>
-          <w:rFonts w:ascii="Calibri" w:cs="Calibri" w:eastAsia="Calibri" w:hAnsi="Calibri"/>
-          <w:sz w:val="22"/>
-          <w:szCs w:val="22"/>
-          <w:u w:val="single" w:color="28251D"/>
-        </w:rPr>
-        <w:t xml:space="preserve">                                                  </w:t>
-      </w:r>
-    </w:p>
-    <w:p>
-      <w:pPr>
+        <w:spacing w:after="20"/>
+      </w:pPr>
+      <w:r>
+        <w:rPr>
+          <w:rFonts w:ascii="Calibri" w:cs="Calibri" w:eastAsia="Calibri" w:hAnsi="Calibri"/>
+          <w:color w:val="28251D"/>
+          <w:sz w:val="22"/>
+          <w:szCs w:val="22"/>
+        </w:rPr>
+        <w:t xml:space="preserve">Full name:</w:t>
+      </w:r>
+    </w:p>
+    <w:p>
+      <w:pPr>
+        <w:spacing w:after="160"/>
+      </w:pPr>
+      <w:r>
+        <w:rPr>
+          <w:rFonts w:ascii="Calibri" w:cs="Calibri" w:eastAsia="Calibri" w:hAnsi="Calibri"/>
+          <w:sz w:val="22"/>
+          <w:szCs w:val="22"/>
+          <w:u w:val="single" w:color="28251D"/>
+        </w:rPr>
+        <w:t xml:space="preserve">                                                                                                    </w:t>
+      </w:r>
+    </w:p>
+    <w:p>
+      <w:pPr>
+        <w:keepNext w:val="false"/>
         <w:spacing w:after="160"/>
       </w:pPr>
       <w:r>
@@ -3258,6 +3816,7 @@
     </w:p>
     <w:p>
       <w:pPr>
+        <w:keepNext w:val="false"/>
         <w:spacing w:after="160"/>
       </w:pPr>
       <w:r>
@@ -3374,6 +3933,7 @@
     </w:p>
     <w:p>
       <w:pPr>
+        <w:keepNext w:val="false"/>
         <w:spacing w:after="160"/>
       </w:pPr>
       <w:r>
@@ -3397,16 +3957,82 @@
     </w:p>
     <w:p>
       <w:pPr>
-        <w:spacing w:after="160"/>
-      </w:pPr>
-      <w:r>
-        <w:rPr>
-          <w:rFonts w:ascii="Calibri" w:cs="Calibri" w:eastAsia="Calibri" w:hAnsi="Calibri"/>
-          <w:color w:val="28251D"/>
-          <w:sz w:val="22"/>
-          <w:szCs w:val="22"/>
-        </w:rPr>
-        <w:t xml:space="preserve">Printed name: </w:t>
+        <w:spacing w:after="20"/>
+      </w:pPr>
+      <w:r>
+        <w:rPr>
+          <w:rFonts w:ascii="Calibri" w:cs="Calibri" w:eastAsia="Calibri" w:hAnsi="Calibri"/>
+          <w:color w:val="28251D"/>
+          <w:sz w:val="22"/>
+          <w:szCs w:val="22"/>
+        </w:rPr>
+        <w:t xml:space="preserve">Printed name:</w:t>
+      </w:r>
+    </w:p>
+    <w:p>
+      <w:pPr>
+        <w:spacing w:after="160"/>
+      </w:pPr>
+      <w:r>
+        <w:rPr>
+          <w:rFonts w:ascii="Calibri" w:cs="Calibri" w:eastAsia="Calibri" w:hAnsi="Calibri"/>
+          <w:sz w:val="22"/>
+          <w:szCs w:val="22"/>
+          <w:u w:val="single" w:color="28251D"/>
+        </w:rPr>
+        <w:t xml:space="preserve">                                                                                                    </w:t>
+      </w:r>
+    </w:p>
+    <w:p>
+      <w:pPr>
+        <w:keepNext w:val="false"/>
+        <w:spacing w:after="160"/>
+      </w:pPr>
+      <w:r>
+        <w:rPr>
+          <w:rFonts w:ascii="Calibri" w:cs="Calibri" w:eastAsia="Calibri" w:hAnsi="Calibri"/>
+          <w:color w:val="28251D"/>
+          <w:sz w:val="22"/>
+          <w:szCs w:val="22"/>
+        </w:rPr>
+        <w:t xml:space="preserve">Date: </w:t>
+      </w:r>
+      <w:r>
+        <w:rPr>
+          <w:rFonts w:ascii="Calibri" w:cs="Calibri" w:eastAsia="Calibri" w:hAnsi="Calibri"/>
+          <w:sz w:val="22"/>
+          <w:szCs w:val="22"/>
+          <w:u w:val="single" w:color="28251D"/>
+        </w:rPr>
+        <w:t xml:space="preserve">                         </w:t>
+      </w:r>
+    </w:p>
+    <w:p>
+      <w:pPr>
+        <w:spacing w:after="240"/>
+      </w:pPr>
+      <w:r>
+        <w:rPr>
+          <w:rFonts w:ascii="Calibri" w:cs="Calibri" w:eastAsia="Calibri" w:hAnsi="Calibri"/>
+          <w:sz w:val="22"/>
+          <w:szCs w:val="22"/>
+        </w:rPr>
+        <w:t xml:space="preserve"/>
+      </w:r>
+    </w:p>
+    <w:p>
+      <w:pPr>
+        <w:keepNext/>
+        <w:spacing w:after="20"/>
+      </w:pPr>
+      <w:r>
+        <w:rPr>
+          <w:rFonts w:ascii="Calibri" w:cs="Calibri" w:eastAsia="Calibri" w:hAnsi="Calibri"/>
+          <w:color w:val="28251D"/>
+          <w:sz w:val="22"/>
+          <w:szCs w:val="22"/>
+        </w:rPr>
+        <w:t xml:space="preserve">Parent 2 signature: </w:t>
       </w:r>
       <w:r>
         <w:rPr>
@@ -3425,83 +4051,46 @@
       <w:r>
         <w:rPr>
           <w:rFonts w:ascii="Calibri" w:cs="Calibri" w:eastAsia="Calibri" w:hAnsi="Calibri"/>
-          <w:color w:val="28251D"/>
-          <w:sz w:val="22"/>
-          <w:szCs w:val="22"/>
-        </w:rPr>
-        <w:t xml:space="preserve">Date: </w:t>
-      </w:r>
-      <w:r>
-        <w:rPr>
-          <w:rFonts w:ascii="Calibri" w:cs="Calibri" w:eastAsia="Calibri" w:hAnsi="Calibri"/>
-          <w:sz w:val="22"/>
-          <w:szCs w:val="22"/>
-          <w:u w:val="single" w:color="28251D"/>
-        </w:rPr>
-        <w:t xml:space="preserve">                         </w:t>
-      </w:r>
-    </w:p>
-    <w:p>
-      <w:pPr>
-        <w:spacing w:after="240"/>
-      </w:pPr>
-      <w:r>
-        <w:rPr>
-          <w:rFonts w:ascii="Calibri" w:cs="Calibri" w:eastAsia="Calibri" w:hAnsi="Calibri"/>
-          <w:sz w:val="22"/>
-          <w:szCs w:val="22"/>
-        </w:rPr>
-        <w:t xml:space="preserve"/>
-      </w:r>
-    </w:p>
-    <w:p>
-      <w:pPr>
-        <w:spacing w:after="160"/>
-      </w:pPr>
-      <w:r>
-        <w:rPr>
-          <w:rFonts w:ascii="Calibri" w:cs="Calibri" w:eastAsia="Calibri" w:hAnsi="Calibri"/>
-          <w:color w:val="28251D"/>
-          <w:sz w:val="22"/>
-          <w:szCs w:val="22"/>
-        </w:rPr>
-        <w:t xml:space="preserve">Parent 2 signature (if applicable): </w:t>
-      </w:r>
-      <w:r>
-        <w:rPr>
-          <w:rFonts w:ascii="Calibri" w:cs="Calibri" w:eastAsia="Calibri" w:hAnsi="Calibri"/>
-          <w:sz w:val="22"/>
-          <w:szCs w:val="22"/>
-          <w:u w:val="single" w:color="28251D"/>
-        </w:rPr>
-        <w:t xml:space="preserve">                                                  </w:t>
-      </w:r>
-    </w:p>
-    <w:p>
-      <w:pPr>
-        <w:spacing w:after="160"/>
-      </w:pPr>
-      <w:r>
-        <w:rPr>
-          <w:rFonts w:ascii="Calibri" w:cs="Calibri" w:eastAsia="Calibri" w:hAnsi="Calibri"/>
-          <w:color w:val="28251D"/>
-          <w:sz w:val="22"/>
-          <w:szCs w:val="22"/>
-        </w:rPr>
-        <w:t xml:space="preserve">Printed name: </w:t>
-      </w:r>
-      <w:r>
-        <w:rPr>
-          <w:rFonts w:ascii="Calibri" w:cs="Calibri" w:eastAsia="Calibri" w:hAnsi="Calibri"/>
-          <w:sz w:val="22"/>
-          <w:szCs w:val="22"/>
-          <w:u w:val="single" w:color="28251D"/>
-        </w:rPr>
-        <w:t xml:space="preserve">                                                  </w:t>
-      </w:r>
-    </w:p>
-    <w:p>
-      <w:pPr>
+          <w:i/>
+          <w:iCs/>
+          <w:color w:val="7A7974"/>
+          <w:sz w:val="16"/>
+          <w:szCs w:val="16"/>
+        </w:rPr>
+        <w:t xml:space="preserve">if applicable — leave blank if only one parent is consenting</w:t>
+      </w:r>
+    </w:p>
+    <w:p>
+      <w:pPr>
+        <w:spacing w:after="20"/>
+      </w:pPr>
+      <w:r>
+        <w:rPr>
+          <w:rFonts w:ascii="Calibri" w:cs="Calibri" w:eastAsia="Calibri" w:hAnsi="Calibri"/>
+          <w:color w:val="28251D"/>
+          <w:sz w:val="22"/>
+          <w:szCs w:val="22"/>
+        </w:rPr>
+        <w:t xml:space="preserve">Printed name:</w:t>
+      </w:r>
+    </w:p>
+    <w:p>
+      <w:pPr>
+        <w:spacing w:after="160"/>
+      </w:pPr>
+      <w:r>
+        <w:rPr>
+          <w:rFonts w:ascii="Calibri" w:cs="Calibri" w:eastAsia="Calibri" w:hAnsi="Calibri"/>
+          <w:sz w:val="22"/>
+          <w:szCs w:val="22"/>
+          <w:u w:val="single" w:color="28251D"/>
+        </w:rPr>
+        <w:t xml:space="preserve">                                                                                                    </w:t>
+      </w:r>
+    </w:p>
+    <w:p>
+      <w:pPr>
+        <w:keepNext w:val="false"/>
         <w:spacing w:after="160"/>
       </w:pPr>
       <w:r>
@@ -3635,6 +4224,105 @@
     </w:p>
     <w:p>
       <w:pPr>
+        <w:keepNext/>
+        <w:spacing w:after="20"/>
+      </w:pPr>
+      <w:r>
+        <w:rPr>
+          <w:rFonts w:ascii="Calibri" w:cs="Calibri" w:eastAsia="Calibri" w:hAnsi="Calibri"/>
+          <w:sz w:val="22"/>
+          <w:szCs w:val="22"/>
+        </w:rPr>
+        <w:t xml:space="preserve">On </w:t>
+      </w:r>
+      <w:r>
+        <w:rPr>
+          <w:rFonts w:ascii="Calibri" w:cs="Calibri" w:eastAsia="Calibri" w:hAnsi="Calibri"/>
+          <w:sz w:val="22"/>
+          <w:szCs w:val="22"/>
+          <w:u w:val="single" w:color="28251D"/>
+        </w:rPr>
+        <w:t xml:space="preserve">                    </w:t>
+      </w:r>
+      <w:r>
+        <w:rPr>
+          <w:rFonts w:ascii="Calibri" w:cs="Calibri" w:eastAsia="Calibri" w:hAnsi="Calibri"/>
+          <w:sz w:val="22"/>
+          <w:szCs w:val="22"/>
+        </w:rPr>
+        <w:t xml:space="preserve"> before me,</w:t>
+      </w:r>
+    </w:p>
+    <w:p>
+      <w:pPr>
+        <w:keepNext/>
+        <w:spacing w:after="20"/>
+      </w:pPr>
+      <w:r>
+        <w:rPr>
+          <w:rFonts w:ascii="Calibri" w:cs="Calibri" w:eastAsia="Calibri" w:hAnsi="Calibri"/>
+          <w:sz w:val="22"/>
+          <w:szCs w:val="22"/>
+          <w:u w:val="single" w:color="28251D"/>
+        </w:rPr>
+        <w:t xml:space="preserve">                                                                                                    </w:t>
+      </w:r>
+      <w:r>
+        <w:rPr>
+          <w:rFonts w:ascii="Calibri" w:cs="Calibri" w:eastAsia="Calibri" w:hAnsi="Calibri"/>
+          <w:sz w:val="22"/>
+          <w:szCs w:val="22"/>
+        </w:rPr>
+        <w:t xml:space="preserve">,</w:t>
+      </w:r>
+    </w:p>
+    <w:p>
+      <w:pPr>
+        <w:spacing w:after="200"/>
+      </w:pPr>
+      <w:r>
+        <w:rPr>
+          <w:rFonts w:ascii="Calibri" w:cs="Calibri" w:eastAsia="Calibri" w:hAnsi="Calibri"/>
+          <w:i/>
+          <w:iCs/>
+          <w:color w:val="7A7974"/>
+          <w:sz w:val="16"/>
+          <w:szCs w:val="16"/>
+        </w:rPr>
+        <w:t xml:space="preserve">(here insert name and title of the officer)</w:t>
+      </w:r>
+    </w:p>
+    <w:p>
+      <w:pPr>
+        <w:keepNext/>
+        <w:spacing w:after="40"/>
+      </w:pPr>
+      <w:r>
+        <w:rPr>
+          <w:rFonts w:ascii="Calibri" w:cs="Calibri" w:eastAsia="Calibri" w:hAnsi="Calibri"/>
+          <w:sz w:val="22"/>
+          <w:szCs w:val="22"/>
+        </w:rPr>
+        <w:t xml:space="preserve">personally appeared</w:t>
+      </w:r>
+    </w:p>
+    <w:p>
+      <w:pPr>
+        <w:keepNext/>
+        <w:spacing w:after="40"/>
+      </w:pPr>
+      <w:r>
+        <w:rPr>
+          <w:rFonts w:ascii="Calibri" w:cs="Calibri" w:eastAsia="Calibri" w:hAnsi="Calibri"/>
+          <w:sz w:val="22"/>
+          <w:szCs w:val="22"/>
+          <w:u w:val="single" w:color="28251D"/>
+        </w:rPr>
+        <w:t xml:space="preserve">                                                                                                    </w:t>
+      </w:r>
+    </w:p>
+    <w:p>
+      <w:pPr>
         <w:spacing w:after="240"/>
       </w:pPr>
       <w:r>
@@ -3642,59 +4330,22 @@
           <w:rFonts w:ascii="Calibri" w:cs="Calibri" w:eastAsia="Calibri" w:hAnsi="Calibri"/>
           <w:sz w:val="22"/>
           <w:szCs w:val="22"/>
-        </w:rPr>
-        <w:t xml:space="preserve">On </w:t>
-      </w:r>
-      <w:r>
-        <w:rPr>
-          <w:rFonts w:ascii="Calibri" w:cs="Calibri" w:eastAsia="Calibri" w:hAnsi="Calibri"/>
-          <w:sz w:val="22"/>
-          <w:szCs w:val="22"/>
-          <w:u w:val="single" w:color="28251D"/>
-        </w:rPr>
-        <w:t xml:space="preserve">                    </w:t>
-      </w:r>
-      <w:r>
-        <w:rPr>
-          <w:rFonts w:ascii="Calibri" w:cs="Calibri" w:eastAsia="Calibri" w:hAnsi="Calibri"/>
-          <w:sz w:val="22"/>
-          <w:szCs w:val="22"/>
-        </w:rPr>
-        <w:t xml:space="preserve"> before me, </w:t>
-      </w:r>
-      <w:r>
-        <w:rPr>
-          <w:rFonts w:ascii="Calibri" w:cs="Calibri" w:eastAsia="Calibri" w:hAnsi="Calibri"/>
-          <w:sz w:val="22"/>
-          <w:szCs w:val="22"/>
-          <w:u w:val="single" w:color="28251D"/>
-        </w:rPr>
-        <w:t xml:space="preserve">                                        </w:t>
-      </w:r>
-      <w:r>
-        <w:rPr>
-          <w:rFonts w:ascii="Calibri" w:cs="Calibri" w:eastAsia="Calibri" w:hAnsi="Calibri"/>
-          <w:sz w:val="22"/>
-          <w:szCs w:val="22"/>
-        </w:rPr>
-        <w:t xml:space="preserve"> (insert name and title of the officer), personally appeared </w:t>
-      </w:r>
-      <w:r>
-        <w:rPr>
-          <w:rFonts w:ascii="Calibri" w:cs="Calibri" w:eastAsia="Calibri" w:hAnsi="Calibri"/>
-          <w:sz w:val="22"/>
-          <w:szCs w:val="22"/>
-          <w:u w:val="single" w:color="28251D"/>
-        </w:rPr>
-        <w:t xml:space="preserve">                                                  </w:t>
-      </w:r>
-      <w:r>
-        <w:rPr>
-          <w:rFonts w:ascii="Calibri" w:cs="Calibri" w:eastAsia="Calibri" w:hAnsi="Calibri"/>
-          <w:sz w:val="22"/>
-          <w:szCs w:val="22"/>
-        </w:rPr>
-        <w:t xml:space="preserve">, who proved to me on the basis of satisfactory evidence to be the person(s) whose name(s) is/are subscribed to the within instrument, and acknowledged to me that he/she/they executed the same in his/her/their authorized capacity(ies), and that by his/her/their signature(s) on the instrument the person(s), or the entity upon behalf of which the person(s) acted, executed the instrument.</w:t>
+          <w:u w:val="single" w:color="28251D"/>
+        </w:rPr>
+        <w:t xml:space="preserve">                                                                                                    </w:t>
+      </w:r>
+    </w:p>
+    <w:p>
+      <w:pPr>
+        <w:spacing w:after="240"/>
+      </w:pPr>
+      <w:r>
+        <w:rPr>
+          <w:rFonts w:ascii="Calibri" w:cs="Calibri" w:eastAsia="Calibri" w:hAnsi="Calibri"/>
+          <w:sz w:val="22"/>
+          <w:szCs w:val="22"/>
+        </w:rPr>
+        <w:t xml:space="preserve">who proved to me on the basis of satisfactory evidence to be the person(s) whose name(s) is/are subscribed to the within instrument, and acknowledged to me that he/she/they executed the same in his/her/their authorized capacity(ies), and that by his/her/their signature(s) on the instrument the person(s), or the entity upon behalf of which the person(s) acted, executed the instrument.</w:t>
       </w:r>
     </w:p>
     <w:p>
@@ -3992,6 +4643,105 @@
     </w:p>
     <w:p>
       <w:pPr>
+        <w:keepNext/>
+        <w:spacing w:after="20"/>
+      </w:pPr>
+      <w:r>
+        <w:rPr>
+          <w:rFonts w:ascii="Calibri" w:cs="Calibri" w:eastAsia="Calibri" w:hAnsi="Calibri"/>
+          <w:sz w:val="22"/>
+          <w:szCs w:val="22"/>
+        </w:rPr>
+        <w:t xml:space="preserve">On </w:t>
+      </w:r>
+      <w:r>
+        <w:rPr>
+          <w:rFonts w:ascii="Calibri" w:cs="Calibri" w:eastAsia="Calibri" w:hAnsi="Calibri"/>
+          <w:sz w:val="22"/>
+          <w:szCs w:val="22"/>
+          <w:u w:val="single" w:color="28251D"/>
+        </w:rPr>
+        <w:t xml:space="preserve">                    </w:t>
+      </w:r>
+      <w:r>
+        <w:rPr>
+          <w:rFonts w:ascii="Calibri" w:cs="Calibri" w:eastAsia="Calibri" w:hAnsi="Calibri"/>
+          <w:sz w:val="22"/>
+          <w:szCs w:val="22"/>
+        </w:rPr>
+        <w:t xml:space="preserve"> before me,</w:t>
+      </w:r>
+    </w:p>
+    <w:p>
+      <w:pPr>
+        <w:keepNext/>
+        <w:spacing w:after="20"/>
+      </w:pPr>
+      <w:r>
+        <w:rPr>
+          <w:rFonts w:ascii="Calibri" w:cs="Calibri" w:eastAsia="Calibri" w:hAnsi="Calibri"/>
+          <w:sz w:val="22"/>
+          <w:szCs w:val="22"/>
+          <w:u w:val="single" w:color="28251D"/>
+        </w:rPr>
+        <w:t xml:space="preserve">                                                                                                    </w:t>
+      </w:r>
+      <w:r>
+        <w:rPr>
+          <w:rFonts w:ascii="Calibri" w:cs="Calibri" w:eastAsia="Calibri" w:hAnsi="Calibri"/>
+          <w:sz w:val="22"/>
+          <w:szCs w:val="22"/>
+        </w:rPr>
+        <w:t xml:space="preserve">,</w:t>
+      </w:r>
+    </w:p>
+    <w:p>
+      <w:pPr>
+        <w:spacing w:after="200"/>
+      </w:pPr>
+      <w:r>
+        <w:rPr>
+          <w:rFonts w:ascii="Calibri" w:cs="Calibri" w:eastAsia="Calibri" w:hAnsi="Calibri"/>
+          <w:i/>
+          <w:iCs/>
+          <w:color w:val="7A7974"/>
+          <w:sz w:val="16"/>
+          <w:szCs w:val="16"/>
+        </w:rPr>
+        <w:t xml:space="preserve">(here insert name and title of the officer)</w:t>
+      </w:r>
+    </w:p>
+    <w:p>
+      <w:pPr>
+        <w:keepNext/>
+        <w:spacing w:after="40"/>
+      </w:pPr>
+      <w:r>
+        <w:rPr>
+          <w:rFonts w:ascii="Calibri" w:cs="Calibri" w:eastAsia="Calibri" w:hAnsi="Calibri"/>
+          <w:sz w:val="22"/>
+          <w:szCs w:val="22"/>
+        </w:rPr>
+        <w:t xml:space="preserve">personally appeared</w:t>
+      </w:r>
+    </w:p>
+    <w:p>
+      <w:pPr>
+        <w:keepNext/>
+        <w:spacing w:after="40"/>
+      </w:pPr>
+      <w:r>
+        <w:rPr>
+          <w:rFonts w:ascii="Calibri" w:cs="Calibri" w:eastAsia="Calibri" w:hAnsi="Calibri"/>
+          <w:sz w:val="22"/>
+          <w:szCs w:val="22"/>
+          <w:u w:val="single" w:color="28251D"/>
+        </w:rPr>
+        <w:t xml:space="preserve">                                                                                                    </w:t>
+      </w:r>
+    </w:p>
+    <w:p>
+      <w:pPr>
         <w:spacing w:after="240"/>
       </w:pPr>
       <w:r>
@@ -3999,59 +4749,22 @@
           <w:rFonts w:ascii="Calibri" w:cs="Calibri" w:eastAsia="Calibri" w:hAnsi="Calibri"/>
           <w:sz w:val="22"/>
           <w:szCs w:val="22"/>
-        </w:rPr>
-        <w:t xml:space="preserve">On </w:t>
-      </w:r>
-      <w:r>
-        <w:rPr>
-          <w:rFonts w:ascii="Calibri" w:cs="Calibri" w:eastAsia="Calibri" w:hAnsi="Calibri"/>
-          <w:sz w:val="22"/>
-          <w:szCs w:val="22"/>
-          <w:u w:val="single" w:color="28251D"/>
-        </w:rPr>
-        <w:t xml:space="preserve">                    </w:t>
-      </w:r>
-      <w:r>
-        <w:rPr>
-          <w:rFonts w:ascii="Calibri" w:cs="Calibri" w:eastAsia="Calibri" w:hAnsi="Calibri"/>
-          <w:sz w:val="22"/>
-          <w:szCs w:val="22"/>
-        </w:rPr>
-        <w:t xml:space="preserve"> before me, </w:t>
-      </w:r>
-      <w:r>
-        <w:rPr>
-          <w:rFonts w:ascii="Calibri" w:cs="Calibri" w:eastAsia="Calibri" w:hAnsi="Calibri"/>
-          <w:sz w:val="22"/>
-          <w:szCs w:val="22"/>
-          <w:u w:val="single" w:color="28251D"/>
-        </w:rPr>
-        <w:t xml:space="preserve">                                        </w:t>
-      </w:r>
-      <w:r>
-        <w:rPr>
-          <w:rFonts w:ascii="Calibri" w:cs="Calibri" w:eastAsia="Calibri" w:hAnsi="Calibri"/>
-          <w:sz w:val="22"/>
-          <w:szCs w:val="22"/>
-        </w:rPr>
-        <w:t xml:space="preserve"> (insert name and title of the officer), personally appeared </w:t>
-      </w:r>
-      <w:r>
-        <w:rPr>
-          <w:rFonts w:ascii="Calibri" w:cs="Calibri" w:eastAsia="Calibri" w:hAnsi="Calibri"/>
-          <w:sz w:val="22"/>
-          <w:szCs w:val="22"/>
-          <w:u w:val="single" w:color="28251D"/>
-        </w:rPr>
-        <w:t xml:space="preserve">                                                  </w:t>
-      </w:r>
-      <w:r>
-        <w:rPr>
-          <w:rFonts w:ascii="Calibri" w:cs="Calibri" w:eastAsia="Calibri" w:hAnsi="Calibri"/>
-          <w:sz w:val="22"/>
-          <w:szCs w:val="22"/>
-        </w:rPr>
-        <w:t xml:space="preserve">, who proved to me on the basis of satisfactory evidence to be the person(s) whose name(s) is/are subscribed to the within instrument, and acknowledged to me that he/she/they executed the same in his/her/their authorized capacity(ies), and that by his/her/their signature(s) on the instrument the person(s), or the entity upon behalf of which the person(s) acted, executed the instrument.</w:t>
+          <w:u w:val="single" w:color="28251D"/>
+        </w:rPr>
+        <w:t xml:space="preserve">                                                                                                    </w:t>
+      </w:r>
+    </w:p>
+    <w:p>
+      <w:pPr>
+        <w:spacing w:after="240"/>
+      </w:pPr>
+      <w:r>
+        <w:rPr>
+          <w:rFonts w:ascii="Calibri" w:cs="Calibri" w:eastAsia="Calibri" w:hAnsi="Calibri"/>
+          <w:sz w:val="22"/>
+          <w:szCs w:val="22"/>
+        </w:rPr>
+        <w:t xml:space="preserve">who proved to me on the basis of satisfactory evidence to be the person(s) whose name(s) is/are subscribed to the within instrument, and acknowledged to me that he/she/they executed the same in his/her/their authorized capacity(ies), and that by his/her/their signature(s) on the instrument the person(s), or the entity upon behalf of which the person(s) acted, executed the instrument.</w:t>
       </w:r>
     </w:p>
     <w:p>

</xml_diff>

<commit_message>
Travel consent — force page break before Accompanying Adult in complex template
</commit_message>
<xml_diff>
--- a/assets/forms/travel_consent_complex.docx
+++ b/assets/forms/travel_consent_complex.docx
@@ -2003,6 +2003,11 @@
       </w:r>
     </w:p>
     <w:p>
+      <w:r>
+        <w:br w:type="page"/>
+      </w:r>
+    </w:p>
+    <w:p>
       <w:pPr>
         <w:pStyle w:val="Heading2"/>
         <w:spacing w:after="120" w:before="240"/>
@@ -4115,291 +4120,6 @@
     <w:p>
       <w:r>
         <w:br w:type="page"/>
-      </w:r>
-    </w:p>
-    <w:p>
-      <w:pPr>
-        <w:spacing w:after="240"/>
-        <w:jc w:val="center"/>
-      </w:pPr>
-      <w:r>
-        <w:rPr>
-          <w:rFonts w:ascii="Calibri" w:cs="Calibri" w:eastAsia="Calibri" w:hAnsi="Calibri"/>
-          <w:b/>
-          <w:bCs/>
-          <w:color w:val="01696F"/>
-          <w:sz w:val="28"/>
-          <w:szCs w:val="28"/>
-        </w:rPr>
-        <w:t xml:space="preserve">CALIFORNIA ALL-PURPOSE ACKNOWLEDGMENT</w:t>
-      </w:r>
-    </w:p>
-    <w:p>
-      <w:pPr>
-        <w:spacing w:after="200"/>
-        <w:jc w:val="center"/>
-      </w:pPr>
-      <w:r>
-        <w:rPr>
-          <w:rFonts w:ascii="Calibri" w:cs="Calibri" w:eastAsia="Calibri" w:hAnsi="Calibri"/>
-          <w:i/>
-          <w:iCs/>
-          <w:color w:val="7A7974"/>
-          <w:sz w:val="20"/>
-          <w:szCs w:val="20"/>
-        </w:rPr>
-        <w:t xml:space="preserve">Civil Code § 1189</w:t>
-      </w:r>
-    </w:p>
-    <w:p>
-      <w:pPr>
-        <w:pBdr>
-          <w:top w:val="single" w:color="28251D" w:sz="8" w:space="6"/>
-          <w:bottom w:val="single" w:color="28251D" w:sz="8" w:space="6"/>
-          <w:left w:val="single" w:color="28251D" w:sz="8" w:space="6"/>
-          <w:right w:val="single" w:color="28251D" w:sz="8" w:space="6"/>
-        </w:pBdr>
-        <w:spacing w:after="200" w:before="60"/>
-        <w:ind w:left="120" w:right="120"/>
-      </w:pPr>
-      <w:r>
-        <w:rPr>
-          <w:rFonts w:ascii="Calibri" w:cs="Calibri" w:eastAsia="Calibri" w:hAnsi="Calibri"/>
-          <w:i/>
-          <w:iCs/>
-          <w:color w:val="28251D"/>
-          <w:sz w:val="20"/>
-          <w:szCs w:val="20"/>
-        </w:rPr>
-        <w:t xml:space="preserve">A notary public or other officer completing this certificate verifies only the identity of the individual who signed the document to which this certificate is attached, and not the truthfulness, accuracy, or validity of that document.</w:t>
-      </w:r>
-    </w:p>
-    <w:p>
-      <w:pPr>
-        <w:spacing w:after="200"/>
-      </w:pPr>
-      <w:r>
-        <w:rPr>
-          <w:rFonts w:ascii="Calibri" w:cs="Calibri" w:eastAsia="Calibri" w:hAnsi="Calibri"/>
-          <w:sz w:val="22"/>
-          <w:szCs w:val="22"/>
-        </w:rPr>
-        <w:t xml:space="preserve"/>
-      </w:r>
-    </w:p>
-    <w:p>
-      <w:pPr>
-        <w:spacing w:after="200"/>
-      </w:pPr>
-      <w:r>
-        <w:rPr>
-          <w:rFonts w:ascii="Calibri" w:cs="Calibri" w:eastAsia="Calibri" w:hAnsi="Calibri"/>
-          <w:sz w:val="22"/>
-          <w:szCs w:val="22"/>
-        </w:rPr>
-        <w:t xml:space="preserve">State of California</w:t>
-      </w:r>
-    </w:p>
-    <w:p>
-      <w:pPr>
-        <w:spacing w:after="300"/>
-      </w:pPr>
-      <w:r>
-        <w:rPr>
-          <w:rFonts w:ascii="Calibri" w:cs="Calibri" w:eastAsia="Calibri" w:hAnsi="Calibri"/>
-          <w:sz w:val="22"/>
-          <w:szCs w:val="22"/>
-        </w:rPr>
-        <w:t xml:space="preserve">County of </w:t>
-      </w:r>
-      <w:r>
-        <w:rPr>
-          <w:rFonts w:ascii="Calibri" w:cs="Calibri" w:eastAsia="Calibri" w:hAnsi="Calibri"/>
-          <w:sz w:val="22"/>
-          <w:szCs w:val="22"/>
-          <w:u w:val="single" w:color="28251D"/>
-        </w:rPr>
-        <w:t xml:space="preserve">                                        </w:t>
-      </w:r>
-    </w:p>
-    <w:p>
-      <w:pPr>
-        <w:keepNext/>
-        <w:spacing w:after="20"/>
-      </w:pPr>
-      <w:r>
-        <w:rPr>
-          <w:rFonts w:ascii="Calibri" w:cs="Calibri" w:eastAsia="Calibri" w:hAnsi="Calibri"/>
-          <w:sz w:val="22"/>
-          <w:szCs w:val="22"/>
-        </w:rPr>
-        <w:t xml:space="preserve">On </w:t>
-      </w:r>
-      <w:r>
-        <w:rPr>
-          <w:rFonts w:ascii="Calibri" w:cs="Calibri" w:eastAsia="Calibri" w:hAnsi="Calibri"/>
-          <w:sz w:val="22"/>
-          <w:szCs w:val="22"/>
-          <w:u w:val="single" w:color="28251D"/>
-        </w:rPr>
-        <w:t xml:space="preserve">                    </w:t>
-      </w:r>
-      <w:r>
-        <w:rPr>
-          <w:rFonts w:ascii="Calibri" w:cs="Calibri" w:eastAsia="Calibri" w:hAnsi="Calibri"/>
-          <w:sz w:val="22"/>
-          <w:szCs w:val="22"/>
-        </w:rPr>
-        <w:t xml:space="preserve"> before me,</w:t>
-      </w:r>
-    </w:p>
-    <w:p>
-      <w:pPr>
-        <w:keepNext/>
-        <w:spacing w:after="20"/>
-      </w:pPr>
-      <w:r>
-        <w:rPr>
-          <w:rFonts w:ascii="Calibri" w:cs="Calibri" w:eastAsia="Calibri" w:hAnsi="Calibri"/>
-          <w:sz w:val="22"/>
-          <w:szCs w:val="22"/>
-          <w:u w:val="single" w:color="28251D"/>
-        </w:rPr>
-        <w:t xml:space="preserve">                                                                                                    </w:t>
-      </w:r>
-      <w:r>
-        <w:rPr>
-          <w:rFonts w:ascii="Calibri" w:cs="Calibri" w:eastAsia="Calibri" w:hAnsi="Calibri"/>
-          <w:sz w:val="22"/>
-          <w:szCs w:val="22"/>
-        </w:rPr>
-        <w:t xml:space="preserve">,</w:t>
-      </w:r>
-    </w:p>
-    <w:p>
-      <w:pPr>
-        <w:spacing w:after="200"/>
-      </w:pPr>
-      <w:r>
-        <w:rPr>
-          <w:rFonts w:ascii="Calibri" w:cs="Calibri" w:eastAsia="Calibri" w:hAnsi="Calibri"/>
-          <w:i/>
-          <w:iCs/>
-          <w:color w:val="7A7974"/>
-          <w:sz w:val="16"/>
-          <w:szCs w:val="16"/>
-        </w:rPr>
-        <w:t xml:space="preserve">(here insert name and title of the officer)</w:t>
-      </w:r>
-    </w:p>
-    <w:p>
-      <w:pPr>
-        <w:keepNext/>
-        <w:spacing w:after="40"/>
-      </w:pPr>
-      <w:r>
-        <w:rPr>
-          <w:rFonts w:ascii="Calibri" w:cs="Calibri" w:eastAsia="Calibri" w:hAnsi="Calibri"/>
-          <w:sz w:val="22"/>
-          <w:szCs w:val="22"/>
-        </w:rPr>
-        <w:t xml:space="preserve">personally appeared</w:t>
-      </w:r>
-    </w:p>
-    <w:p>
-      <w:pPr>
-        <w:keepNext/>
-        <w:spacing w:after="40"/>
-      </w:pPr>
-      <w:r>
-        <w:rPr>
-          <w:rFonts w:ascii="Calibri" w:cs="Calibri" w:eastAsia="Calibri" w:hAnsi="Calibri"/>
-          <w:sz w:val="22"/>
-          <w:szCs w:val="22"/>
-          <w:u w:val="single" w:color="28251D"/>
-        </w:rPr>
-        <w:t xml:space="preserve">                                                                                                    </w:t>
-      </w:r>
-    </w:p>
-    <w:p>
-      <w:pPr>
-        <w:spacing w:after="240"/>
-      </w:pPr>
-      <w:r>
-        <w:rPr>
-          <w:rFonts w:ascii="Calibri" w:cs="Calibri" w:eastAsia="Calibri" w:hAnsi="Calibri"/>
-          <w:sz w:val="22"/>
-          <w:szCs w:val="22"/>
-          <w:u w:val="single" w:color="28251D"/>
-        </w:rPr>
-        <w:t xml:space="preserve">                                                                                                    </w:t>
-      </w:r>
-    </w:p>
-    <w:p>
-      <w:pPr>
-        <w:spacing w:after="240"/>
-      </w:pPr>
-      <w:r>
-        <w:rPr>
-          <w:rFonts w:ascii="Calibri" w:cs="Calibri" w:eastAsia="Calibri" w:hAnsi="Calibri"/>
-          <w:sz w:val="22"/>
-          <w:szCs w:val="22"/>
-        </w:rPr>
-        <w:t xml:space="preserve">who proved to me on the basis of satisfactory evidence to be the person(s) whose name(s) is/are subscribed to the within instrument, and acknowledged to me that he/she/they executed the same in his/her/their authorized capacity(ies), and that by his/her/their signature(s) on the instrument the person(s), or the entity upon behalf of which the person(s) acted, executed the instrument.</w:t>
-      </w:r>
-    </w:p>
-    <w:p>
-      <w:pPr>
-        <w:spacing w:after="120"/>
-      </w:pPr>
-      <w:r>
-        <w:rPr>
-          <w:rFonts w:ascii="Calibri" w:cs="Calibri" w:eastAsia="Calibri" w:hAnsi="Calibri"/>
-          <w:color w:val="28251D"/>
-          <w:sz w:val="22"/>
-          <w:szCs w:val="22"/>
-        </w:rPr>
-        <w:t xml:space="preserve">I certify under PENALTY OF PERJURY under the laws of the State of California that the foregoing paragraph is true and correct.</w:t>
-      </w:r>
-    </w:p>
-    <w:p>
-      <w:pPr>
-        <w:spacing w:after="300"/>
-      </w:pPr>
-      <w:r>
-        <w:rPr>
-          <w:rFonts w:ascii="Calibri" w:cs="Calibri" w:eastAsia="Calibri" w:hAnsi="Calibri"/>
-          <w:sz w:val="22"/>
-          <w:szCs w:val="22"/>
-        </w:rPr>
-        <w:t xml:space="preserve"/>
-      </w:r>
-    </w:p>
-    <w:p>
-      <w:pPr>
-        <w:spacing w:after="120"/>
-      </w:pPr>
-      <w:r>
-        <w:rPr>
-          <w:rFonts w:ascii="Calibri" w:cs="Calibri" w:eastAsia="Calibri" w:hAnsi="Calibri"/>
-          <w:color w:val="28251D"/>
-          <w:sz w:val="22"/>
-          <w:szCs w:val="22"/>
-        </w:rPr>
-        <w:t xml:space="preserve">WITNESS my hand and official seal.</w:t>
-      </w:r>
-    </w:p>
-    <w:p>
-      <w:pPr>
-        <w:spacing w:after="400"/>
-      </w:pPr>
-      <w:r>
-        <w:rPr>
-          <w:rFonts w:ascii="Calibri" w:cs="Calibri" w:eastAsia="Calibri" w:hAnsi="Calibri"/>
-          <w:sz w:val="22"/>
-          <w:szCs w:val="22"/>
-        </w:rPr>
-        <w:t xml:space="preserve"/>
       </w:r>
     </w:p>
     <w:tbl>
@@ -4421,404 +4141,90 @@
       <w:tr>
         <w:trPr>
           <w:cantSplit/>
-          <w:trHeight w:val="1800" w:hRule="atLeast"/>
         </w:trPr>
         <w:tc>
           <w:tcPr>
-            <w:tcW w:type="dxa" w:w="5900"/>
+            <w:tcW w:type="dxa" w:w="7000"/>
+            <w:tcBorders>
+              <w:top w:val="none" w:color="FFFFFF" w:sz="0"/>
+              <w:left w:val="none" w:color="FFFFFF" w:sz="0"/>
+              <w:bottom w:val="none" w:color="FFFFFF" w:sz="0"/>
+              <w:right w:val="none" w:color="FFFFFF" w:sz="0"/>
+            </w:tcBorders>
             <w:tcMar>
-              <w:top w:type="dxa" w:w="40"/>
-              <w:left w:type="dxa" w:w="40"/>
-              <w:bottom w:type="dxa" w:w="40"/>
-              <w:right w:type="dxa" w:w="200"/>
+              <w:top w:type="dxa" w:w="0"/>
+              <w:left w:type="dxa" w:w="0"/>
+              <w:bottom w:type="dxa" w:w="0"/>
+              <w:right w:type="dxa" w:w="0"/>
             </w:tcMar>
-            <w:vAlign w:val="bottom"/>
           </w:tcPr>
           <w:p>
             <w:pPr>
-              <w:spacing w:after="40"/>
+              <w:spacing w:after="0"/>
             </w:pPr>
             <w:r>
               <w:rPr>
                 <w:rFonts w:ascii="Calibri" w:cs="Calibri" w:eastAsia="Calibri" w:hAnsi="Calibri"/>
+                <w:b/>
+                <w:bCs/>
+                <w:color w:val="01696F"/>
                 <w:sz w:val="22"/>
                 <w:szCs w:val="22"/>
-                <w:u w:val="single" w:color="28251D"/>
               </w:rPr>
-              <w:t xml:space="preserve">                                                            </w:t>
-            </w:r>
-          </w:p>
-          <w:p>
-            <w:r>
-              <w:rPr>
-                <w:rFonts w:ascii="Calibri" w:cs="Calibri" w:eastAsia="Calibri" w:hAnsi="Calibri"/>
-                <w:i/>
-                <w:iCs/>
-                <w:color w:val="7A7974"/>
-                <w:sz w:val="20"/>
-                <w:szCs w:val="20"/>
-              </w:rPr>
-              <w:t xml:space="preserve">Signature of Notary Public</w:t>
+              <w:t xml:space="preserve">CALIFORNIA ALL-PURPOSE ACKNOWLEDGMENT</w:t>
             </w:r>
           </w:p>
         </w:tc>
         <w:tc>
           <w:tcPr>
-            <w:tcW w:type="dxa" w:w="3460"/>
+            <w:tcW w:type="dxa" w:w="2360"/>
             <w:tcBorders>
-              <w:top w:val="single" w:color="7A7974" w:sz="4" w:space="4"/>
-              <w:left w:val="single" w:color="7A7974" w:sz="4" w:space="4"/>
-              <w:bottom w:val="single" w:color="7A7974" w:sz="4" w:space="4"/>
-              <w:right w:val="single" w:color="7A7974" w:sz="4" w:space="4"/>
+              <w:top w:val="none" w:color="FFFFFF" w:sz="0"/>
+              <w:left w:val="none" w:color="FFFFFF" w:sz="0"/>
+              <w:bottom w:val="none" w:color="FFFFFF" w:sz="0"/>
+              <w:right w:val="none" w:color="FFFFFF" w:sz="0"/>
             </w:tcBorders>
             <w:tcMar>
-              <w:top w:type="dxa" w:w="40"/>
-              <w:left w:type="dxa" w:w="40"/>
-              <w:bottom w:type="dxa" w:w="40"/>
-              <w:right w:type="dxa" w:w="40"/>
+              <w:top w:type="dxa" w:w="0"/>
+              <w:left w:type="dxa" w:w="0"/>
+              <w:bottom w:type="dxa" w:w="0"/>
+              <w:right w:type="dxa" w:w="0"/>
             </w:tcMar>
-            <w:vAlign w:val="center"/>
           </w:tcPr>
           <w:p>
             <w:pPr>
-              <w:spacing w:after="200" w:before="200"/>
-              <w:jc w:val="center"/>
+              <w:spacing w:after="0"/>
+              <w:jc w:val="right"/>
             </w:pPr>
             <w:r>
               <w:rPr>
                 <w:rFonts w:ascii="Calibri" w:cs="Calibri" w:eastAsia="Calibri" w:hAnsi="Calibri"/>
-                <w:i/>
-                <w:iCs/>
-                <w:color w:val="7A7974"/>
-                <w:sz w:val="20"/>
-                <w:szCs w:val="20"/>
+                <w:b/>
+                <w:bCs/>
+                <w:color w:val="28251D"/>
+                <w:sz w:val="22"/>
+                <w:szCs w:val="22"/>
               </w:rPr>
-              <w:t xml:space="preserve">Place Notary Seal Here</w:t>
+              <w:t xml:space="preserve">CIVIL CODE § 1189</w:t>
             </w:r>
           </w:p>
         </w:tc>
       </w:tr>
     </w:tbl>
     <w:p>
-      <w:r>
-        <w:br w:type="page"/>
-      </w:r>
-    </w:p>
-    <w:p>
-      <w:pPr>
-        <w:pBdr>
-          <w:left w:val="single" w:color="01696F" w:sz="12" w:space="6"/>
-        </w:pBdr>
-        <w:shd w:fill="E6F0F1" w:val="clear"/>
+      <w:pPr>
         <w:spacing w:after="240" w:before="60"/>
-        <w:ind w:left="240" w:right="240"/>
-      </w:pPr>
-      <w:r>
-        <w:rPr>
-          <w:rFonts w:ascii="Calibri" w:cs="Calibri" w:eastAsia="Calibri" w:hAnsi="Calibri"/>
-          <w:b/>
-          <w:bCs/>
-          <w:color w:val="01696F"/>
+      </w:pPr>
+      <w:r>
+        <w:rPr>
+          <w:rFonts w:ascii="Calibri" w:cs="Calibri" w:eastAsia="Calibri" w:hAnsi="Calibri"/>
+          <w:i/>
+          <w:iCs/>
+          <w:color w:val="28251D"/>
           <w:sz w:val="20"/>
           <w:szCs w:val="20"/>
         </w:rPr>
-        <w:t xml:space="preserve">NOTE: </w:t>
-      </w:r>
-      <w:r>
-        <w:rPr>
-          <w:rFonts w:ascii="Calibri" w:cs="Calibri" w:eastAsia="Calibri" w:hAnsi="Calibri"/>
-          <w:i/>
-          <w:iCs/>
-          <w:color w:val="28251D"/>
-          <w:sz w:val="20"/>
-          <w:szCs w:val="20"/>
-        </w:rPr>
-        <w:t xml:space="preserve">The second acknowledgment below is for use only if a second consenting parent signs at a different time or location. If both parents appear together, use only the first acknowledgment on the previous page and delete this entire page.</w:t>
-      </w:r>
-    </w:p>
-    <w:p>
-      <w:pPr>
-        <w:spacing w:after="240"/>
-        <w:jc w:val="center"/>
-      </w:pPr>
-      <w:r>
-        <w:rPr>
-          <w:rFonts w:ascii="Calibri" w:cs="Calibri" w:eastAsia="Calibri" w:hAnsi="Calibri"/>
-          <w:b/>
-          <w:bCs/>
-          <w:color w:val="01696F"/>
-          <w:sz w:val="28"/>
-          <w:szCs w:val="28"/>
-        </w:rPr>
-        <w:t xml:space="preserve">CALIFORNIA ALL-PURPOSE ACKNOWLEDGMENT</w:t>
-      </w:r>
-    </w:p>
-    <w:p>
-      <w:pPr>
-        <w:spacing w:after="200"/>
-        <w:jc w:val="center"/>
-      </w:pPr>
-      <w:r>
-        <w:rPr>
-          <w:rFonts w:ascii="Calibri" w:cs="Calibri" w:eastAsia="Calibri" w:hAnsi="Calibri"/>
-          <w:i/>
-          <w:iCs/>
-          <w:color w:val="7A7974"/>
-          <w:sz w:val="20"/>
-          <w:szCs w:val="20"/>
-        </w:rPr>
-        <w:t xml:space="preserve">Civil Code § 1189 — Second Signer</w:t>
-      </w:r>
-    </w:p>
-    <w:p>
-      <w:pPr>
-        <w:pBdr>
-          <w:top w:val="single" w:color="28251D" w:sz="8" w:space="6"/>
-          <w:bottom w:val="single" w:color="28251D" w:sz="8" w:space="6"/>
-          <w:left w:val="single" w:color="28251D" w:sz="8" w:space="6"/>
-          <w:right w:val="single" w:color="28251D" w:sz="8" w:space="6"/>
-        </w:pBdr>
-        <w:spacing w:after="200" w:before="60"/>
-        <w:ind w:left="120" w:right="120"/>
-      </w:pPr>
-      <w:r>
-        <w:rPr>
-          <w:rFonts w:ascii="Calibri" w:cs="Calibri" w:eastAsia="Calibri" w:hAnsi="Calibri"/>
-          <w:i/>
-          <w:iCs/>
-          <w:color w:val="28251D"/>
-          <w:sz w:val="20"/>
-          <w:szCs w:val="20"/>
-        </w:rPr>
         <w:t xml:space="preserve">A notary public or other officer completing this certificate verifies only the identity of the individual who signed the document to which this certificate is attached, and not the truthfulness, accuracy, or validity of that document.</w:t>
-      </w:r>
-    </w:p>
-    <w:p>
-      <w:pPr>
-        <w:spacing w:after="200"/>
-      </w:pPr>
-      <w:r>
-        <w:rPr>
-          <w:rFonts w:ascii="Calibri" w:cs="Calibri" w:eastAsia="Calibri" w:hAnsi="Calibri"/>
-          <w:sz w:val="22"/>
-          <w:szCs w:val="22"/>
-        </w:rPr>
-        <w:t xml:space="preserve"/>
-      </w:r>
-    </w:p>
-    <w:p>
-      <w:pPr>
-        <w:spacing w:after="200"/>
-      </w:pPr>
-      <w:r>
-        <w:rPr>
-          <w:rFonts w:ascii="Calibri" w:cs="Calibri" w:eastAsia="Calibri" w:hAnsi="Calibri"/>
-          <w:sz w:val="22"/>
-          <w:szCs w:val="22"/>
-        </w:rPr>
-        <w:t xml:space="preserve">State of California</w:t>
-      </w:r>
-    </w:p>
-    <w:p>
-      <w:pPr>
-        <w:spacing w:after="300"/>
-      </w:pPr>
-      <w:r>
-        <w:rPr>
-          <w:rFonts w:ascii="Calibri" w:cs="Calibri" w:eastAsia="Calibri" w:hAnsi="Calibri"/>
-          <w:sz w:val="22"/>
-          <w:szCs w:val="22"/>
-        </w:rPr>
-        <w:t xml:space="preserve">County of </w:t>
-      </w:r>
-      <w:r>
-        <w:rPr>
-          <w:rFonts w:ascii="Calibri" w:cs="Calibri" w:eastAsia="Calibri" w:hAnsi="Calibri"/>
-          <w:sz w:val="22"/>
-          <w:szCs w:val="22"/>
-          <w:u w:val="single" w:color="28251D"/>
-        </w:rPr>
-        <w:t xml:space="preserve">                                        </w:t>
-      </w:r>
-    </w:p>
-    <w:p>
-      <w:pPr>
-        <w:keepNext/>
-        <w:spacing w:after="20"/>
-      </w:pPr>
-      <w:r>
-        <w:rPr>
-          <w:rFonts w:ascii="Calibri" w:cs="Calibri" w:eastAsia="Calibri" w:hAnsi="Calibri"/>
-          <w:sz w:val="22"/>
-          <w:szCs w:val="22"/>
-        </w:rPr>
-        <w:t xml:space="preserve">On </w:t>
-      </w:r>
-      <w:r>
-        <w:rPr>
-          <w:rFonts w:ascii="Calibri" w:cs="Calibri" w:eastAsia="Calibri" w:hAnsi="Calibri"/>
-          <w:sz w:val="22"/>
-          <w:szCs w:val="22"/>
-          <w:u w:val="single" w:color="28251D"/>
-        </w:rPr>
-        <w:t xml:space="preserve">                    </w:t>
-      </w:r>
-      <w:r>
-        <w:rPr>
-          <w:rFonts w:ascii="Calibri" w:cs="Calibri" w:eastAsia="Calibri" w:hAnsi="Calibri"/>
-          <w:sz w:val="22"/>
-          <w:szCs w:val="22"/>
-        </w:rPr>
-        <w:t xml:space="preserve"> before me,</w:t>
-      </w:r>
-    </w:p>
-    <w:p>
-      <w:pPr>
-        <w:keepNext/>
-        <w:spacing w:after="20"/>
-      </w:pPr>
-      <w:r>
-        <w:rPr>
-          <w:rFonts w:ascii="Calibri" w:cs="Calibri" w:eastAsia="Calibri" w:hAnsi="Calibri"/>
-          <w:sz w:val="22"/>
-          <w:szCs w:val="22"/>
-          <w:u w:val="single" w:color="28251D"/>
-        </w:rPr>
-        <w:t xml:space="preserve">                                                                                                    </w:t>
-      </w:r>
-      <w:r>
-        <w:rPr>
-          <w:rFonts w:ascii="Calibri" w:cs="Calibri" w:eastAsia="Calibri" w:hAnsi="Calibri"/>
-          <w:sz w:val="22"/>
-          <w:szCs w:val="22"/>
-        </w:rPr>
-        <w:t xml:space="preserve">,</w:t>
-      </w:r>
-    </w:p>
-    <w:p>
-      <w:pPr>
-        <w:spacing w:after="200"/>
-      </w:pPr>
-      <w:r>
-        <w:rPr>
-          <w:rFonts w:ascii="Calibri" w:cs="Calibri" w:eastAsia="Calibri" w:hAnsi="Calibri"/>
-          <w:i/>
-          <w:iCs/>
-          <w:color w:val="7A7974"/>
-          <w:sz w:val="16"/>
-          <w:szCs w:val="16"/>
-        </w:rPr>
-        <w:t xml:space="preserve">(here insert name and title of the officer)</w:t>
-      </w:r>
-    </w:p>
-    <w:p>
-      <w:pPr>
-        <w:keepNext/>
-        <w:spacing w:after="40"/>
-      </w:pPr>
-      <w:r>
-        <w:rPr>
-          <w:rFonts w:ascii="Calibri" w:cs="Calibri" w:eastAsia="Calibri" w:hAnsi="Calibri"/>
-          <w:sz w:val="22"/>
-          <w:szCs w:val="22"/>
-        </w:rPr>
-        <w:t xml:space="preserve">personally appeared</w:t>
-      </w:r>
-    </w:p>
-    <w:p>
-      <w:pPr>
-        <w:keepNext/>
-        <w:spacing w:after="40"/>
-      </w:pPr>
-      <w:r>
-        <w:rPr>
-          <w:rFonts w:ascii="Calibri" w:cs="Calibri" w:eastAsia="Calibri" w:hAnsi="Calibri"/>
-          <w:sz w:val="22"/>
-          <w:szCs w:val="22"/>
-          <w:u w:val="single" w:color="28251D"/>
-        </w:rPr>
-        <w:t xml:space="preserve">                                                                                                    </w:t>
-      </w:r>
-    </w:p>
-    <w:p>
-      <w:pPr>
-        <w:spacing w:after="240"/>
-      </w:pPr>
-      <w:r>
-        <w:rPr>
-          <w:rFonts w:ascii="Calibri" w:cs="Calibri" w:eastAsia="Calibri" w:hAnsi="Calibri"/>
-          <w:sz w:val="22"/>
-          <w:szCs w:val="22"/>
-          <w:u w:val="single" w:color="28251D"/>
-        </w:rPr>
-        <w:t xml:space="preserve">                                                                                                    </w:t>
-      </w:r>
-    </w:p>
-    <w:p>
-      <w:pPr>
-        <w:spacing w:after="240"/>
-      </w:pPr>
-      <w:r>
-        <w:rPr>
-          <w:rFonts w:ascii="Calibri" w:cs="Calibri" w:eastAsia="Calibri" w:hAnsi="Calibri"/>
-          <w:sz w:val="22"/>
-          <w:szCs w:val="22"/>
-        </w:rPr>
-        <w:t xml:space="preserve">who proved to me on the basis of satisfactory evidence to be the person(s) whose name(s) is/are subscribed to the within instrument, and acknowledged to me that he/she/they executed the same in his/her/their authorized capacity(ies), and that by his/her/their signature(s) on the instrument the person(s), or the entity upon behalf of which the person(s) acted, executed the instrument.</w:t>
-      </w:r>
-    </w:p>
-    <w:p>
-      <w:pPr>
-        <w:spacing w:after="120"/>
-      </w:pPr>
-      <w:r>
-        <w:rPr>
-          <w:rFonts w:ascii="Calibri" w:cs="Calibri" w:eastAsia="Calibri" w:hAnsi="Calibri"/>
-          <w:color w:val="28251D"/>
-          <w:sz w:val="22"/>
-          <w:szCs w:val="22"/>
-        </w:rPr>
-        <w:t xml:space="preserve">I certify under PENALTY OF PERJURY under the laws of the State of California that the foregoing paragraph is true and correct.</w:t>
-      </w:r>
-    </w:p>
-    <w:p>
-      <w:pPr>
-        <w:spacing w:after="300"/>
-      </w:pPr>
-      <w:r>
-        <w:rPr>
-          <w:rFonts w:ascii="Calibri" w:cs="Calibri" w:eastAsia="Calibri" w:hAnsi="Calibri"/>
-          <w:sz w:val="22"/>
-          <w:szCs w:val="22"/>
-        </w:rPr>
-        <w:t xml:space="preserve"/>
-      </w:r>
-    </w:p>
-    <w:p>
-      <w:pPr>
-        <w:spacing w:after="120"/>
-      </w:pPr>
-      <w:r>
-        <w:rPr>
-          <w:rFonts w:ascii="Calibri" w:cs="Calibri" w:eastAsia="Calibri" w:hAnsi="Calibri"/>
-          <w:color w:val="28251D"/>
-          <w:sz w:val="22"/>
-          <w:szCs w:val="22"/>
-        </w:rPr>
-        <w:t xml:space="preserve">WITNESS my hand and official seal.</w:t>
-      </w:r>
-    </w:p>
-    <w:p>
-      <w:pPr>
-        <w:spacing w:after="400"/>
-      </w:pPr>
-      <w:r>
-        <w:rPr>
-          <w:rFonts w:ascii="Calibri" w:cs="Calibri" w:eastAsia="Calibri" w:hAnsi="Calibri"/>
-          <w:sz w:val="22"/>
-          <w:szCs w:val="22"/>
-        </w:rPr>
-        <w:t xml:space="preserve"/>
       </w:r>
     </w:p>
     <w:tbl>
@@ -4840,22 +4246,248 @@
       <w:tr>
         <w:trPr>
           <w:cantSplit/>
-          <w:trHeight w:val="1800" w:hRule="atLeast"/>
         </w:trPr>
         <w:tc>
           <w:tcPr>
-            <w:tcW w:type="dxa" w:w="5900"/>
+            <w:tcW w:type="dxa" w:w="4680"/>
+            <w:tcBorders>
+              <w:top w:val="none" w:color="FFFFFF" w:sz="0"/>
+              <w:left w:val="none" w:color="FFFFFF" w:sz="0"/>
+              <w:bottom w:val="none" w:color="FFFFFF" w:sz="0"/>
+              <w:right w:val="none" w:color="FFFFFF" w:sz="0"/>
+            </w:tcBorders>
             <w:tcMar>
-              <w:top w:type="dxa" w:w="40"/>
-              <w:left w:type="dxa" w:w="40"/>
-              <w:bottom w:type="dxa" w:w="40"/>
-              <w:right w:type="dxa" w:w="200"/>
+              <w:top w:type="dxa" w:w="0"/>
+              <w:left w:type="dxa" w:w="0"/>
+              <w:bottom w:type="dxa" w:w="0"/>
+              <w:right w:type="dxa" w:w="0"/>
             </w:tcMar>
-            <w:vAlign w:val="bottom"/>
           </w:tcPr>
           <w:p>
             <w:pPr>
+              <w:spacing w:after="160"/>
+            </w:pPr>
+            <w:r>
+              <w:rPr>
+                <w:rFonts w:ascii="Calibri" w:cs="Calibri" w:eastAsia="Calibri" w:hAnsi="Calibri"/>
+                <w:sz w:val="22"/>
+                <w:szCs w:val="22"/>
+              </w:rPr>
+              <w:t xml:space="preserve">State of California</w:t>
+            </w:r>
+          </w:p>
+        </w:tc>
+        <w:tc>
+          <w:tcPr>
+            <w:tcW w:type="dxa" w:w="4680"/>
+            <w:tcBorders>
+              <w:top w:val="none" w:color="FFFFFF" w:sz="0"/>
+              <w:left w:val="none" w:color="FFFFFF" w:sz="0"/>
+              <w:bottom w:val="none" w:color="FFFFFF" w:sz="0"/>
+              <w:right w:val="none" w:color="FFFFFF" w:sz="0"/>
+            </w:tcBorders>
+            <w:tcMar>
+              <w:top w:type="dxa" w:w="0"/>
+              <w:left w:type="dxa" w:w="0"/>
+              <w:bottom w:type="dxa" w:w="0"/>
+              <w:right w:type="dxa" w:w="0"/>
+            </w:tcMar>
+          </w:tcPr>
+          <w:p>
+            <w:pPr>
+              <w:spacing w:after="160"/>
+            </w:pPr>
+            <w:r>
+              <w:rPr>
+                <w:rFonts w:ascii="Calibri" w:cs="Calibri" w:eastAsia="Calibri" w:hAnsi="Calibri"/>
+                <w:sz w:val="22"/>
+                <w:szCs w:val="22"/>
+              </w:rPr>
+              <w:t xml:space="preserve">)</w:t>
+            </w:r>
+          </w:p>
+        </w:tc>
+      </w:tr>
+      <w:tr>
+        <w:trPr>
+          <w:cantSplit/>
+        </w:trPr>
+        <w:tc>
+          <w:tcPr>
+            <w:tcW w:type="dxa" w:w="4680"/>
+            <w:tcBorders>
+              <w:top w:val="none" w:color="FFFFFF" w:sz="0"/>
+              <w:left w:val="none" w:color="FFFFFF" w:sz="0"/>
+              <w:bottom w:val="none" w:color="FFFFFF" w:sz="0"/>
+              <w:right w:val="none" w:color="FFFFFF" w:sz="0"/>
+            </w:tcBorders>
+            <w:tcMar>
+              <w:top w:type="dxa" w:w="0"/>
+              <w:left w:type="dxa" w:w="0"/>
+              <w:bottom w:type="dxa" w:w="0"/>
+              <w:right w:type="dxa" w:w="0"/>
+            </w:tcMar>
+          </w:tcPr>
+          <w:p>
+            <w:pPr>
+              <w:spacing w:after="200"/>
+            </w:pPr>
+            <w:r>
+              <w:rPr>
+                <w:rFonts w:ascii="Calibri" w:cs="Calibri" w:eastAsia="Calibri" w:hAnsi="Calibri"/>
+                <w:sz w:val="22"/>
+                <w:szCs w:val="22"/>
+              </w:rPr>
+              <w:t xml:space="preserve">County of </w:t>
+            </w:r>
+            <w:r>
+              <w:rPr>
+                <w:rFonts w:ascii="Calibri" w:cs="Calibri" w:eastAsia="Calibri" w:hAnsi="Calibri"/>
+                <w:sz w:val="22"/>
+                <w:szCs w:val="22"/>
+                <w:u w:val="single" w:color="28251D"/>
+              </w:rPr>
+              <w:t xml:space="preserve">                                        </w:t>
+            </w:r>
+          </w:p>
+        </w:tc>
+        <w:tc>
+          <w:tcPr>
+            <w:tcW w:type="dxa" w:w="4680"/>
+            <w:tcBorders>
+              <w:top w:val="none" w:color="FFFFFF" w:sz="0"/>
+              <w:left w:val="none" w:color="FFFFFF" w:sz="0"/>
+              <w:bottom w:val="none" w:color="FFFFFF" w:sz="0"/>
+              <w:right w:val="none" w:color="FFFFFF" w:sz="0"/>
+            </w:tcBorders>
+            <w:tcMar>
+              <w:top w:type="dxa" w:w="0"/>
+              <w:left w:type="dxa" w:w="0"/>
+              <w:bottom w:type="dxa" w:w="0"/>
+              <w:right w:type="dxa" w:w="0"/>
+            </w:tcMar>
+          </w:tcPr>
+          <w:p>
+            <w:pPr>
+              <w:spacing w:after="200"/>
+            </w:pPr>
+            <w:r>
+              <w:rPr>
+                <w:rFonts w:ascii="Calibri" w:cs="Calibri" w:eastAsia="Calibri" w:hAnsi="Calibri"/>
+                <w:sz w:val="22"/>
+                <w:szCs w:val="22"/>
+              </w:rPr>
+              <w:t xml:space="preserve">)</w:t>
+            </w:r>
+          </w:p>
+        </w:tc>
+      </w:tr>
+    </w:tbl>
+    <w:tbl>
+      <w:tblPr>
+        <w:tblW w:type="dxa" w:w="9360"/>
+        <w:tblBorders>
+          <w:top w:val="none" w:color="FFFFFF" w:sz="0"/>
+          <w:left w:val="none" w:color="FFFFFF" w:sz="0"/>
+          <w:bottom w:val="none" w:color="FFFFFF" w:sz="0"/>
+          <w:right w:val="none" w:color="FFFFFF" w:sz="0"/>
+          <w:insideH w:val="none" w:color="FFFFFF" w:sz="0"/>
+          <w:insideV w:val="none" w:color="FFFFFF" w:sz="0"/>
+        </w:tblBorders>
+      </w:tblPr>
+      <w:tblGrid>
+        <w:gridCol w:w="100"/>
+        <w:gridCol w:w="100"/>
+      </w:tblGrid>
+      <w:tr>
+        <w:trPr>
+          <w:cantSplit/>
+        </w:trPr>
+        <w:tc>
+          <w:tcPr>
+            <w:tcW w:type="dxa" w:w="3200"/>
+            <w:tcBorders>
+              <w:top w:val="none" w:color="FFFFFF" w:sz="0"/>
+              <w:left w:val="none" w:color="FFFFFF" w:sz="0"/>
+              <w:bottom w:val="none" w:color="FFFFFF" w:sz="0"/>
+              <w:right w:val="none" w:color="FFFFFF" w:sz="0"/>
+            </w:tcBorders>
+            <w:tcMar>
+              <w:top w:type="dxa" w:w="0"/>
+              <w:left w:type="dxa" w:w="0"/>
+              <w:bottom w:type="dxa" w:w="0"/>
+              <w:right w:type="dxa" w:w="120"/>
+            </w:tcMar>
+          </w:tcPr>
+          <w:p>
+            <w:pPr>
+              <w:keepNext/>
+              <w:spacing w:after="20"/>
+            </w:pPr>
+            <w:r>
+              <w:rPr>
+                <w:rFonts w:ascii="Calibri" w:cs="Calibri" w:eastAsia="Calibri" w:hAnsi="Calibri"/>
+                <w:sz w:val="22"/>
+                <w:szCs w:val="22"/>
+              </w:rPr>
+              <w:t xml:space="preserve">On </w:t>
+            </w:r>
+            <w:r>
+              <w:rPr>
+                <w:rFonts w:ascii="Calibri" w:cs="Calibri" w:eastAsia="Calibri" w:hAnsi="Calibri"/>
+                <w:sz w:val="22"/>
+                <w:szCs w:val="22"/>
+                <w:u w:val="single" w:color="28251D"/>
+              </w:rPr>
+              <w:t xml:space="preserve">                      </w:t>
+            </w:r>
+            <w:r>
+              <w:rPr>
+                <w:rFonts w:ascii="Calibri" w:cs="Calibri" w:eastAsia="Calibri" w:hAnsi="Calibri"/>
+                <w:sz w:val="22"/>
+                <w:szCs w:val="22"/>
+              </w:rPr>
+              <w:t xml:space="preserve"> before me,</w:t>
+            </w:r>
+          </w:p>
+          <w:p>
+            <w:pPr>
               <w:spacing w:after="40"/>
+              <w:ind w:left="240"/>
+            </w:pPr>
+            <w:r>
+              <w:rPr>
+                <w:rFonts w:ascii="Calibri" w:cs="Calibri" w:eastAsia="Calibri" w:hAnsi="Calibri"/>
+                <w:i/>
+                <w:iCs/>
+                <w:color w:val="7A7974"/>
+                <w:sz w:val="18"/>
+                <w:szCs w:val="18"/>
+              </w:rPr>
+              <w:t xml:space="preserve">Date</w:t>
+            </w:r>
+          </w:p>
+        </w:tc>
+        <w:tc>
+          <w:tcPr>
+            <w:tcW w:type="dxa" w:w="6160"/>
+            <w:tcBorders>
+              <w:top w:val="none" w:color="FFFFFF" w:sz="0"/>
+              <w:left w:val="none" w:color="FFFFFF" w:sz="0"/>
+              <w:bottom w:val="none" w:color="FFFFFF" w:sz="0"/>
+              <w:right w:val="none" w:color="FFFFFF" w:sz="0"/>
+            </w:tcBorders>
+            <w:tcMar>
+              <w:top w:type="dxa" w:w="0"/>
+              <w:left w:type="dxa" w:w="120"/>
+              <w:bottom w:type="dxa" w:w="0"/>
+              <w:right w:type="dxa" w:w="0"/>
+            </w:tcMar>
+          </w:tcPr>
+          <w:p>
+            <w:pPr>
+              <w:keepNext/>
+              <w:spacing w:after="20"/>
             </w:pPr>
             <w:r>
               <w:rPr>
@@ -4864,44 +4496,208 @@
                 <w:szCs w:val="22"/>
                 <w:u w:val="single" w:color="28251D"/>
               </w:rPr>
-              <w:t xml:space="preserve">                                                            </w:t>
+              <w:t xml:space="preserve">                                                          </w:t>
+            </w:r>
+            <w:r>
+              <w:rPr>
+                <w:rFonts w:ascii="Calibri" w:cs="Calibri" w:eastAsia="Calibri" w:hAnsi="Calibri"/>
+                <w:sz w:val="22"/>
+                <w:szCs w:val="22"/>
+              </w:rPr>
+              <w:t xml:space="preserve">,</w:t>
             </w:r>
           </w:p>
           <w:p>
+            <w:pPr>
+              <w:spacing w:after="40"/>
+              <w:jc w:val="center"/>
+            </w:pPr>
             <w:r>
               <w:rPr>
                 <w:rFonts w:ascii="Calibri" w:cs="Calibri" w:eastAsia="Calibri" w:hAnsi="Calibri"/>
                 <w:i/>
                 <w:iCs/>
                 <w:color w:val="7A7974"/>
-                <w:sz w:val="20"/>
-                <w:szCs w:val="20"/>
+                <w:sz w:val="18"/>
+                <w:szCs w:val="18"/>
               </w:rPr>
-              <w:t xml:space="preserve">Signature of Notary Public</w:t>
+              <w:t xml:space="preserve">Here Insert Name and Title of the Officer</w:t>
+            </w:r>
+          </w:p>
+        </w:tc>
+      </w:tr>
+    </w:tbl>
+    <w:tbl>
+      <w:tblPr>
+        <w:tblW w:type="dxa" w:w="9360"/>
+        <w:tblBorders>
+          <w:top w:val="none" w:color="FFFFFF" w:sz="0"/>
+          <w:left w:val="none" w:color="FFFFFF" w:sz="0"/>
+          <w:bottom w:val="none" w:color="FFFFFF" w:sz="0"/>
+          <w:right w:val="none" w:color="FFFFFF" w:sz="0"/>
+          <w:insideH w:val="none" w:color="FFFFFF" w:sz="0"/>
+          <w:insideV w:val="none" w:color="FFFFFF" w:sz="0"/>
+        </w:tblBorders>
+      </w:tblPr>
+      <w:tblGrid>
+        <w:gridCol w:w="100"/>
+        <w:gridCol w:w="100"/>
+      </w:tblGrid>
+      <w:tr>
+        <w:trPr>
+          <w:cantSplit/>
+        </w:trPr>
+        <w:tc>
+          <w:tcPr>
+            <w:tcW w:type="dxa" w:w="2400"/>
+            <w:tcBorders>
+              <w:top w:val="none" w:color="FFFFFF" w:sz="0"/>
+              <w:left w:val="none" w:color="FFFFFF" w:sz="0"/>
+              <w:bottom w:val="none" w:color="FFFFFF" w:sz="0"/>
+              <w:right w:val="none" w:color="FFFFFF" w:sz="0"/>
+            </w:tcBorders>
+            <w:tcMar>
+              <w:top w:type="dxa" w:w="0"/>
+              <w:left w:type="dxa" w:w="0"/>
+              <w:bottom w:type="dxa" w:w="0"/>
+              <w:right w:type="dxa" w:w="120"/>
+            </w:tcMar>
+            <w:vAlign w:val="bottom"/>
+          </w:tcPr>
+          <w:p>
+            <w:pPr>
+              <w:keepNext/>
+              <w:spacing w:after="20"/>
+            </w:pPr>
+            <w:r>
+              <w:rPr>
+                <w:rFonts w:ascii="Calibri" w:cs="Calibri" w:eastAsia="Calibri" w:hAnsi="Calibri"/>
+                <w:sz w:val="22"/>
+                <w:szCs w:val="22"/>
+              </w:rPr>
+              <w:t xml:space="preserve">Personally appeared</w:t>
             </w:r>
           </w:p>
         </w:tc>
         <w:tc>
           <w:tcPr>
-            <w:tcW w:type="dxa" w:w="3460"/>
+            <w:tcW w:type="dxa" w:w="6960"/>
             <w:tcBorders>
-              <w:top w:val="single" w:color="7A7974" w:sz="4" w:space="4"/>
-              <w:left w:val="single" w:color="7A7974" w:sz="4" w:space="4"/>
-              <w:bottom w:val="single" w:color="7A7974" w:sz="4" w:space="4"/>
-              <w:right w:val="single" w:color="7A7974" w:sz="4" w:space="4"/>
+              <w:top w:val="none" w:color="FFFFFF" w:sz="0"/>
+              <w:left w:val="none" w:color="FFFFFF" w:sz="0"/>
+              <w:bottom w:val="none" w:color="FFFFFF" w:sz="0"/>
+              <w:right w:val="none" w:color="FFFFFF" w:sz="0"/>
+            </w:tcBorders>
+            <w:tcMar>
+              <w:top w:type="dxa" w:w="0"/>
+              <w:left w:type="dxa" w:w="120"/>
+              <w:bottom w:type="dxa" w:w="0"/>
+              <w:right w:type="dxa" w:w="0"/>
+            </w:tcMar>
+          </w:tcPr>
+          <w:p>
+            <w:pPr>
+              <w:keepNext/>
+              <w:spacing w:after="20"/>
+            </w:pPr>
+            <w:r>
+              <w:rPr>
+                <w:rFonts w:ascii="Calibri" w:cs="Calibri" w:eastAsia="Calibri" w:hAnsi="Calibri"/>
+                <w:sz w:val="22"/>
+                <w:szCs w:val="22"/>
+                <w:u w:val="single" w:color="28251D"/>
+              </w:rPr>
+              <w:t xml:space="preserve">                                                                </w:t>
+            </w:r>
+          </w:p>
+          <w:p>
+            <w:pPr>
+              <w:spacing w:after="40"/>
+              <w:jc w:val="center"/>
+            </w:pPr>
+            <w:r>
+              <w:rPr>
+                <w:rFonts w:ascii="Calibri" w:cs="Calibri" w:eastAsia="Calibri" w:hAnsi="Calibri"/>
+                <w:i/>
+                <w:iCs/>
+                <w:color w:val="7A7974"/>
+                <w:sz w:val="18"/>
+                <w:szCs w:val="18"/>
+              </w:rPr>
+              <w:t xml:space="preserve">Name(s) of Signer(s)</w:t>
+            </w:r>
+          </w:p>
+        </w:tc>
+      </w:tr>
+    </w:tbl>
+    <w:p>
+      <w:pPr>
+        <w:spacing w:after="240"/>
+      </w:pPr>
+      <w:r>
+        <w:rPr>
+          <w:rFonts w:ascii="Calibri" w:cs="Calibri" w:eastAsia="Calibri" w:hAnsi="Calibri"/>
+          <w:sz w:val="22"/>
+          <w:szCs w:val="22"/>
+          <w:u w:val="single" w:color="28251D"/>
+        </w:rPr>
+        <w:t xml:space="preserve">                                                                                                    </w:t>
+      </w:r>
+    </w:p>
+    <w:p>
+      <w:pPr>
+        <w:spacing w:after="240"/>
+      </w:pPr>
+      <w:r>
+        <w:rPr>
+          <w:rFonts w:ascii="Calibri" w:cs="Calibri" w:eastAsia="Calibri" w:hAnsi="Calibri"/>
+          <w:sz w:val="22"/>
+          <w:szCs w:val="22"/>
+        </w:rPr>
+        <w:t xml:space="preserve">who proved to me on the basis of satisfactory evidence to be the person(s) whose name(s) is/are subscribed to the within instrument, and acknowledged to me that he/she/they executed the same in his/her/their authorized capacity(ies), and that by his/her/their signature(s) on the instrument the person(s), or the entity upon behalf of which the person(s) acted, executed the instrument.</w:t>
+      </w:r>
+    </w:p>
+    <w:tbl>
+      <w:tblPr>
+        <w:tblW w:type="dxa" w:w="9360"/>
+        <w:tblBorders>
+          <w:top w:val="none" w:color="FFFFFF" w:sz="0"/>
+          <w:left w:val="none" w:color="FFFFFF" w:sz="0"/>
+          <w:bottom w:val="none" w:color="FFFFFF" w:sz="0"/>
+          <w:right w:val="none" w:color="FFFFFF" w:sz="0"/>
+          <w:insideH w:val="none" w:color="FFFFFF" w:sz="0"/>
+          <w:insideV w:val="none" w:color="FFFFFF" w:sz="0"/>
+        </w:tblBorders>
+      </w:tblPr>
+      <w:tblGrid>
+        <w:gridCol w:w="100"/>
+        <w:gridCol w:w="100"/>
+      </w:tblGrid>
+      <w:tr>
+        <w:trPr>
+          <w:cantSplit/>
+          <w:trHeight w:val="2400" w:hRule="atLeast"/>
+        </w:trPr>
+        <w:tc>
+          <w:tcPr>
+            <w:tcW w:type="dxa" w:w="4200"/>
+            <w:tcBorders>
+              <w:top w:val="none" w:color="FFFFFF" w:sz="0"/>
+              <w:left w:val="none" w:color="FFFFFF" w:sz="0"/>
+              <w:bottom w:val="none" w:color="FFFFFF" w:sz="0"/>
+              <w:right w:val="none" w:color="FFFFFF" w:sz="0"/>
             </w:tcBorders>
             <w:tcMar>
               <w:top w:type="dxa" w:w="40"/>
-              <w:left w:type="dxa" w:w="40"/>
+              <w:left w:type="dxa" w:w="0"/>
               <w:bottom w:type="dxa" w:w="40"/>
-              <w:right w:type="dxa" w:w="40"/>
+              <w:right w:type="dxa" w:w="200"/>
             </w:tcMar>
-            <w:vAlign w:val="center"/>
+            <w:vAlign w:val="bottom"/>
           </w:tcPr>
           <w:p>
             <w:pPr>
-              <w:spacing w:after="200" w:before="200"/>
-              <w:jc w:val="center"/>
+              <w:spacing w:after="0"/>
             </w:pPr>
             <w:r>
               <w:rPr>
@@ -4912,7 +4708,802 @@
                 <w:sz w:val="20"/>
                 <w:szCs w:val="20"/>
               </w:rPr>
-              <w:t xml:space="preserve">Place Notary Seal Here</w:t>
+              <w:t xml:space="preserve">Place Notary Seal Above</w:t>
+            </w:r>
+          </w:p>
+        </w:tc>
+        <w:tc>
+          <w:tcPr>
+            <w:tcW w:type="dxa" w:w="5160"/>
+            <w:tcBorders>
+              <w:top w:val="none" w:color="FFFFFF" w:sz="0"/>
+              <w:left w:val="none" w:color="FFFFFF" w:sz="0"/>
+              <w:bottom w:val="none" w:color="FFFFFF" w:sz="0"/>
+              <w:right w:val="none" w:color="FFFFFF" w:sz="0"/>
+            </w:tcBorders>
+            <w:tcMar>
+              <w:top w:type="dxa" w:w="40"/>
+              <w:left w:type="dxa" w:w="200"/>
+              <w:bottom w:type="dxa" w:w="40"/>
+              <w:right w:type="dxa" w:w="0"/>
+            </w:tcMar>
+          </w:tcPr>
+          <w:p>
+            <w:pPr>
+              <w:spacing w:after="160"/>
+            </w:pPr>
+            <w:r>
+              <w:rPr>
+                <w:rFonts w:ascii="Calibri" w:cs="Calibri" w:eastAsia="Calibri" w:hAnsi="Calibri"/>
+                <w:sz w:val="22"/>
+                <w:szCs w:val="22"/>
+              </w:rPr>
+              <w:t xml:space="preserve">I certify under PENALTY OF PERJURY under the laws of the State of California that the foregoing paragraph is true and correct.</w:t>
+            </w:r>
+          </w:p>
+          <w:p>
+            <w:pPr>
+              <w:spacing w:after="400"/>
+            </w:pPr>
+            <w:r>
+              <w:rPr>
+                <w:rFonts w:ascii="Calibri" w:cs="Calibri" w:eastAsia="Calibri" w:hAnsi="Calibri"/>
+                <w:sz w:val="22"/>
+                <w:szCs w:val="22"/>
+              </w:rPr>
+              <w:t xml:space="preserve">WITNESS my hand and official seal.</w:t>
+            </w:r>
+          </w:p>
+          <w:p>
+            <w:pPr>
+              <w:keepNext/>
+              <w:spacing w:after="20"/>
+            </w:pPr>
+            <w:r>
+              <w:rPr>
+                <w:rFonts w:ascii="Calibri" w:cs="Calibri" w:eastAsia="Calibri" w:hAnsi="Calibri"/>
+                <w:sz w:val="22"/>
+                <w:szCs w:val="22"/>
+              </w:rPr>
+              <w:t xml:space="preserve">Signature </w:t>
+            </w:r>
+            <w:r>
+              <w:rPr>
+                <w:rFonts w:ascii="Calibri" w:cs="Calibri" w:eastAsia="Calibri" w:hAnsi="Calibri"/>
+                <w:sz w:val="22"/>
+                <w:szCs w:val="22"/>
+                <w:u w:val="single" w:color="28251D"/>
+              </w:rPr>
+              <w:t xml:space="preserve">                                      </w:t>
+            </w:r>
+          </w:p>
+          <w:p>
+            <w:pPr>
+              <w:spacing w:after="40"/>
+              <w:jc w:val="center"/>
+            </w:pPr>
+            <w:r>
+              <w:rPr>
+                <w:rFonts w:ascii="Calibri" w:cs="Calibri" w:eastAsia="Calibri" w:hAnsi="Calibri"/>
+                <w:i/>
+                <w:iCs/>
+                <w:color w:val="7A7974"/>
+                <w:sz w:val="18"/>
+                <w:szCs w:val="18"/>
+              </w:rPr>
+              <w:t xml:space="preserve">Signature of Notary Public</w:t>
+            </w:r>
+          </w:p>
+        </w:tc>
+      </w:tr>
+    </w:tbl>
+    <w:p>
+      <w:r>
+        <w:br w:type="page"/>
+      </w:r>
+    </w:p>
+    <w:p>
+      <w:pPr>
+        <w:pBdr>
+          <w:left w:val="single" w:color="01696F" w:sz="12" w:space="6"/>
+        </w:pBdr>
+        <w:shd w:fill="E6F0F1" w:val="clear"/>
+        <w:spacing w:after="240" w:before="60"/>
+        <w:ind w:left="240" w:right="240"/>
+      </w:pPr>
+      <w:r>
+        <w:rPr>
+          <w:rFonts w:ascii="Calibri" w:cs="Calibri" w:eastAsia="Calibri" w:hAnsi="Calibri"/>
+          <w:b/>
+          <w:bCs/>
+          <w:color w:val="01696F"/>
+          <w:sz w:val="20"/>
+          <w:szCs w:val="20"/>
+        </w:rPr>
+        <w:t xml:space="preserve">NOTE: </w:t>
+      </w:r>
+      <w:r>
+        <w:rPr>
+          <w:rFonts w:ascii="Calibri" w:cs="Calibri" w:eastAsia="Calibri" w:hAnsi="Calibri"/>
+          <w:i/>
+          <w:iCs/>
+          <w:color w:val="28251D"/>
+          <w:sz w:val="20"/>
+          <w:szCs w:val="20"/>
+        </w:rPr>
+        <w:t xml:space="preserve">The second acknowledgment below is for use only if a second consenting parent signs at a different time or location. If both parents appear together, use only the first acknowledgment on the previous page and delete this entire page.</w:t>
+      </w:r>
+    </w:p>
+    <w:tbl>
+      <w:tblPr>
+        <w:tblW w:type="dxa" w:w="9360"/>
+        <w:tblBorders>
+          <w:top w:val="none" w:color="FFFFFF" w:sz="0"/>
+          <w:left w:val="none" w:color="FFFFFF" w:sz="0"/>
+          <w:bottom w:val="none" w:color="FFFFFF" w:sz="0"/>
+          <w:right w:val="none" w:color="FFFFFF" w:sz="0"/>
+          <w:insideH w:val="none" w:color="FFFFFF" w:sz="0"/>
+          <w:insideV w:val="none" w:color="FFFFFF" w:sz="0"/>
+        </w:tblBorders>
+      </w:tblPr>
+      <w:tblGrid>
+        <w:gridCol w:w="100"/>
+        <w:gridCol w:w="100"/>
+      </w:tblGrid>
+      <w:tr>
+        <w:trPr>
+          <w:cantSplit/>
+        </w:trPr>
+        <w:tc>
+          <w:tcPr>
+            <w:tcW w:type="dxa" w:w="7000"/>
+            <w:tcBorders>
+              <w:top w:val="none" w:color="FFFFFF" w:sz="0"/>
+              <w:left w:val="none" w:color="FFFFFF" w:sz="0"/>
+              <w:bottom w:val="none" w:color="FFFFFF" w:sz="0"/>
+              <w:right w:val="none" w:color="FFFFFF" w:sz="0"/>
+            </w:tcBorders>
+            <w:tcMar>
+              <w:top w:type="dxa" w:w="0"/>
+              <w:left w:type="dxa" w:w="0"/>
+              <w:bottom w:type="dxa" w:w="0"/>
+              <w:right w:type="dxa" w:w="0"/>
+            </w:tcMar>
+          </w:tcPr>
+          <w:p>
+            <w:pPr>
+              <w:spacing w:after="0"/>
+            </w:pPr>
+            <w:r>
+              <w:rPr>
+                <w:rFonts w:ascii="Calibri" w:cs="Calibri" w:eastAsia="Calibri" w:hAnsi="Calibri"/>
+                <w:b/>
+                <w:bCs/>
+                <w:color w:val="01696F"/>
+                <w:sz w:val="22"/>
+                <w:szCs w:val="22"/>
+              </w:rPr>
+              <w:t xml:space="preserve">CALIFORNIA ALL-PURPOSE ACKNOWLEDGMENT</w:t>
+            </w:r>
+          </w:p>
+        </w:tc>
+        <w:tc>
+          <w:tcPr>
+            <w:tcW w:type="dxa" w:w="2360"/>
+            <w:tcBorders>
+              <w:top w:val="none" w:color="FFFFFF" w:sz="0"/>
+              <w:left w:val="none" w:color="FFFFFF" w:sz="0"/>
+              <w:bottom w:val="none" w:color="FFFFFF" w:sz="0"/>
+              <w:right w:val="none" w:color="FFFFFF" w:sz="0"/>
+            </w:tcBorders>
+            <w:tcMar>
+              <w:top w:type="dxa" w:w="0"/>
+              <w:left w:type="dxa" w:w="0"/>
+              <w:bottom w:type="dxa" w:w="0"/>
+              <w:right w:type="dxa" w:w="0"/>
+            </w:tcMar>
+          </w:tcPr>
+          <w:p>
+            <w:pPr>
+              <w:spacing w:after="0"/>
+              <w:jc w:val="right"/>
+            </w:pPr>
+            <w:r>
+              <w:rPr>
+                <w:rFonts w:ascii="Calibri" w:cs="Calibri" w:eastAsia="Calibri" w:hAnsi="Calibri"/>
+                <w:b/>
+                <w:bCs/>
+                <w:color w:val="28251D"/>
+                <w:sz w:val="22"/>
+                <w:szCs w:val="22"/>
+              </w:rPr>
+              <w:t xml:space="preserve">CIVIL CODE § 1189 — Second Signer</w:t>
+            </w:r>
+          </w:p>
+        </w:tc>
+      </w:tr>
+    </w:tbl>
+    <w:p>
+      <w:pPr>
+        <w:spacing w:after="240" w:before="60"/>
+      </w:pPr>
+      <w:r>
+        <w:rPr>
+          <w:rFonts w:ascii="Calibri" w:cs="Calibri" w:eastAsia="Calibri" w:hAnsi="Calibri"/>
+          <w:i/>
+          <w:iCs/>
+          <w:color w:val="28251D"/>
+          <w:sz w:val="20"/>
+          <w:szCs w:val="20"/>
+        </w:rPr>
+        <w:t xml:space="preserve">A notary public or other officer completing this certificate verifies only the identity of the individual who signed the document to which this certificate is attached, and not the truthfulness, accuracy, or validity of that document.</w:t>
+      </w:r>
+    </w:p>
+    <w:tbl>
+      <w:tblPr>
+        <w:tblW w:type="dxa" w:w="9360"/>
+        <w:tblBorders>
+          <w:top w:val="none" w:color="FFFFFF" w:sz="0"/>
+          <w:left w:val="none" w:color="FFFFFF" w:sz="0"/>
+          <w:bottom w:val="none" w:color="FFFFFF" w:sz="0"/>
+          <w:right w:val="none" w:color="FFFFFF" w:sz="0"/>
+          <w:insideH w:val="none" w:color="FFFFFF" w:sz="0"/>
+          <w:insideV w:val="none" w:color="FFFFFF" w:sz="0"/>
+        </w:tblBorders>
+      </w:tblPr>
+      <w:tblGrid>
+        <w:gridCol w:w="100"/>
+        <w:gridCol w:w="100"/>
+      </w:tblGrid>
+      <w:tr>
+        <w:trPr>
+          <w:cantSplit/>
+        </w:trPr>
+        <w:tc>
+          <w:tcPr>
+            <w:tcW w:type="dxa" w:w="4680"/>
+            <w:tcBorders>
+              <w:top w:val="none" w:color="FFFFFF" w:sz="0"/>
+              <w:left w:val="none" w:color="FFFFFF" w:sz="0"/>
+              <w:bottom w:val="none" w:color="FFFFFF" w:sz="0"/>
+              <w:right w:val="none" w:color="FFFFFF" w:sz="0"/>
+            </w:tcBorders>
+            <w:tcMar>
+              <w:top w:type="dxa" w:w="0"/>
+              <w:left w:type="dxa" w:w="0"/>
+              <w:bottom w:type="dxa" w:w="0"/>
+              <w:right w:type="dxa" w:w="0"/>
+            </w:tcMar>
+          </w:tcPr>
+          <w:p>
+            <w:pPr>
+              <w:spacing w:after="160"/>
+            </w:pPr>
+            <w:r>
+              <w:rPr>
+                <w:rFonts w:ascii="Calibri" w:cs="Calibri" w:eastAsia="Calibri" w:hAnsi="Calibri"/>
+                <w:sz w:val="22"/>
+                <w:szCs w:val="22"/>
+              </w:rPr>
+              <w:t xml:space="preserve">State of California</w:t>
+            </w:r>
+          </w:p>
+        </w:tc>
+        <w:tc>
+          <w:tcPr>
+            <w:tcW w:type="dxa" w:w="4680"/>
+            <w:tcBorders>
+              <w:top w:val="none" w:color="FFFFFF" w:sz="0"/>
+              <w:left w:val="none" w:color="FFFFFF" w:sz="0"/>
+              <w:bottom w:val="none" w:color="FFFFFF" w:sz="0"/>
+              <w:right w:val="none" w:color="FFFFFF" w:sz="0"/>
+            </w:tcBorders>
+            <w:tcMar>
+              <w:top w:type="dxa" w:w="0"/>
+              <w:left w:type="dxa" w:w="0"/>
+              <w:bottom w:type="dxa" w:w="0"/>
+              <w:right w:type="dxa" w:w="0"/>
+            </w:tcMar>
+          </w:tcPr>
+          <w:p>
+            <w:pPr>
+              <w:spacing w:after="160"/>
+            </w:pPr>
+            <w:r>
+              <w:rPr>
+                <w:rFonts w:ascii="Calibri" w:cs="Calibri" w:eastAsia="Calibri" w:hAnsi="Calibri"/>
+                <w:sz w:val="22"/>
+                <w:szCs w:val="22"/>
+              </w:rPr>
+              <w:t xml:space="preserve">)</w:t>
+            </w:r>
+          </w:p>
+        </w:tc>
+      </w:tr>
+      <w:tr>
+        <w:trPr>
+          <w:cantSplit/>
+        </w:trPr>
+        <w:tc>
+          <w:tcPr>
+            <w:tcW w:type="dxa" w:w="4680"/>
+            <w:tcBorders>
+              <w:top w:val="none" w:color="FFFFFF" w:sz="0"/>
+              <w:left w:val="none" w:color="FFFFFF" w:sz="0"/>
+              <w:bottom w:val="none" w:color="FFFFFF" w:sz="0"/>
+              <w:right w:val="none" w:color="FFFFFF" w:sz="0"/>
+            </w:tcBorders>
+            <w:tcMar>
+              <w:top w:type="dxa" w:w="0"/>
+              <w:left w:type="dxa" w:w="0"/>
+              <w:bottom w:type="dxa" w:w="0"/>
+              <w:right w:type="dxa" w:w="0"/>
+            </w:tcMar>
+          </w:tcPr>
+          <w:p>
+            <w:pPr>
+              <w:spacing w:after="200"/>
+            </w:pPr>
+            <w:r>
+              <w:rPr>
+                <w:rFonts w:ascii="Calibri" w:cs="Calibri" w:eastAsia="Calibri" w:hAnsi="Calibri"/>
+                <w:sz w:val="22"/>
+                <w:szCs w:val="22"/>
+              </w:rPr>
+              <w:t xml:space="preserve">County of </w:t>
+            </w:r>
+            <w:r>
+              <w:rPr>
+                <w:rFonts w:ascii="Calibri" w:cs="Calibri" w:eastAsia="Calibri" w:hAnsi="Calibri"/>
+                <w:sz w:val="22"/>
+                <w:szCs w:val="22"/>
+                <w:u w:val="single" w:color="28251D"/>
+              </w:rPr>
+              <w:t xml:space="preserve">                                        </w:t>
+            </w:r>
+          </w:p>
+        </w:tc>
+        <w:tc>
+          <w:tcPr>
+            <w:tcW w:type="dxa" w:w="4680"/>
+            <w:tcBorders>
+              <w:top w:val="none" w:color="FFFFFF" w:sz="0"/>
+              <w:left w:val="none" w:color="FFFFFF" w:sz="0"/>
+              <w:bottom w:val="none" w:color="FFFFFF" w:sz="0"/>
+              <w:right w:val="none" w:color="FFFFFF" w:sz="0"/>
+            </w:tcBorders>
+            <w:tcMar>
+              <w:top w:type="dxa" w:w="0"/>
+              <w:left w:type="dxa" w:w="0"/>
+              <w:bottom w:type="dxa" w:w="0"/>
+              <w:right w:type="dxa" w:w="0"/>
+            </w:tcMar>
+          </w:tcPr>
+          <w:p>
+            <w:pPr>
+              <w:spacing w:after="200"/>
+            </w:pPr>
+            <w:r>
+              <w:rPr>
+                <w:rFonts w:ascii="Calibri" w:cs="Calibri" w:eastAsia="Calibri" w:hAnsi="Calibri"/>
+                <w:sz w:val="22"/>
+                <w:szCs w:val="22"/>
+              </w:rPr>
+              <w:t xml:space="preserve">)</w:t>
+            </w:r>
+          </w:p>
+        </w:tc>
+      </w:tr>
+    </w:tbl>
+    <w:tbl>
+      <w:tblPr>
+        <w:tblW w:type="dxa" w:w="9360"/>
+        <w:tblBorders>
+          <w:top w:val="none" w:color="FFFFFF" w:sz="0"/>
+          <w:left w:val="none" w:color="FFFFFF" w:sz="0"/>
+          <w:bottom w:val="none" w:color="FFFFFF" w:sz="0"/>
+          <w:right w:val="none" w:color="FFFFFF" w:sz="0"/>
+          <w:insideH w:val="none" w:color="FFFFFF" w:sz="0"/>
+          <w:insideV w:val="none" w:color="FFFFFF" w:sz="0"/>
+        </w:tblBorders>
+      </w:tblPr>
+      <w:tblGrid>
+        <w:gridCol w:w="100"/>
+        <w:gridCol w:w="100"/>
+      </w:tblGrid>
+      <w:tr>
+        <w:trPr>
+          <w:cantSplit/>
+        </w:trPr>
+        <w:tc>
+          <w:tcPr>
+            <w:tcW w:type="dxa" w:w="3200"/>
+            <w:tcBorders>
+              <w:top w:val="none" w:color="FFFFFF" w:sz="0"/>
+              <w:left w:val="none" w:color="FFFFFF" w:sz="0"/>
+              <w:bottom w:val="none" w:color="FFFFFF" w:sz="0"/>
+              <w:right w:val="none" w:color="FFFFFF" w:sz="0"/>
+            </w:tcBorders>
+            <w:tcMar>
+              <w:top w:type="dxa" w:w="0"/>
+              <w:left w:type="dxa" w:w="0"/>
+              <w:bottom w:type="dxa" w:w="0"/>
+              <w:right w:type="dxa" w:w="120"/>
+            </w:tcMar>
+          </w:tcPr>
+          <w:p>
+            <w:pPr>
+              <w:keepNext/>
+              <w:spacing w:after="20"/>
+            </w:pPr>
+            <w:r>
+              <w:rPr>
+                <w:rFonts w:ascii="Calibri" w:cs="Calibri" w:eastAsia="Calibri" w:hAnsi="Calibri"/>
+                <w:sz w:val="22"/>
+                <w:szCs w:val="22"/>
+              </w:rPr>
+              <w:t xml:space="preserve">On </w:t>
+            </w:r>
+            <w:r>
+              <w:rPr>
+                <w:rFonts w:ascii="Calibri" w:cs="Calibri" w:eastAsia="Calibri" w:hAnsi="Calibri"/>
+                <w:sz w:val="22"/>
+                <w:szCs w:val="22"/>
+                <w:u w:val="single" w:color="28251D"/>
+              </w:rPr>
+              <w:t xml:space="preserve">                      </w:t>
+            </w:r>
+            <w:r>
+              <w:rPr>
+                <w:rFonts w:ascii="Calibri" w:cs="Calibri" w:eastAsia="Calibri" w:hAnsi="Calibri"/>
+                <w:sz w:val="22"/>
+                <w:szCs w:val="22"/>
+              </w:rPr>
+              <w:t xml:space="preserve"> before me,</w:t>
+            </w:r>
+          </w:p>
+          <w:p>
+            <w:pPr>
+              <w:spacing w:after="40"/>
+              <w:ind w:left="240"/>
+            </w:pPr>
+            <w:r>
+              <w:rPr>
+                <w:rFonts w:ascii="Calibri" w:cs="Calibri" w:eastAsia="Calibri" w:hAnsi="Calibri"/>
+                <w:i/>
+                <w:iCs/>
+                <w:color w:val="7A7974"/>
+                <w:sz w:val="18"/>
+                <w:szCs w:val="18"/>
+              </w:rPr>
+              <w:t xml:space="preserve">Date</w:t>
+            </w:r>
+          </w:p>
+        </w:tc>
+        <w:tc>
+          <w:tcPr>
+            <w:tcW w:type="dxa" w:w="6160"/>
+            <w:tcBorders>
+              <w:top w:val="none" w:color="FFFFFF" w:sz="0"/>
+              <w:left w:val="none" w:color="FFFFFF" w:sz="0"/>
+              <w:bottom w:val="none" w:color="FFFFFF" w:sz="0"/>
+              <w:right w:val="none" w:color="FFFFFF" w:sz="0"/>
+            </w:tcBorders>
+            <w:tcMar>
+              <w:top w:type="dxa" w:w="0"/>
+              <w:left w:type="dxa" w:w="120"/>
+              <w:bottom w:type="dxa" w:w="0"/>
+              <w:right w:type="dxa" w:w="0"/>
+            </w:tcMar>
+          </w:tcPr>
+          <w:p>
+            <w:pPr>
+              <w:keepNext/>
+              <w:spacing w:after="20"/>
+            </w:pPr>
+            <w:r>
+              <w:rPr>
+                <w:rFonts w:ascii="Calibri" w:cs="Calibri" w:eastAsia="Calibri" w:hAnsi="Calibri"/>
+                <w:sz w:val="22"/>
+                <w:szCs w:val="22"/>
+                <w:u w:val="single" w:color="28251D"/>
+              </w:rPr>
+              <w:t xml:space="preserve">                                                          </w:t>
+            </w:r>
+            <w:r>
+              <w:rPr>
+                <w:rFonts w:ascii="Calibri" w:cs="Calibri" w:eastAsia="Calibri" w:hAnsi="Calibri"/>
+                <w:sz w:val="22"/>
+                <w:szCs w:val="22"/>
+              </w:rPr>
+              <w:t xml:space="preserve">,</w:t>
+            </w:r>
+          </w:p>
+          <w:p>
+            <w:pPr>
+              <w:spacing w:after="40"/>
+              <w:jc w:val="center"/>
+            </w:pPr>
+            <w:r>
+              <w:rPr>
+                <w:rFonts w:ascii="Calibri" w:cs="Calibri" w:eastAsia="Calibri" w:hAnsi="Calibri"/>
+                <w:i/>
+                <w:iCs/>
+                <w:color w:val="7A7974"/>
+                <w:sz w:val="18"/>
+                <w:szCs w:val="18"/>
+              </w:rPr>
+              <w:t xml:space="preserve">Here Insert Name and Title of the Officer</w:t>
+            </w:r>
+          </w:p>
+        </w:tc>
+      </w:tr>
+    </w:tbl>
+    <w:tbl>
+      <w:tblPr>
+        <w:tblW w:type="dxa" w:w="9360"/>
+        <w:tblBorders>
+          <w:top w:val="none" w:color="FFFFFF" w:sz="0"/>
+          <w:left w:val="none" w:color="FFFFFF" w:sz="0"/>
+          <w:bottom w:val="none" w:color="FFFFFF" w:sz="0"/>
+          <w:right w:val="none" w:color="FFFFFF" w:sz="0"/>
+          <w:insideH w:val="none" w:color="FFFFFF" w:sz="0"/>
+          <w:insideV w:val="none" w:color="FFFFFF" w:sz="0"/>
+        </w:tblBorders>
+      </w:tblPr>
+      <w:tblGrid>
+        <w:gridCol w:w="100"/>
+        <w:gridCol w:w="100"/>
+      </w:tblGrid>
+      <w:tr>
+        <w:trPr>
+          <w:cantSplit/>
+        </w:trPr>
+        <w:tc>
+          <w:tcPr>
+            <w:tcW w:type="dxa" w:w="2400"/>
+            <w:tcBorders>
+              <w:top w:val="none" w:color="FFFFFF" w:sz="0"/>
+              <w:left w:val="none" w:color="FFFFFF" w:sz="0"/>
+              <w:bottom w:val="none" w:color="FFFFFF" w:sz="0"/>
+              <w:right w:val="none" w:color="FFFFFF" w:sz="0"/>
+            </w:tcBorders>
+            <w:tcMar>
+              <w:top w:type="dxa" w:w="0"/>
+              <w:left w:type="dxa" w:w="0"/>
+              <w:bottom w:type="dxa" w:w="0"/>
+              <w:right w:type="dxa" w:w="120"/>
+            </w:tcMar>
+            <w:vAlign w:val="bottom"/>
+          </w:tcPr>
+          <w:p>
+            <w:pPr>
+              <w:keepNext/>
+              <w:spacing w:after="20"/>
+            </w:pPr>
+            <w:r>
+              <w:rPr>
+                <w:rFonts w:ascii="Calibri" w:cs="Calibri" w:eastAsia="Calibri" w:hAnsi="Calibri"/>
+                <w:sz w:val="22"/>
+                <w:szCs w:val="22"/>
+              </w:rPr>
+              <w:t xml:space="preserve">Personally appeared</w:t>
+            </w:r>
+          </w:p>
+        </w:tc>
+        <w:tc>
+          <w:tcPr>
+            <w:tcW w:type="dxa" w:w="6960"/>
+            <w:tcBorders>
+              <w:top w:val="none" w:color="FFFFFF" w:sz="0"/>
+              <w:left w:val="none" w:color="FFFFFF" w:sz="0"/>
+              <w:bottom w:val="none" w:color="FFFFFF" w:sz="0"/>
+              <w:right w:val="none" w:color="FFFFFF" w:sz="0"/>
+            </w:tcBorders>
+            <w:tcMar>
+              <w:top w:type="dxa" w:w="0"/>
+              <w:left w:type="dxa" w:w="120"/>
+              <w:bottom w:type="dxa" w:w="0"/>
+              <w:right w:type="dxa" w:w="0"/>
+            </w:tcMar>
+          </w:tcPr>
+          <w:p>
+            <w:pPr>
+              <w:keepNext/>
+              <w:spacing w:after="20"/>
+            </w:pPr>
+            <w:r>
+              <w:rPr>
+                <w:rFonts w:ascii="Calibri" w:cs="Calibri" w:eastAsia="Calibri" w:hAnsi="Calibri"/>
+                <w:sz w:val="22"/>
+                <w:szCs w:val="22"/>
+                <w:u w:val="single" w:color="28251D"/>
+              </w:rPr>
+              <w:t xml:space="preserve">                                                                </w:t>
+            </w:r>
+          </w:p>
+          <w:p>
+            <w:pPr>
+              <w:spacing w:after="40"/>
+              <w:jc w:val="center"/>
+            </w:pPr>
+            <w:r>
+              <w:rPr>
+                <w:rFonts w:ascii="Calibri" w:cs="Calibri" w:eastAsia="Calibri" w:hAnsi="Calibri"/>
+                <w:i/>
+                <w:iCs/>
+                <w:color w:val="7A7974"/>
+                <w:sz w:val="18"/>
+                <w:szCs w:val="18"/>
+              </w:rPr>
+              <w:t xml:space="preserve">Name(s) of Signer(s)</w:t>
+            </w:r>
+          </w:p>
+        </w:tc>
+      </w:tr>
+    </w:tbl>
+    <w:p>
+      <w:pPr>
+        <w:spacing w:after="240"/>
+      </w:pPr>
+      <w:r>
+        <w:rPr>
+          <w:rFonts w:ascii="Calibri" w:cs="Calibri" w:eastAsia="Calibri" w:hAnsi="Calibri"/>
+          <w:sz w:val="22"/>
+          <w:szCs w:val="22"/>
+          <w:u w:val="single" w:color="28251D"/>
+        </w:rPr>
+        <w:t xml:space="preserve">                                                                                                    </w:t>
+      </w:r>
+    </w:p>
+    <w:p>
+      <w:pPr>
+        <w:spacing w:after="240"/>
+      </w:pPr>
+      <w:r>
+        <w:rPr>
+          <w:rFonts w:ascii="Calibri" w:cs="Calibri" w:eastAsia="Calibri" w:hAnsi="Calibri"/>
+          <w:sz w:val="22"/>
+          <w:szCs w:val="22"/>
+        </w:rPr>
+        <w:t xml:space="preserve">who proved to me on the basis of satisfactory evidence to be the person(s) whose name(s) is/are subscribed to the within instrument, and acknowledged to me that he/she/they executed the same in his/her/their authorized capacity(ies), and that by his/her/their signature(s) on the instrument the person(s), or the entity upon behalf of which the person(s) acted, executed the instrument.</w:t>
+      </w:r>
+    </w:p>
+    <w:tbl>
+      <w:tblPr>
+        <w:tblW w:type="dxa" w:w="9360"/>
+        <w:tblBorders>
+          <w:top w:val="none" w:color="FFFFFF" w:sz="0"/>
+          <w:left w:val="none" w:color="FFFFFF" w:sz="0"/>
+          <w:bottom w:val="none" w:color="FFFFFF" w:sz="0"/>
+          <w:right w:val="none" w:color="FFFFFF" w:sz="0"/>
+          <w:insideH w:val="none" w:color="FFFFFF" w:sz="0"/>
+          <w:insideV w:val="none" w:color="FFFFFF" w:sz="0"/>
+        </w:tblBorders>
+      </w:tblPr>
+      <w:tblGrid>
+        <w:gridCol w:w="100"/>
+        <w:gridCol w:w="100"/>
+      </w:tblGrid>
+      <w:tr>
+        <w:trPr>
+          <w:cantSplit/>
+          <w:trHeight w:val="2400" w:hRule="atLeast"/>
+        </w:trPr>
+        <w:tc>
+          <w:tcPr>
+            <w:tcW w:type="dxa" w:w="4200"/>
+            <w:tcBorders>
+              <w:top w:val="none" w:color="FFFFFF" w:sz="0"/>
+              <w:left w:val="none" w:color="FFFFFF" w:sz="0"/>
+              <w:bottom w:val="none" w:color="FFFFFF" w:sz="0"/>
+              <w:right w:val="none" w:color="FFFFFF" w:sz="0"/>
+            </w:tcBorders>
+            <w:tcMar>
+              <w:top w:type="dxa" w:w="40"/>
+              <w:left w:type="dxa" w:w="0"/>
+              <w:bottom w:type="dxa" w:w="40"/>
+              <w:right w:type="dxa" w:w="200"/>
+            </w:tcMar>
+            <w:vAlign w:val="bottom"/>
+          </w:tcPr>
+          <w:p>
+            <w:pPr>
+              <w:spacing w:after="0"/>
+            </w:pPr>
+            <w:r>
+              <w:rPr>
+                <w:rFonts w:ascii="Calibri" w:cs="Calibri" w:eastAsia="Calibri" w:hAnsi="Calibri"/>
+                <w:i/>
+                <w:iCs/>
+                <w:color w:val="7A7974"/>
+                <w:sz w:val="20"/>
+                <w:szCs w:val="20"/>
+              </w:rPr>
+              <w:t xml:space="preserve">Place Notary Seal Above</w:t>
+            </w:r>
+          </w:p>
+        </w:tc>
+        <w:tc>
+          <w:tcPr>
+            <w:tcW w:type="dxa" w:w="5160"/>
+            <w:tcBorders>
+              <w:top w:val="none" w:color="FFFFFF" w:sz="0"/>
+              <w:left w:val="none" w:color="FFFFFF" w:sz="0"/>
+              <w:bottom w:val="none" w:color="FFFFFF" w:sz="0"/>
+              <w:right w:val="none" w:color="FFFFFF" w:sz="0"/>
+            </w:tcBorders>
+            <w:tcMar>
+              <w:top w:type="dxa" w:w="40"/>
+              <w:left w:type="dxa" w:w="200"/>
+              <w:bottom w:type="dxa" w:w="40"/>
+              <w:right w:type="dxa" w:w="0"/>
+            </w:tcMar>
+          </w:tcPr>
+          <w:p>
+            <w:pPr>
+              <w:spacing w:after="160"/>
+            </w:pPr>
+            <w:r>
+              <w:rPr>
+                <w:rFonts w:ascii="Calibri" w:cs="Calibri" w:eastAsia="Calibri" w:hAnsi="Calibri"/>
+                <w:sz w:val="22"/>
+                <w:szCs w:val="22"/>
+              </w:rPr>
+              <w:t xml:space="preserve">I certify under PENALTY OF PERJURY under the laws of the State of California that the foregoing paragraph is true and correct.</w:t>
+            </w:r>
+          </w:p>
+          <w:p>
+            <w:pPr>
+              <w:spacing w:after="400"/>
+            </w:pPr>
+            <w:r>
+              <w:rPr>
+                <w:rFonts w:ascii="Calibri" w:cs="Calibri" w:eastAsia="Calibri" w:hAnsi="Calibri"/>
+                <w:sz w:val="22"/>
+                <w:szCs w:val="22"/>
+              </w:rPr>
+              <w:t xml:space="preserve">WITNESS my hand and official seal.</w:t>
+            </w:r>
+          </w:p>
+          <w:p>
+            <w:pPr>
+              <w:keepNext/>
+              <w:spacing w:after="20"/>
+            </w:pPr>
+            <w:r>
+              <w:rPr>
+                <w:rFonts w:ascii="Calibri" w:cs="Calibri" w:eastAsia="Calibri" w:hAnsi="Calibri"/>
+                <w:sz w:val="22"/>
+                <w:szCs w:val="22"/>
+              </w:rPr>
+              <w:t xml:space="preserve">Signature </w:t>
+            </w:r>
+            <w:r>
+              <w:rPr>
+                <w:rFonts w:ascii="Calibri" w:cs="Calibri" w:eastAsia="Calibri" w:hAnsi="Calibri"/>
+                <w:sz w:val="22"/>
+                <w:szCs w:val="22"/>
+                <w:u w:val="single" w:color="28251D"/>
+              </w:rPr>
+              <w:t xml:space="preserve">                                      </w:t>
+            </w:r>
+          </w:p>
+          <w:p>
+            <w:pPr>
+              <w:spacing w:after="40"/>
+              <w:jc w:val="center"/>
+            </w:pPr>
+            <w:r>
+              <w:rPr>
+                <w:rFonts w:ascii="Calibri" w:cs="Calibri" w:eastAsia="Calibri" w:hAnsi="Calibri"/>
+                <w:i/>
+                <w:iCs/>
+                <w:color w:val="7A7974"/>
+                <w:sz w:val="18"/>
+                <w:szCs w:val="18"/>
+              </w:rPr>
+              <w:t xml:space="preserve">Signature of Notary Public</w:t>
             </w:r>
           </w:p>
         </w:tc>

</xml_diff>

<commit_message>
Travel consent — NNA-exact ack layout (inline personally-appeared, edge-to-edge signer line) + keepBlockTogether section fixes
</commit_message>
<xml_diff>
--- a/assets/forms/travel_consent_complex.docx
+++ b/assets/forms/travel_consent_complex.docx
@@ -4527,6 +4527,84 @@
         </w:tc>
       </w:tr>
     </w:tbl>
+    <w:p>
+      <w:pPr>
+        <w:keepNext/>
+        <w:spacing w:after="20"/>
+      </w:pPr>
+      <w:r>
+        <w:rPr>
+          <w:rFonts w:ascii="Calibri" w:cs="Calibri" w:eastAsia="Calibri" w:hAnsi="Calibri"/>
+          <w:sz w:val="22"/>
+          <w:szCs w:val="22"/>
+        </w:rPr>
+        <w:t xml:space="preserve">personally appeared </w:t>
+      </w:r>
+      <w:r>
+        <w:rPr>
+          <w:rFonts w:ascii="Calibri" w:cs="Calibri" w:eastAsia="Calibri" w:hAnsi="Calibri"/>
+          <w:sz w:val="22"/>
+          <w:szCs w:val="22"/>
+          <w:u w:val="single" w:color="28251D"/>
+        </w:rPr>
+        <w:t xml:space="preserve">                                                                                                                                                                </w:t>
+      </w:r>
+    </w:p>
+    <w:p>
+      <w:pPr>
+        <w:keepNext/>
+        <w:spacing w:after="40"/>
+        <w:ind w:left="2400"/>
+        <w:jc w:val="center"/>
+      </w:pPr>
+      <w:r>
+        <w:rPr>
+          <w:rFonts w:ascii="Calibri" w:cs="Calibri" w:eastAsia="Calibri" w:hAnsi="Calibri"/>
+          <w:i/>
+          <w:iCs/>
+          <w:color w:val="7A7974"/>
+          <w:sz w:val="18"/>
+          <w:szCs w:val="18"/>
+        </w:rPr>
+        <w:t xml:space="preserve">Name(s) of Signer(s)</w:t>
+      </w:r>
+    </w:p>
+    <w:p>
+      <w:pPr>
+        <w:keepNext/>
+        <w:spacing w:after="40"/>
+      </w:pPr>
+      <w:r>
+        <w:rPr>
+          <w:rFonts w:ascii="Calibri" w:cs="Calibri" w:eastAsia="Calibri" w:hAnsi="Calibri"/>
+          <w:sz w:val="22"/>
+          <w:szCs w:val="22"/>
+          <w:u w:val="single" w:color="28251D"/>
+        </w:rPr>
+        <w:t xml:space="preserve">                                                                                                                                                                                                             </w:t>
+      </w:r>
+      <w:r>
+        <w:rPr>
+          <w:rFonts w:ascii="Calibri" w:cs="Calibri" w:eastAsia="Calibri" w:hAnsi="Calibri"/>
+          <w:sz w:val="22"/>
+          <w:szCs w:val="22"/>
+        </w:rPr>
+        <w:t xml:space="preserve">,</w:t>
+      </w:r>
+    </w:p>
+    <w:p>
+      <w:pPr>
+        <w:spacing w:after="240"/>
+      </w:pPr>
+      <w:r>
+        <w:rPr>
+          <w:rFonts w:ascii="Calibri" w:cs="Calibri" w:eastAsia="Calibri" w:hAnsi="Calibri"/>
+          <w:sz w:val="22"/>
+          <w:szCs w:val="22"/>
+        </w:rPr>
+        <w:t xml:space="preserve">who proved to me on the basis of satisfactory evidence to be the person(s) whose name(s) is/are subscribed to the within instrument, and acknowledged to me that he/she/they executed the same in his/her/their authorized capacity(ies), and that by his/her/their signature(s) on the instrument the person(s), or the entity upon behalf of which the person(s) acted, executed the instrument.</w:t>
+      </w:r>
+    </w:p>
     <w:tbl>
       <w:tblPr>
         <w:tblW w:type="dxa" w:w="9360"/>
@@ -4546,137 +4624,7 @@
       <w:tr>
         <w:trPr>
           <w:cantSplit/>
-        </w:trPr>
-        <w:tc>
-          <w:tcPr>
-            <w:tcW w:type="dxa" w:w="2400"/>
-            <w:tcBorders>
-              <w:top w:val="none" w:color="FFFFFF" w:sz="0"/>
-              <w:left w:val="none" w:color="FFFFFF" w:sz="0"/>
-              <w:bottom w:val="none" w:color="FFFFFF" w:sz="0"/>
-              <w:right w:val="none" w:color="FFFFFF" w:sz="0"/>
-            </w:tcBorders>
-            <w:tcMar>
-              <w:top w:type="dxa" w:w="0"/>
-              <w:left w:type="dxa" w:w="0"/>
-              <w:bottom w:type="dxa" w:w="0"/>
-              <w:right w:type="dxa" w:w="120"/>
-            </w:tcMar>
-            <w:vAlign w:val="bottom"/>
-          </w:tcPr>
-          <w:p>
-            <w:pPr>
-              <w:keepNext/>
-              <w:spacing w:after="20"/>
-            </w:pPr>
-            <w:r>
-              <w:rPr>
-                <w:rFonts w:ascii="Calibri" w:cs="Calibri" w:eastAsia="Calibri" w:hAnsi="Calibri"/>
-                <w:sz w:val="22"/>
-                <w:szCs w:val="22"/>
-              </w:rPr>
-              <w:t xml:space="preserve">Personally appeared</w:t>
-            </w:r>
-          </w:p>
-        </w:tc>
-        <w:tc>
-          <w:tcPr>
-            <w:tcW w:type="dxa" w:w="6960"/>
-            <w:tcBorders>
-              <w:top w:val="none" w:color="FFFFFF" w:sz="0"/>
-              <w:left w:val="none" w:color="FFFFFF" w:sz="0"/>
-              <w:bottom w:val="none" w:color="FFFFFF" w:sz="0"/>
-              <w:right w:val="none" w:color="FFFFFF" w:sz="0"/>
-            </w:tcBorders>
-            <w:tcMar>
-              <w:top w:type="dxa" w:w="0"/>
-              <w:left w:type="dxa" w:w="120"/>
-              <w:bottom w:type="dxa" w:w="0"/>
-              <w:right w:type="dxa" w:w="0"/>
-            </w:tcMar>
-          </w:tcPr>
-          <w:p>
-            <w:pPr>
-              <w:keepNext/>
-              <w:spacing w:after="20"/>
-            </w:pPr>
-            <w:r>
-              <w:rPr>
-                <w:rFonts w:ascii="Calibri" w:cs="Calibri" w:eastAsia="Calibri" w:hAnsi="Calibri"/>
-                <w:sz w:val="22"/>
-                <w:szCs w:val="22"/>
-                <w:u w:val="single" w:color="28251D"/>
-              </w:rPr>
-              <w:t xml:space="preserve">                                                                </w:t>
-            </w:r>
-          </w:p>
-          <w:p>
-            <w:pPr>
-              <w:spacing w:after="40"/>
-              <w:jc w:val="center"/>
-            </w:pPr>
-            <w:r>
-              <w:rPr>
-                <w:rFonts w:ascii="Calibri" w:cs="Calibri" w:eastAsia="Calibri" w:hAnsi="Calibri"/>
-                <w:i/>
-                <w:iCs/>
-                <w:color w:val="7A7974"/>
-                <w:sz w:val="18"/>
-                <w:szCs w:val="18"/>
-              </w:rPr>
-              <w:t xml:space="preserve">Name(s) of Signer(s)</w:t>
-            </w:r>
-          </w:p>
-        </w:tc>
-      </w:tr>
-    </w:tbl>
-    <w:p>
-      <w:pPr>
-        <w:spacing w:after="240"/>
-      </w:pPr>
-      <w:r>
-        <w:rPr>
-          <w:rFonts w:ascii="Calibri" w:cs="Calibri" w:eastAsia="Calibri" w:hAnsi="Calibri"/>
-          <w:sz w:val="22"/>
-          <w:szCs w:val="22"/>
-          <w:u w:val="single" w:color="28251D"/>
-        </w:rPr>
-        <w:t xml:space="preserve">                                                                                                    </w:t>
-      </w:r>
-    </w:p>
-    <w:p>
-      <w:pPr>
-        <w:spacing w:after="240"/>
-      </w:pPr>
-      <w:r>
-        <w:rPr>
-          <w:rFonts w:ascii="Calibri" w:cs="Calibri" w:eastAsia="Calibri" w:hAnsi="Calibri"/>
-          <w:sz w:val="22"/>
-          <w:szCs w:val="22"/>
-        </w:rPr>
-        <w:t xml:space="preserve">who proved to me on the basis of satisfactory evidence to be the person(s) whose name(s) is/are subscribed to the within instrument, and acknowledged to me that he/she/they executed the same in his/her/their authorized capacity(ies), and that by his/her/their signature(s) on the instrument the person(s), or the entity upon behalf of which the person(s) acted, executed the instrument.</w:t>
-      </w:r>
-    </w:p>
-    <w:tbl>
-      <w:tblPr>
-        <w:tblW w:type="dxa" w:w="9360"/>
-        <w:tblBorders>
-          <w:top w:val="none" w:color="FFFFFF" w:sz="0"/>
-          <w:left w:val="none" w:color="FFFFFF" w:sz="0"/>
-          <w:bottom w:val="none" w:color="FFFFFF" w:sz="0"/>
-          <w:right w:val="none" w:color="FFFFFF" w:sz="0"/>
-          <w:insideH w:val="none" w:color="FFFFFF" w:sz="0"/>
-          <w:insideV w:val="none" w:color="FFFFFF" w:sz="0"/>
-        </w:tblBorders>
-      </w:tblPr>
-      <w:tblGrid>
-        <w:gridCol w:w="100"/>
-        <w:gridCol w:w="100"/>
-      </w:tblGrid>
-      <w:tr>
-        <w:trPr>
-          <w:cantSplit/>
-          <w:trHeight w:val="2400" w:hRule="atLeast"/>
+          <w:trHeight w:val="2200" w:hRule="atLeast"/>
         </w:trPr>
         <w:tc>
           <w:tcPr>
@@ -4684,16 +4632,15 @@
             <w:tcBorders>
               <w:top w:val="none" w:color="FFFFFF" w:sz="0"/>
               <w:left w:val="none" w:color="FFFFFF" w:sz="0"/>
-              <w:bottom w:val="none" w:color="FFFFFF" w:sz="0"/>
+              <w:bottom w:val="single" w:color="28251D" w:sz="6" w:space="0"/>
               <w:right w:val="none" w:color="FFFFFF" w:sz="0"/>
             </w:tcBorders>
             <w:tcMar>
-              <w:top w:type="dxa" w:w="40"/>
+              <w:top w:type="dxa" w:w="0"/>
               <w:left w:type="dxa" w:w="0"/>
-              <w:bottom w:type="dxa" w:w="40"/>
+              <w:bottom w:type="dxa" w:w="0"/>
               <w:right w:type="dxa" w:w="200"/>
             </w:tcMar>
-            <w:vAlign w:val="bottom"/>
           </w:tcPr>
           <w:p>
             <w:pPr>
@@ -4702,13 +4649,10 @@
             <w:r>
               <w:rPr>
                 <w:rFonts w:ascii="Calibri" w:cs="Calibri" w:eastAsia="Calibri" w:hAnsi="Calibri"/>
-                <w:i/>
-                <w:iCs/>
-                <w:color w:val="7A7974"/>
-                <w:sz w:val="20"/>
-                <w:szCs w:val="20"/>
+                <w:sz w:val="22"/>
+                <w:szCs w:val="22"/>
               </w:rPr>
-              <w:t xml:space="preserve">Place Notary Seal Above</w:t>
+              <w:t xml:space="preserve"/>
             </w:r>
           </w:p>
         </w:tc>
@@ -4722,9 +4666,9 @@
               <w:right w:val="none" w:color="FFFFFF" w:sz="0"/>
             </w:tcBorders>
             <w:tcMar>
-              <w:top w:type="dxa" w:w="40"/>
+              <w:top w:type="dxa" w:w="0"/>
               <w:left w:type="dxa" w:w="200"/>
-              <w:bottom w:type="dxa" w:w="40"/>
+              <w:bottom w:type="dxa" w:w="0"/>
               <w:right w:type="dxa" w:w="0"/>
             </w:tcMar>
           </w:tcPr>
@@ -4797,6 +4741,23 @@
         </w:tc>
       </w:tr>
     </w:tbl>
+    <w:p>
+      <w:pPr>
+        <w:spacing w:after="0" w:before="40"/>
+        <w:ind w:left="720"/>
+      </w:pPr>
+      <w:r>
+        <w:rPr>
+          <w:rFonts w:ascii="Calibri" w:cs="Calibri" w:eastAsia="Calibri" w:hAnsi="Calibri"/>
+          <w:i/>
+          <w:iCs/>
+          <w:color w:val="7A7974"/>
+          <w:sz w:val="20"/>
+          <w:szCs w:val="20"/>
+        </w:rPr>
+        <w:t xml:space="preserve">Place Notary Seal Above</w:t>
+      </w:r>
+    </w:p>
     <w:p>
       <w:r>
         <w:br w:type="page"/>
@@ -5239,6 +5200,84 @@
         </w:tc>
       </w:tr>
     </w:tbl>
+    <w:p>
+      <w:pPr>
+        <w:keepNext/>
+        <w:spacing w:after="20"/>
+      </w:pPr>
+      <w:r>
+        <w:rPr>
+          <w:rFonts w:ascii="Calibri" w:cs="Calibri" w:eastAsia="Calibri" w:hAnsi="Calibri"/>
+          <w:sz w:val="22"/>
+          <w:szCs w:val="22"/>
+        </w:rPr>
+        <w:t xml:space="preserve">personally appeared </w:t>
+      </w:r>
+      <w:r>
+        <w:rPr>
+          <w:rFonts w:ascii="Calibri" w:cs="Calibri" w:eastAsia="Calibri" w:hAnsi="Calibri"/>
+          <w:sz w:val="22"/>
+          <w:szCs w:val="22"/>
+          <w:u w:val="single" w:color="28251D"/>
+        </w:rPr>
+        <w:t xml:space="preserve">                                                                                                                                                                </w:t>
+      </w:r>
+    </w:p>
+    <w:p>
+      <w:pPr>
+        <w:keepNext/>
+        <w:spacing w:after="40"/>
+        <w:ind w:left="2400"/>
+        <w:jc w:val="center"/>
+      </w:pPr>
+      <w:r>
+        <w:rPr>
+          <w:rFonts w:ascii="Calibri" w:cs="Calibri" w:eastAsia="Calibri" w:hAnsi="Calibri"/>
+          <w:i/>
+          <w:iCs/>
+          <w:color w:val="7A7974"/>
+          <w:sz w:val="18"/>
+          <w:szCs w:val="18"/>
+        </w:rPr>
+        <w:t xml:space="preserve">Name(s) of Signer(s)</w:t>
+      </w:r>
+    </w:p>
+    <w:p>
+      <w:pPr>
+        <w:keepNext/>
+        <w:spacing w:after="40"/>
+      </w:pPr>
+      <w:r>
+        <w:rPr>
+          <w:rFonts w:ascii="Calibri" w:cs="Calibri" w:eastAsia="Calibri" w:hAnsi="Calibri"/>
+          <w:sz w:val="22"/>
+          <w:szCs w:val="22"/>
+          <w:u w:val="single" w:color="28251D"/>
+        </w:rPr>
+        <w:t xml:space="preserve">                                                                                                                                                                                                             </w:t>
+      </w:r>
+      <w:r>
+        <w:rPr>
+          <w:rFonts w:ascii="Calibri" w:cs="Calibri" w:eastAsia="Calibri" w:hAnsi="Calibri"/>
+          <w:sz w:val="22"/>
+          <w:szCs w:val="22"/>
+        </w:rPr>
+        <w:t xml:space="preserve">,</w:t>
+      </w:r>
+    </w:p>
+    <w:p>
+      <w:pPr>
+        <w:spacing w:after="240"/>
+      </w:pPr>
+      <w:r>
+        <w:rPr>
+          <w:rFonts w:ascii="Calibri" w:cs="Calibri" w:eastAsia="Calibri" w:hAnsi="Calibri"/>
+          <w:sz w:val="22"/>
+          <w:szCs w:val="22"/>
+        </w:rPr>
+        <w:t xml:space="preserve">who proved to me on the basis of satisfactory evidence to be the person(s) whose name(s) is/are subscribed to the within instrument, and acknowledged to me that he/she/they executed the same in his/her/their authorized capacity(ies), and that by his/her/their signature(s) on the instrument the person(s), or the entity upon behalf of which the person(s) acted, executed the instrument.</w:t>
+      </w:r>
+    </w:p>
     <w:tbl>
       <w:tblPr>
         <w:tblW w:type="dxa" w:w="9360"/>
@@ -5258,137 +5297,7 @@
       <w:tr>
         <w:trPr>
           <w:cantSplit/>
-        </w:trPr>
-        <w:tc>
-          <w:tcPr>
-            <w:tcW w:type="dxa" w:w="2400"/>
-            <w:tcBorders>
-              <w:top w:val="none" w:color="FFFFFF" w:sz="0"/>
-              <w:left w:val="none" w:color="FFFFFF" w:sz="0"/>
-              <w:bottom w:val="none" w:color="FFFFFF" w:sz="0"/>
-              <w:right w:val="none" w:color="FFFFFF" w:sz="0"/>
-            </w:tcBorders>
-            <w:tcMar>
-              <w:top w:type="dxa" w:w="0"/>
-              <w:left w:type="dxa" w:w="0"/>
-              <w:bottom w:type="dxa" w:w="0"/>
-              <w:right w:type="dxa" w:w="120"/>
-            </w:tcMar>
-            <w:vAlign w:val="bottom"/>
-          </w:tcPr>
-          <w:p>
-            <w:pPr>
-              <w:keepNext/>
-              <w:spacing w:after="20"/>
-            </w:pPr>
-            <w:r>
-              <w:rPr>
-                <w:rFonts w:ascii="Calibri" w:cs="Calibri" w:eastAsia="Calibri" w:hAnsi="Calibri"/>
-                <w:sz w:val="22"/>
-                <w:szCs w:val="22"/>
-              </w:rPr>
-              <w:t xml:space="preserve">Personally appeared</w:t>
-            </w:r>
-          </w:p>
-        </w:tc>
-        <w:tc>
-          <w:tcPr>
-            <w:tcW w:type="dxa" w:w="6960"/>
-            <w:tcBorders>
-              <w:top w:val="none" w:color="FFFFFF" w:sz="0"/>
-              <w:left w:val="none" w:color="FFFFFF" w:sz="0"/>
-              <w:bottom w:val="none" w:color="FFFFFF" w:sz="0"/>
-              <w:right w:val="none" w:color="FFFFFF" w:sz="0"/>
-            </w:tcBorders>
-            <w:tcMar>
-              <w:top w:type="dxa" w:w="0"/>
-              <w:left w:type="dxa" w:w="120"/>
-              <w:bottom w:type="dxa" w:w="0"/>
-              <w:right w:type="dxa" w:w="0"/>
-            </w:tcMar>
-          </w:tcPr>
-          <w:p>
-            <w:pPr>
-              <w:keepNext/>
-              <w:spacing w:after="20"/>
-            </w:pPr>
-            <w:r>
-              <w:rPr>
-                <w:rFonts w:ascii="Calibri" w:cs="Calibri" w:eastAsia="Calibri" w:hAnsi="Calibri"/>
-                <w:sz w:val="22"/>
-                <w:szCs w:val="22"/>
-                <w:u w:val="single" w:color="28251D"/>
-              </w:rPr>
-              <w:t xml:space="preserve">                                                                </w:t>
-            </w:r>
-          </w:p>
-          <w:p>
-            <w:pPr>
-              <w:spacing w:after="40"/>
-              <w:jc w:val="center"/>
-            </w:pPr>
-            <w:r>
-              <w:rPr>
-                <w:rFonts w:ascii="Calibri" w:cs="Calibri" w:eastAsia="Calibri" w:hAnsi="Calibri"/>
-                <w:i/>
-                <w:iCs/>
-                <w:color w:val="7A7974"/>
-                <w:sz w:val="18"/>
-                <w:szCs w:val="18"/>
-              </w:rPr>
-              <w:t xml:space="preserve">Name(s) of Signer(s)</w:t>
-            </w:r>
-          </w:p>
-        </w:tc>
-      </w:tr>
-    </w:tbl>
-    <w:p>
-      <w:pPr>
-        <w:spacing w:after="240"/>
-      </w:pPr>
-      <w:r>
-        <w:rPr>
-          <w:rFonts w:ascii="Calibri" w:cs="Calibri" w:eastAsia="Calibri" w:hAnsi="Calibri"/>
-          <w:sz w:val="22"/>
-          <w:szCs w:val="22"/>
-          <w:u w:val="single" w:color="28251D"/>
-        </w:rPr>
-        <w:t xml:space="preserve">                                                                                                    </w:t>
-      </w:r>
-    </w:p>
-    <w:p>
-      <w:pPr>
-        <w:spacing w:after="240"/>
-      </w:pPr>
-      <w:r>
-        <w:rPr>
-          <w:rFonts w:ascii="Calibri" w:cs="Calibri" w:eastAsia="Calibri" w:hAnsi="Calibri"/>
-          <w:sz w:val="22"/>
-          <w:szCs w:val="22"/>
-        </w:rPr>
-        <w:t xml:space="preserve">who proved to me on the basis of satisfactory evidence to be the person(s) whose name(s) is/are subscribed to the within instrument, and acknowledged to me that he/she/they executed the same in his/her/their authorized capacity(ies), and that by his/her/their signature(s) on the instrument the person(s), or the entity upon behalf of which the person(s) acted, executed the instrument.</w:t>
-      </w:r>
-    </w:p>
-    <w:tbl>
-      <w:tblPr>
-        <w:tblW w:type="dxa" w:w="9360"/>
-        <w:tblBorders>
-          <w:top w:val="none" w:color="FFFFFF" w:sz="0"/>
-          <w:left w:val="none" w:color="FFFFFF" w:sz="0"/>
-          <w:bottom w:val="none" w:color="FFFFFF" w:sz="0"/>
-          <w:right w:val="none" w:color="FFFFFF" w:sz="0"/>
-          <w:insideH w:val="none" w:color="FFFFFF" w:sz="0"/>
-          <w:insideV w:val="none" w:color="FFFFFF" w:sz="0"/>
-        </w:tblBorders>
-      </w:tblPr>
-      <w:tblGrid>
-        <w:gridCol w:w="100"/>
-        <w:gridCol w:w="100"/>
-      </w:tblGrid>
-      <w:tr>
-        <w:trPr>
-          <w:cantSplit/>
-          <w:trHeight w:val="2400" w:hRule="atLeast"/>
+          <w:trHeight w:val="2200" w:hRule="atLeast"/>
         </w:trPr>
         <w:tc>
           <w:tcPr>
@@ -5396,16 +5305,15 @@
             <w:tcBorders>
               <w:top w:val="none" w:color="FFFFFF" w:sz="0"/>
               <w:left w:val="none" w:color="FFFFFF" w:sz="0"/>
-              <w:bottom w:val="none" w:color="FFFFFF" w:sz="0"/>
+              <w:bottom w:val="single" w:color="28251D" w:sz="6" w:space="0"/>
               <w:right w:val="none" w:color="FFFFFF" w:sz="0"/>
             </w:tcBorders>
             <w:tcMar>
-              <w:top w:type="dxa" w:w="40"/>
+              <w:top w:type="dxa" w:w="0"/>
               <w:left w:type="dxa" w:w="0"/>
-              <w:bottom w:type="dxa" w:w="40"/>
+              <w:bottom w:type="dxa" w:w="0"/>
               <w:right w:type="dxa" w:w="200"/>
             </w:tcMar>
-            <w:vAlign w:val="bottom"/>
           </w:tcPr>
           <w:p>
             <w:pPr>
@@ -5414,13 +5322,10 @@
             <w:r>
               <w:rPr>
                 <w:rFonts w:ascii="Calibri" w:cs="Calibri" w:eastAsia="Calibri" w:hAnsi="Calibri"/>
-                <w:i/>
-                <w:iCs/>
-                <w:color w:val="7A7974"/>
-                <w:sz w:val="20"/>
-                <w:szCs w:val="20"/>
+                <w:sz w:val="22"/>
+                <w:szCs w:val="22"/>
               </w:rPr>
-              <w:t xml:space="preserve">Place Notary Seal Above</w:t>
+              <w:t xml:space="preserve"/>
             </w:r>
           </w:p>
         </w:tc>
@@ -5434,9 +5339,9 @@
               <w:right w:val="none" w:color="FFFFFF" w:sz="0"/>
             </w:tcBorders>
             <w:tcMar>
-              <w:top w:type="dxa" w:w="40"/>
+              <w:top w:type="dxa" w:w="0"/>
               <w:left w:type="dxa" w:w="200"/>
-              <w:bottom w:type="dxa" w:w="40"/>
+              <w:bottom w:type="dxa" w:w="0"/>
               <w:right w:type="dxa" w:w="0"/>
             </w:tcMar>
           </w:tcPr>
@@ -5509,6 +5414,23 @@
         </w:tc>
       </w:tr>
     </w:tbl>
+    <w:p>
+      <w:pPr>
+        <w:spacing w:after="0" w:before="40"/>
+        <w:ind w:left="720"/>
+      </w:pPr>
+      <w:r>
+        <w:rPr>
+          <w:rFonts w:ascii="Calibri" w:cs="Calibri" w:eastAsia="Calibri" w:hAnsi="Calibri"/>
+          <w:i/>
+          <w:iCs/>
+          <w:color w:val="7A7974"/>
+          <w:sz w:val="20"/>
+          <w:szCs w:val="20"/>
+        </w:rPr>
+        <w:t xml:space="preserve">Place Notary Seal Above</w:t>
+      </w:r>
+    </w:p>
     <w:sectPr>
       <w:footerReference w:type="default" r:id="rId7"/>
       <w:pgSz w:w="11906" w:h="16838" w:orient="portrait"/>

</xml_diff>

<commit_message>
Travel consent ack — extend officer/date lines to right margin, drop venue parens, add border to disclaimer
</commit_message>
<xml_diff>
--- a/assets/forms/travel_consent_complex.docx
+++ b/assets/forms/travel_consent_complex.docx
@@ -4213,6 +4213,12 @@
     </w:tbl>
     <w:p>
       <w:pPr>
+        <w:pBdr>
+          <w:top w:val="single" w:color="28251D" w:sz="6" w:space="8"/>
+          <w:bottom w:val="single" w:color="28251D" w:sz="6" w:space="8"/>
+          <w:left w:val="single" w:color="28251D" w:sz="6" w:space="8"/>
+          <w:right w:val="single" w:color="28251D" w:sz="6" w:space="8"/>
+        </w:pBdr>
         <w:spacing w:after="240" w:before="60"/>
       </w:pPr>
       <w:r>
@@ -4227,162 +4233,41 @@
         <w:t xml:space="preserve">A notary public or other officer completing this certificate verifies only the identity of the individual who signed the document to which this certificate is attached, and not the truthfulness, accuracy, or validity of that document.</w:t>
       </w:r>
     </w:p>
-    <w:tbl>
-      <w:tblPr>
-        <w:tblW w:type="dxa" w:w="9360"/>
-        <w:tblBorders>
-          <w:top w:val="none" w:color="FFFFFF" w:sz="0"/>
-          <w:left w:val="none" w:color="FFFFFF" w:sz="0"/>
-          <w:bottom w:val="none" w:color="FFFFFF" w:sz="0"/>
-          <w:right w:val="none" w:color="FFFFFF" w:sz="0"/>
-          <w:insideH w:val="none" w:color="FFFFFF" w:sz="0"/>
-          <w:insideV w:val="none" w:color="FFFFFF" w:sz="0"/>
-        </w:tblBorders>
-      </w:tblPr>
-      <w:tblGrid>
-        <w:gridCol w:w="100"/>
-        <w:gridCol w:w="100"/>
-      </w:tblGrid>
-      <w:tr>
-        <w:trPr>
-          <w:cantSplit/>
-        </w:trPr>
-        <w:tc>
-          <w:tcPr>
-            <w:tcW w:type="dxa" w:w="4680"/>
-            <w:tcBorders>
-              <w:top w:val="none" w:color="FFFFFF" w:sz="0"/>
-              <w:left w:val="none" w:color="FFFFFF" w:sz="0"/>
-              <w:bottom w:val="none" w:color="FFFFFF" w:sz="0"/>
-              <w:right w:val="none" w:color="FFFFFF" w:sz="0"/>
-            </w:tcBorders>
-            <w:tcMar>
-              <w:top w:type="dxa" w:w="0"/>
-              <w:left w:type="dxa" w:w="0"/>
-              <w:bottom w:type="dxa" w:w="0"/>
-              <w:right w:type="dxa" w:w="0"/>
-            </w:tcMar>
-          </w:tcPr>
-          <w:p>
-            <w:pPr>
-              <w:spacing w:after="160"/>
-            </w:pPr>
-            <w:r>
-              <w:rPr>
-                <w:rFonts w:ascii="Calibri" w:cs="Calibri" w:eastAsia="Calibri" w:hAnsi="Calibri"/>
-                <w:sz w:val="22"/>
-                <w:szCs w:val="22"/>
-              </w:rPr>
-              <w:t xml:space="preserve">State of California</w:t>
-            </w:r>
-          </w:p>
-        </w:tc>
-        <w:tc>
-          <w:tcPr>
-            <w:tcW w:type="dxa" w:w="4680"/>
-            <w:tcBorders>
-              <w:top w:val="none" w:color="FFFFFF" w:sz="0"/>
-              <w:left w:val="none" w:color="FFFFFF" w:sz="0"/>
-              <w:bottom w:val="none" w:color="FFFFFF" w:sz="0"/>
-              <w:right w:val="none" w:color="FFFFFF" w:sz="0"/>
-            </w:tcBorders>
-            <w:tcMar>
-              <w:top w:type="dxa" w:w="0"/>
-              <w:left w:type="dxa" w:w="0"/>
-              <w:bottom w:type="dxa" w:w="0"/>
-              <w:right w:type="dxa" w:w="0"/>
-            </w:tcMar>
-          </w:tcPr>
-          <w:p>
-            <w:pPr>
-              <w:spacing w:after="160"/>
-            </w:pPr>
-            <w:r>
-              <w:rPr>
-                <w:rFonts w:ascii="Calibri" w:cs="Calibri" w:eastAsia="Calibri" w:hAnsi="Calibri"/>
-                <w:sz w:val="22"/>
-                <w:szCs w:val="22"/>
-              </w:rPr>
-              <w:t xml:space="preserve">)</w:t>
-            </w:r>
-          </w:p>
-        </w:tc>
-      </w:tr>
-      <w:tr>
-        <w:trPr>
-          <w:cantSplit/>
-        </w:trPr>
-        <w:tc>
-          <w:tcPr>
-            <w:tcW w:type="dxa" w:w="4680"/>
-            <w:tcBorders>
-              <w:top w:val="none" w:color="FFFFFF" w:sz="0"/>
-              <w:left w:val="none" w:color="FFFFFF" w:sz="0"/>
-              <w:bottom w:val="none" w:color="FFFFFF" w:sz="0"/>
-              <w:right w:val="none" w:color="FFFFFF" w:sz="0"/>
-            </w:tcBorders>
-            <w:tcMar>
-              <w:top w:type="dxa" w:w="0"/>
-              <w:left w:type="dxa" w:w="0"/>
-              <w:bottom w:type="dxa" w:w="0"/>
-              <w:right w:type="dxa" w:w="0"/>
-            </w:tcMar>
-          </w:tcPr>
-          <w:p>
-            <w:pPr>
-              <w:spacing w:after="200"/>
-            </w:pPr>
-            <w:r>
-              <w:rPr>
-                <w:rFonts w:ascii="Calibri" w:cs="Calibri" w:eastAsia="Calibri" w:hAnsi="Calibri"/>
-                <w:sz w:val="22"/>
-                <w:szCs w:val="22"/>
-              </w:rPr>
-              <w:t xml:space="preserve">County of </w:t>
-            </w:r>
-            <w:r>
-              <w:rPr>
-                <w:rFonts w:ascii="Calibri" w:cs="Calibri" w:eastAsia="Calibri" w:hAnsi="Calibri"/>
-                <w:sz w:val="22"/>
-                <w:szCs w:val="22"/>
-                <w:u w:val="single" w:color="28251D"/>
-              </w:rPr>
-              <w:t xml:space="preserve">                                        </w:t>
-            </w:r>
-          </w:p>
-        </w:tc>
-        <w:tc>
-          <w:tcPr>
-            <w:tcW w:type="dxa" w:w="4680"/>
-            <w:tcBorders>
-              <w:top w:val="none" w:color="FFFFFF" w:sz="0"/>
-              <w:left w:val="none" w:color="FFFFFF" w:sz="0"/>
-              <w:bottom w:val="none" w:color="FFFFFF" w:sz="0"/>
-              <w:right w:val="none" w:color="FFFFFF" w:sz="0"/>
-            </w:tcBorders>
-            <w:tcMar>
-              <w:top w:type="dxa" w:w="0"/>
-              <w:left w:type="dxa" w:w="0"/>
-              <w:bottom w:type="dxa" w:w="0"/>
-              <w:right w:type="dxa" w:w="0"/>
-            </w:tcMar>
-          </w:tcPr>
-          <w:p>
-            <w:pPr>
-              <w:spacing w:after="200"/>
-            </w:pPr>
-            <w:r>
-              <w:rPr>
-                <w:rFonts w:ascii="Calibri" w:cs="Calibri" w:eastAsia="Calibri" w:hAnsi="Calibri"/>
-                <w:sz w:val="22"/>
-                <w:szCs w:val="22"/>
-              </w:rPr>
-              <w:t xml:space="preserve">)</w:t>
-            </w:r>
-          </w:p>
-        </w:tc>
-      </w:tr>
-    </w:tbl>
+    <w:p>
+      <w:pPr>
+        <w:spacing w:after="160"/>
+      </w:pPr>
+      <w:r>
+        <w:rPr>
+          <w:rFonts w:ascii="Calibri" w:cs="Calibri" w:eastAsia="Calibri" w:hAnsi="Calibri"/>
+          <w:sz w:val="22"/>
+          <w:szCs w:val="22"/>
+        </w:rPr>
+        <w:t xml:space="preserve">State of California</w:t>
+      </w:r>
+    </w:p>
+    <w:p>
+      <w:pPr>
+        <w:spacing w:after="200"/>
+      </w:pPr>
+      <w:r>
+        <w:rPr>
+          <w:rFonts w:ascii="Calibri" w:cs="Calibri" w:eastAsia="Calibri" w:hAnsi="Calibri"/>
+          <w:sz w:val="22"/>
+          <w:szCs w:val="22"/>
+        </w:rPr>
+        <w:t xml:space="preserve">County of </w:t>
+      </w:r>
+      <w:r>
+        <w:rPr>
+          <w:rFonts w:ascii="Calibri" w:cs="Calibri" w:eastAsia="Calibri" w:hAnsi="Calibri"/>
+          <w:sz w:val="22"/>
+          <w:szCs w:val="22"/>
+          <w:u w:val="single" w:color="28251D"/>
+        </w:rPr>
+        <w:t xml:space="preserve">                                        </w:t>
+      </w:r>
+    </w:p>
     <w:tbl>
       <w:tblPr>
         <w:tblW w:type="dxa" w:w="9360"/>
@@ -4439,7 +4324,7 @@
                 <w:szCs w:val="22"/>
                 <w:u w:val="single" w:color="28251D"/>
               </w:rPr>
-              <w:t xml:space="preserve">                      </w:t>
+              <w:t xml:space="preserve">                                  </w:t>
             </w:r>
             <w:r>
               <w:rPr>
@@ -4496,7 +4381,7 @@
                 <w:szCs w:val="22"/>
                 <w:u w:val="single" w:color="28251D"/>
               </w:rPr>
-              <w:t xml:space="preserve">                                                          </w:t>
+              <w:t xml:space="preserve">                                                                                        </w:t>
             </w:r>
             <w:r>
               <w:rPr>
@@ -4886,6 +4771,12 @@
     </w:tbl>
     <w:p>
       <w:pPr>
+        <w:pBdr>
+          <w:top w:val="single" w:color="28251D" w:sz="6" w:space="8"/>
+          <w:bottom w:val="single" w:color="28251D" w:sz="6" w:space="8"/>
+          <w:left w:val="single" w:color="28251D" w:sz="6" w:space="8"/>
+          <w:right w:val="single" w:color="28251D" w:sz="6" w:space="8"/>
+        </w:pBdr>
         <w:spacing w:after="240" w:before="60"/>
       </w:pPr>
       <w:r>
@@ -4900,162 +4791,41 @@
         <w:t xml:space="preserve">A notary public or other officer completing this certificate verifies only the identity of the individual who signed the document to which this certificate is attached, and not the truthfulness, accuracy, or validity of that document.</w:t>
       </w:r>
     </w:p>
-    <w:tbl>
-      <w:tblPr>
-        <w:tblW w:type="dxa" w:w="9360"/>
-        <w:tblBorders>
-          <w:top w:val="none" w:color="FFFFFF" w:sz="0"/>
-          <w:left w:val="none" w:color="FFFFFF" w:sz="0"/>
-          <w:bottom w:val="none" w:color="FFFFFF" w:sz="0"/>
-          <w:right w:val="none" w:color="FFFFFF" w:sz="0"/>
-          <w:insideH w:val="none" w:color="FFFFFF" w:sz="0"/>
-          <w:insideV w:val="none" w:color="FFFFFF" w:sz="0"/>
-        </w:tblBorders>
-      </w:tblPr>
-      <w:tblGrid>
-        <w:gridCol w:w="100"/>
-        <w:gridCol w:w="100"/>
-      </w:tblGrid>
-      <w:tr>
-        <w:trPr>
-          <w:cantSplit/>
-        </w:trPr>
-        <w:tc>
-          <w:tcPr>
-            <w:tcW w:type="dxa" w:w="4680"/>
-            <w:tcBorders>
-              <w:top w:val="none" w:color="FFFFFF" w:sz="0"/>
-              <w:left w:val="none" w:color="FFFFFF" w:sz="0"/>
-              <w:bottom w:val="none" w:color="FFFFFF" w:sz="0"/>
-              <w:right w:val="none" w:color="FFFFFF" w:sz="0"/>
-            </w:tcBorders>
-            <w:tcMar>
-              <w:top w:type="dxa" w:w="0"/>
-              <w:left w:type="dxa" w:w="0"/>
-              <w:bottom w:type="dxa" w:w="0"/>
-              <w:right w:type="dxa" w:w="0"/>
-            </w:tcMar>
-          </w:tcPr>
-          <w:p>
-            <w:pPr>
-              <w:spacing w:after="160"/>
-            </w:pPr>
-            <w:r>
-              <w:rPr>
-                <w:rFonts w:ascii="Calibri" w:cs="Calibri" w:eastAsia="Calibri" w:hAnsi="Calibri"/>
-                <w:sz w:val="22"/>
-                <w:szCs w:val="22"/>
-              </w:rPr>
-              <w:t xml:space="preserve">State of California</w:t>
-            </w:r>
-          </w:p>
-        </w:tc>
-        <w:tc>
-          <w:tcPr>
-            <w:tcW w:type="dxa" w:w="4680"/>
-            <w:tcBorders>
-              <w:top w:val="none" w:color="FFFFFF" w:sz="0"/>
-              <w:left w:val="none" w:color="FFFFFF" w:sz="0"/>
-              <w:bottom w:val="none" w:color="FFFFFF" w:sz="0"/>
-              <w:right w:val="none" w:color="FFFFFF" w:sz="0"/>
-            </w:tcBorders>
-            <w:tcMar>
-              <w:top w:type="dxa" w:w="0"/>
-              <w:left w:type="dxa" w:w="0"/>
-              <w:bottom w:type="dxa" w:w="0"/>
-              <w:right w:type="dxa" w:w="0"/>
-            </w:tcMar>
-          </w:tcPr>
-          <w:p>
-            <w:pPr>
-              <w:spacing w:after="160"/>
-            </w:pPr>
-            <w:r>
-              <w:rPr>
-                <w:rFonts w:ascii="Calibri" w:cs="Calibri" w:eastAsia="Calibri" w:hAnsi="Calibri"/>
-                <w:sz w:val="22"/>
-                <w:szCs w:val="22"/>
-              </w:rPr>
-              <w:t xml:space="preserve">)</w:t>
-            </w:r>
-          </w:p>
-        </w:tc>
-      </w:tr>
-      <w:tr>
-        <w:trPr>
-          <w:cantSplit/>
-        </w:trPr>
-        <w:tc>
-          <w:tcPr>
-            <w:tcW w:type="dxa" w:w="4680"/>
-            <w:tcBorders>
-              <w:top w:val="none" w:color="FFFFFF" w:sz="0"/>
-              <w:left w:val="none" w:color="FFFFFF" w:sz="0"/>
-              <w:bottom w:val="none" w:color="FFFFFF" w:sz="0"/>
-              <w:right w:val="none" w:color="FFFFFF" w:sz="0"/>
-            </w:tcBorders>
-            <w:tcMar>
-              <w:top w:type="dxa" w:w="0"/>
-              <w:left w:type="dxa" w:w="0"/>
-              <w:bottom w:type="dxa" w:w="0"/>
-              <w:right w:type="dxa" w:w="0"/>
-            </w:tcMar>
-          </w:tcPr>
-          <w:p>
-            <w:pPr>
-              <w:spacing w:after="200"/>
-            </w:pPr>
-            <w:r>
-              <w:rPr>
-                <w:rFonts w:ascii="Calibri" w:cs="Calibri" w:eastAsia="Calibri" w:hAnsi="Calibri"/>
-                <w:sz w:val="22"/>
-                <w:szCs w:val="22"/>
-              </w:rPr>
-              <w:t xml:space="preserve">County of </w:t>
-            </w:r>
-            <w:r>
-              <w:rPr>
-                <w:rFonts w:ascii="Calibri" w:cs="Calibri" w:eastAsia="Calibri" w:hAnsi="Calibri"/>
-                <w:sz w:val="22"/>
-                <w:szCs w:val="22"/>
-                <w:u w:val="single" w:color="28251D"/>
-              </w:rPr>
-              <w:t xml:space="preserve">                                        </w:t>
-            </w:r>
-          </w:p>
-        </w:tc>
-        <w:tc>
-          <w:tcPr>
-            <w:tcW w:type="dxa" w:w="4680"/>
-            <w:tcBorders>
-              <w:top w:val="none" w:color="FFFFFF" w:sz="0"/>
-              <w:left w:val="none" w:color="FFFFFF" w:sz="0"/>
-              <w:bottom w:val="none" w:color="FFFFFF" w:sz="0"/>
-              <w:right w:val="none" w:color="FFFFFF" w:sz="0"/>
-            </w:tcBorders>
-            <w:tcMar>
-              <w:top w:type="dxa" w:w="0"/>
-              <w:left w:type="dxa" w:w="0"/>
-              <w:bottom w:type="dxa" w:w="0"/>
-              <w:right w:type="dxa" w:w="0"/>
-            </w:tcMar>
-          </w:tcPr>
-          <w:p>
-            <w:pPr>
-              <w:spacing w:after="200"/>
-            </w:pPr>
-            <w:r>
-              <w:rPr>
-                <w:rFonts w:ascii="Calibri" w:cs="Calibri" w:eastAsia="Calibri" w:hAnsi="Calibri"/>
-                <w:sz w:val="22"/>
-                <w:szCs w:val="22"/>
-              </w:rPr>
-              <w:t xml:space="preserve">)</w:t>
-            </w:r>
-          </w:p>
-        </w:tc>
-      </w:tr>
-    </w:tbl>
+    <w:p>
+      <w:pPr>
+        <w:spacing w:after="160"/>
+      </w:pPr>
+      <w:r>
+        <w:rPr>
+          <w:rFonts w:ascii="Calibri" w:cs="Calibri" w:eastAsia="Calibri" w:hAnsi="Calibri"/>
+          <w:sz w:val="22"/>
+          <w:szCs w:val="22"/>
+        </w:rPr>
+        <w:t xml:space="preserve">State of California</w:t>
+      </w:r>
+    </w:p>
+    <w:p>
+      <w:pPr>
+        <w:spacing w:after="200"/>
+      </w:pPr>
+      <w:r>
+        <w:rPr>
+          <w:rFonts w:ascii="Calibri" w:cs="Calibri" w:eastAsia="Calibri" w:hAnsi="Calibri"/>
+          <w:sz w:val="22"/>
+          <w:szCs w:val="22"/>
+        </w:rPr>
+        <w:t xml:space="preserve">County of </w:t>
+      </w:r>
+      <w:r>
+        <w:rPr>
+          <w:rFonts w:ascii="Calibri" w:cs="Calibri" w:eastAsia="Calibri" w:hAnsi="Calibri"/>
+          <w:sz w:val="22"/>
+          <w:szCs w:val="22"/>
+          <w:u w:val="single" w:color="28251D"/>
+        </w:rPr>
+        <w:t xml:space="preserve">                                        </w:t>
+      </w:r>
+    </w:p>
     <w:tbl>
       <w:tblPr>
         <w:tblW w:type="dxa" w:w="9360"/>
@@ -5112,7 +4882,7 @@
                 <w:szCs w:val="22"/>
                 <w:u w:val="single" w:color="28251D"/>
               </w:rPr>
-              <w:t xml:space="preserve">                      </w:t>
+              <w:t xml:space="preserve">                                  </w:t>
             </w:r>
             <w:r>
               <w:rPr>
@@ -5169,7 +4939,7 @@
                 <w:szCs w:val="22"/>
                 <w:u w:val="single" w:color="28251D"/>
               </w:rPr>
-              <w:t xml:space="preserve">                                                          </w:t>
+              <w:t xml:space="preserve">                                                                                        </w:t>
             </w:r>
             <w:r>
               <w:rPr>

</xml_diff>

<commit_message>
Travel consent ack — inline On/date/officer line, officer blank runs to right margin
</commit_message>
<xml_diff>
--- a/assets/forms/travel_consent_complex.docx
+++ b/assets/forms/travel_consent_complex.docx
@@ -4268,6 +4268,54 @@
         <w:t xml:space="preserve">                                        </w:t>
       </w:r>
     </w:p>
+    <w:p>
+      <w:pPr>
+        <w:keepNext/>
+        <w:spacing w:after="20"/>
+      </w:pPr>
+      <w:r>
+        <w:rPr>
+          <w:rFonts w:ascii="Calibri" w:cs="Calibri" w:eastAsia="Calibri" w:hAnsi="Calibri"/>
+          <w:sz w:val="22"/>
+          <w:szCs w:val="22"/>
+        </w:rPr>
+        <w:t xml:space="preserve">On </w:t>
+      </w:r>
+      <w:r>
+        <w:rPr>
+          <w:rFonts w:ascii="Calibri" w:cs="Calibri" w:eastAsia="Calibri" w:hAnsi="Calibri"/>
+          <w:sz w:val="22"/>
+          <w:szCs w:val="22"/>
+          <w:u w:val="single" w:color="28251D"/>
+        </w:rPr>
+        <w:t xml:space="preserve">                              </w:t>
+      </w:r>
+      <w:r>
+        <w:rPr>
+          <w:rFonts w:ascii="Calibri" w:cs="Calibri" w:eastAsia="Calibri" w:hAnsi="Calibri"/>
+          <w:sz w:val="22"/>
+          <w:szCs w:val="22"/>
+        </w:rPr>
+        <w:t xml:space="preserve"> before me, </w:t>
+      </w:r>
+      <w:r>
+        <w:rPr>
+          <w:rFonts w:ascii="Calibri" w:cs="Calibri" w:eastAsia="Calibri" w:hAnsi="Calibri"/>
+          <w:sz w:val="22"/>
+          <w:szCs w:val="22"/>
+          <w:u w:val="single" w:color="28251D"/>
+        </w:rPr>
+        <w:t xml:space="preserve">                                                                                                    </w:t>
+      </w:r>
+      <w:r>
+        <w:rPr>
+          <w:rFonts w:ascii="Calibri" w:cs="Calibri" w:eastAsia="Calibri" w:hAnsi="Calibri"/>
+          <w:sz w:val="22"/>
+          <w:szCs w:val="22"/>
+        </w:rPr>
+        <w:t xml:space="preserve">,</w:t>
+      </w:r>
+    </w:p>
     <w:tbl>
       <w:tblPr>
         <w:tblW w:type="dxa" w:w="9360"/>
@@ -4290,7 +4338,7 @@
         </w:trPr>
         <w:tc>
           <w:tcPr>
-            <w:tcW w:type="dxa" w:w="3200"/>
+            <w:tcW w:type="dxa" w:w="2200"/>
             <w:tcBorders>
               <w:top w:val="none" w:color="FFFFFF" w:sz="0"/>
               <w:left w:val="none" w:color="FFFFFF" w:sz="0"/>
@@ -4301,44 +4349,13 @@
               <w:top w:type="dxa" w:w="0"/>
               <w:left w:type="dxa" w:w="0"/>
               <w:bottom w:type="dxa" w:w="0"/>
-              <w:right w:type="dxa" w:w="120"/>
+              <w:right w:type="dxa" w:w="0"/>
             </w:tcMar>
           </w:tcPr>
           <w:p>
             <w:pPr>
-              <w:keepNext/>
-              <w:spacing w:after="20"/>
-            </w:pPr>
-            <w:r>
-              <w:rPr>
-                <w:rFonts w:ascii="Calibri" w:cs="Calibri" w:eastAsia="Calibri" w:hAnsi="Calibri"/>
-                <w:sz w:val="22"/>
-                <w:szCs w:val="22"/>
-              </w:rPr>
-              <w:t xml:space="preserve">On </w:t>
-            </w:r>
-            <w:r>
-              <w:rPr>
-                <w:rFonts w:ascii="Calibri" w:cs="Calibri" w:eastAsia="Calibri" w:hAnsi="Calibri"/>
-                <w:sz w:val="22"/>
-                <w:szCs w:val="22"/>
-                <w:u w:val="single" w:color="28251D"/>
-              </w:rPr>
-              <w:t xml:space="preserve">                                  </w:t>
-            </w:r>
-            <w:r>
-              <w:rPr>
-                <w:rFonts w:ascii="Calibri" w:cs="Calibri" w:eastAsia="Calibri" w:hAnsi="Calibri"/>
-                <w:sz w:val="22"/>
-                <w:szCs w:val="22"/>
-              </w:rPr>
-              <w:t xml:space="preserve"> before me,</w:t>
-            </w:r>
-          </w:p>
-          <w:p>
-            <w:pPr>
               <w:spacing w:after="40"/>
-              <w:ind w:left="240"/>
+              <w:ind w:left="360"/>
             </w:pPr>
             <w:r>
               <w:rPr>
@@ -4355,7 +4372,7 @@
         </w:tc>
         <w:tc>
           <w:tcPr>
-            <w:tcW w:type="dxa" w:w="6160"/>
+            <w:tcW w:type="dxa" w:w="7160"/>
             <w:tcBorders>
               <w:top w:val="none" w:color="FFFFFF" w:sz="0"/>
               <w:left w:val="none" w:color="FFFFFF" w:sz="0"/>
@@ -4364,34 +4381,11 @@
             </w:tcBorders>
             <w:tcMar>
               <w:top w:type="dxa" w:w="0"/>
-              <w:left w:type="dxa" w:w="120"/>
+              <w:left w:type="dxa" w:w="0"/>
               <w:bottom w:type="dxa" w:w="0"/>
               <w:right w:type="dxa" w:w="0"/>
             </w:tcMar>
           </w:tcPr>
-          <w:p>
-            <w:pPr>
-              <w:keepNext/>
-              <w:spacing w:after="20"/>
-            </w:pPr>
-            <w:r>
-              <w:rPr>
-                <w:rFonts w:ascii="Calibri" w:cs="Calibri" w:eastAsia="Calibri" w:hAnsi="Calibri"/>
-                <w:sz w:val="22"/>
-                <w:szCs w:val="22"/>
-                <w:u w:val="single" w:color="28251D"/>
-              </w:rPr>
-              <w:t xml:space="preserve">                                                                                        </w:t>
-            </w:r>
-            <w:r>
-              <w:rPr>
-                <w:rFonts w:ascii="Calibri" w:cs="Calibri" w:eastAsia="Calibri" w:hAnsi="Calibri"/>
-                <w:sz w:val="22"/>
-                <w:szCs w:val="22"/>
-              </w:rPr>
-              <w:t xml:space="preserve">,</w:t>
-            </w:r>
-          </w:p>
           <w:p>
             <w:pPr>
               <w:spacing w:after="40"/>
@@ -4826,6 +4820,54 @@
         <w:t xml:space="preserve">                                        </w:t>
       </w:r>
     </w:p>
+    <w:p>
+      <w:pPr>
+        <w:keepNext/>
+        <w:spacing w:after="20"/>
+      </w:pPr>
+      <w:r>
+        <w:rPr>
+          <w:rFonts w:ascii="Calibri" w:cs="Calibri" w:eastAsia="Calibri" w:hAnsi="Calibri"/>
+          <w:sz w:val="22"/>
+          <w:szCs w:val="22"/>
+        </w:rPr>
+        <w:t xml:space="preserve">On </w:t>
+      </w:r>
+      <w:r>
+        <w:rPr>
+          <w:rFonts w:ascii="Calibri" w:cs="Calibri" w:eastAsia="Calibri" w:hAnsi="Calibri"/>
+          <w:sz w:val="22"/>
+          <w:szCs w:val="22"/>
+          <w:u w:val="single" w:color="28251D"/>
+        </w:rPr>
+        <w:t xml:space="preserve">                              </w:t>
+      </w:r>
+      <w:r>
+        <w:rPr>
+          <w:rFonts w:ascii="Calibri" w:cs="Calibri" w:eastAsia="Calibri" w:hAnsi="Calibri"/>
+          <w:sz w:val="22"/>
+          <w:szCs w:val="22"/>
+        </w:rPr>
+        <w:t xml:space="preserve"> before me, </w:t>
+      </w:r>
+      <w:r>
+        <w:rPr>
+          <w:rFonts w:ascii="Calibri" w:cs="Calibri" w:eastAsia="Calibri" w:hAnsi="Calibri"/>
+          <w:sz w:val="22"/>
+          <w:szCs w:val="22"/>
+          <w:u w:val="single" w:color="28251D"/>
+        </w:rPr>
+        <w:t xml:space="preserve">                                                                                                    </w:t>
+      </w:r>
+      <w:r>
+        <w:rPr>
+          <w:rFonts w:ascii="Calibri" w:cs="Calibri" w:eastAsia="Calibri" w:hAnsi="Calibri"/>
+          <w:sz w:val="22"/>
+          <w:szCs w:val="22"/>
+        </w:rPr>
+        <w:t xml:space="preserve">,</w:t>
+      </w:r>
+    </w:p>
     <w:tbl>
       <w:tblPr>
         <w:tblW w:type="dxa" w:w="9360"/>
@@ -4848,7 +4890,7 @@
         </w:trPr>
         <w:tc>
           <w:tcPr>
-            <w:tcW w:type="dxa" w:w="3200"/>
+            <w:tcW w:type="dxa" w:w="2200"/>
             <w:tcBorders>
               <w:top w:val="none" w:color="FFFFFF" w:sz="0"/>
               <w:left w:val="none" w:color="FFFFFF" w:sz="0"/>
@@ -4859,44 +4901,13 @@
               <w:top w:type="dxa" w:w="0"/>
               <w:left w:type="dxa" w:w="0"/>
               <w:bottom w:type="dxa" w:w="0"/>
-              <w:right w:type="dxa" w:w="120"/>
+              <w:right w:type="dxa" w:w="0"/>
             </w:tcMar>
           </w:tcPr>
           <w:p>
             <w:pPr>
-              <w:keepNext/>
-              <w:spacing w:after="20"/>
-            </w:pPr>
-            <w:r>
-              <w:rPr>
-                <w:rFonts w:ascii="Calibri" w:cs="Calibri" w:eastAsia="Calibri" w:hAnsi="Calibri"/>
-                <w:sz w:val="22"/>
-                <w:szCs w:val="22"/>
-              </w:rPr>
-              <w:t xml:space="preserve">On </w:t>
-            </w:r>
-            <w:r>
-              <w:rPr>
-                <w:rFonts w:ascii="Calibri" w:cs="Calibri" w:eastAsia="Calibri" w:hAnsi="Calibri"/>
-                <w:sz w:val="22"/>
-                <w:szCs w:val="22"/>
-                <w:u w:val="single" w:color="28251D"/>
-              </w:rPr>
-              <w:t xml:space="preserve">                                  </w:t>
-            </w:r>
-            <w:r>
-              <w:rPr>
-                <w:rFonts w:ascii="Calibri" w:cs="Calibri" w:eastAsia="Calibri" w:hAnsi="Calibri"/>
-                <w:sz w:val="22"/>
-                <w:szCs w:val="22"/>
-              </w:rPr>
-              <w:t xml:space="preserve"> before me,</w:t>
-            </w:r>
-          </w:p>
-          <w:p>
-            <w:pPr>
               <w:spacing w:after="40"/>
-              <w:ind w:left="240"/>
+              <w:ind w:left="360"/>
             </w:pPr>
             <w:r>
               <w:rPr>
@@ -4913,7 +4924,7 @@
         </w:tc>
         <w:tc>
           <w:tcPr>
-            <w:tcW w:type="dxa" w:w="6160"/>
+            <w:tcW w:type="dxa" w:w="7160"/>
             <w:tcBorders>
               <w:top w:val="none" w:color="FFFFFF" w:sz="0"/>
               <w:left w:val="none" w:color="FFFFFF" w:sz="0"/>
@@ -4922,34 +4933,11 @@
             </w:tcBorders>
             <w:tcMar>
               <w:top w:type="dxa" w:w="0"/>
-              <w:left w:type="dxa" w:w="120"/>
+              <w:left w:type="dxa" w:w="0"/>
               <w:bottom w:type="dxa" w:w="0"/>
               <w:right w:type="dxa" w:w="0"/>
             </w:tcMar>
           </w:tcPr>
-          <w:p>
-            <w:pPr>
-              <w:keepNext/>
-              <w:spacing w:after="20"/>
-            </w:pPr>
-            <w:r>
-              <w:rPr>
-                <w:rFonts w:ascii="Calibri" w:cs="Calibri" w:eastAsia="Calibri" w:hAnsi="Calibri"/>
-                <w:sz w:val="22"/>
-                <w:szCs w:val="22"/>
-                <w:u w:val="single" w:color="28251D"/>
-              </w:rPr>
-              <w:t xml:space="preserve">                                                                                        </w:t>
-            </w:r>
-            <w:r>
-              <w:rPr>
-                <w:rFonts w:ascii="Calibri" w:cs="Calibri" w:eastAsia="Calibri" w:hAnsi="Calibri"/>
-                <w:sz w:val="22"/>
-                <w:szCs w:val="22"/>
-              </w:rPr>
-              <w:t xml:space="preserve">,</w:t>
-            </w:r>
-          </w:p>
           <w:p>
             <w:pPr>
               <w:spacing w:after="40"/>

</xml_diff>

<commit_message>
Travel consent ack — force US Letter (was A4), extend all ack lines + signature to right margin
</commit_message>
<xml_diff>
--- a/assets/forms/travel_consent_complex.docx
+++ b/assets/forms/travel_consent_complex.docx
@@ -4124,7 +4124,7 @@
     </w:p>
     <w:tbl>
       <w:tblPr>
-        <w:tblW w:type="dxa" w:w="9360"/>
+        <w:tblW w:type="dxa" w:w="10800"/>
         <w:tblBorders>
           <w:top w:val="none" w:color="FFFFFF" w:sz="0"/>
           <w:left w:val="none" w:color="FFFFFF" w:sz="0"/>
@@ -4144,7 +4144,7 @@
         </w:trPr>
         <w:tc>
           <w:tcPr>
-            <w:tcW w:type="dxa" w:w="7000"/>
+            <w:tcW w:type="dxa" w:w="8440"/>
             <w:tcBorders>
               <w:top w:val="none" w:color="FFFFFF" w:sz="0"/>
               <w:left w:val="none" w:color="FFFFFF" w:sz="0"/>
@@ -4305,7 +4305,7 @@
           <w:szCs w:val="22"/>
           <w:u w:val="single" w:color="28251D"/>
         </w:rPr>
-        <w:t xml:space="preserve">                                                                                                    </w:t>
+        <w:t xml:space="preserve">                                                                                                                                                              </w:t>
       </w:r>
       <w:r>
         <w:rPr>
@@ -4318,7 +4318,7 @@
     </w:p>
     <w:tbl>
       <w:tblPr>
-        <w:tblW w:type="dxa" w:w="9360"/>
+        <w:tblW w:type="dxa" w:w="10800"/>
         <w:tblBorders>
           <w:top w:val="none" w:color="FFFFFF" w:sz="0"/>
           <w:left w:val="none" w:color="FFFFFF" w:sz="0"/>
@@ -4372,7 +4372,7 @@
         </w:tc>
         <w:tc>
           <w:tcPr>
-            <w:tcW w:type="dxa" w:w="7160"/>
+            <w:tcW w:type="dxa" w:w="8600"/>
             <w:tcBorders>
               <w:top w:val="none" w:color="FFFFFF" w:sz="0"/>
               <w:left w:val="none" w:color="FFFFFF" w:sz="0"/>
@@ -4426,7 +4426,7 @@
           <w:szCs w:val="22"/>
           <w:u w:val="single" w:color="28251D"/>
         </w:rPr>
-        <w:t xml:space="preserve">                                                                                                                                                                </w:t>
+        <w:t xml:space="preserve">                                                                                                                                                                                    </w:t>
       </w:r>
     </w:p>
     <w:p>
@@ -4460,7 +4460,7 @@
           <w:szCs w:val="22"/>
           <w:u w:val="single" w:color="28251D"/>
         </w:rPr>
-        <w:t xml:space="preserve">                                                                                                                                                                                                             </w:t>
+        <w:t xml:space="preserve">                                                                                                                                                                                                                          </w:t>
       </w:r>
       <w:r>
         <w:rPr>
@@ -4486,7 +4486,7 @@
     </w:p>
     <w:tbl>
       <w:tblPr>
-        <w:tblW w:type="dxa" w:w="9360"/>
+        <w:tblW w:type="dxa" w:w="10800"/>
         <w:tblBorders>
           <w:top w:val="none" w:color="FFFFFF" w:sz="0"/>
           <w:left w:val="none" w:color="FFFFFF" w:sz="0"/>
@@ -4537,7 +4537,7 @@
         </w:tc>
         <w:tc>
           <w:tcPr>
-            <w:tcW w:type="dxa" w:w="5160"/>
+            <w:tcW w:type="dxa" w:w="6600"/>
             <w:tcBorders>
               <w:top w:val="none" w:color="FFFFFF" w:sz="0"/>
               <w:left w:val="none" w:color="FFFFFF" w:sz="0"/>
@@ -4597,7 +4597,7 @@
                 <w:szCs w:val="22"/>
                 <w:u w:val="single" w:color="28251D"/>
               </w:rPr>
-              <w:t xml:space="preserve">                                      </w:t>
+              <w:t xml:space="preserve">                                                                      </w:t>
             </w:r>
           </w:p>
           <w:p>
@@ -4676,7 +4676,7 @@
     </w:p>
     <w:tbl>
       <w:tblPr>
-        <w:tblW w:type="dxa" w:w="9360"/>
+        <w:tblW w:type="dxa" w:w="10800"/>
         <w:tblBorders>
           <w:top w:val="none" w:color="FFFFFF" w:sz="0"/>
           <w:left w:val="none" w:color="FFFFFF" w:sz="0"/>
@@ -4696,7 +4696,7 @@
         </w:trPr>
         <w:tc>
           <w:tcPr>
-            <w:tcW w:type="dxa" w:w="7000"/>
+            <w:tcW w:type="dxa" w:w="8440"/>
             <w:tcBorders>
               <w:top w:val="none" w:color="FFFFFF" w:sz="0"/>
               <w:left w:val="none" w:color="FFFFFF" w:sz="0"/>
@@ -4857,7 +4857,7 @@
           <w:szCs w:val="22"/>
           <w:u w:val="single" w:color="28251D"/>
         </w:rPr>
-        <w:t xml:space="preserve">                                                                                                    </w:t>
+        <w:t xml:space="preserve">                                                                                                                                                              </w:t>
       </w:r>
       <w:r>
         <w:rPr>
@@ -4870,7 +4870,7 @@
     </w:p>
     <w:tbl>
       <w:tblPr>
-        <w:tblW w:type="dxa" w:w="9360"/>
+        <w:tblW w:type="dxa" w:w="10800"/>
         <w:tblBorders>
           <w:top w:val="none" w:color="FFFFFF" w:sz="0"/>
           <w:left w:val="none" w:color="FFFFFF" w:sz="0"/>
@@ -4924,7 +4924,7 @@
         </w:tc>
         <w:tc>
           <w:tcPr>
-            <w:tcW w:type="dxa" w:w="7160"/>
+            <w:tcW w:type="dxa" w:w="8600"/>
             <w:tcBorders>
               <w:top w:val="none" w:color="FFFFFF" w:sz="0"/>
               <w:left w:val="none" w:color="FFFFFF" w:sz="0"/>
@@ -4978,7 +4978,7 @@
           <w:szCs w:val="22"/>
           <w:u w:val="single" w:color="28251D"/>
         </w:rPr>
-        <w:t xml:space="preserve">                                                                                                                                                                </w:t>
+        <w:t xml:space="preserve">                                                                                                                                                                                    </w:t>
       </w:r>
     </w:p>
     <w:p>
@@ -5012,7 +5012,7 @@
           <w:szCs w:val="22"/>
           <w:u w:val="single" w:color="28251D"/>
         </w:rPr>
-        <w:t xml:space="preserve">                                                                                                                                                                                                             </w:t>
+        <w:t xml:space="preserve">                                                                                                                                                                                                                          </w:t>
       </w:r>
       <w:r>
         <w:rPr>
@@ -5038,7 +5038,7 @@
     </w:p>
     <w:tbl>
       <w:tblPr>
-        <w:tblW w:type="dxa" w:w="9360"/>
+        <w:tblW w:type="dxa" w:w="10800"/>
         <w:tblBorders>
           <w:top w:val="none" w:color="FFFFFF" w:sz="0"/>
           <w:left w:val="none" w:color="FFFFFF" w:sz="0"/>
@@ -5089,7 +5089,7 @@
         </w:tc>
         <w:tc>
           <w:tcPr>
-            <w:tcW w:type="dxa" w:w="5160"/>
+            <w:tcW w:type="dxa" w:w="6600"/>
             <w:tcBorders>
               <w:top w:val="none" w:color="FFFFFF" w:sz="0"/>
               <w:left w:val="none" w:color="FFFFFF" w:sz="0"/>
@@ -5149,7 +5149,7 @@
                 <w:szCs w:val="22"/>
                 <w:u w:val="single" w:color="28251D"/>
               </w:rPr>
-              <w:t xml:space="preserve">                                      </w:t>
+              <w:t xml:space="preserve">                                                                      </w:t>
             </w:r>
           </w:p>
           <w:p>
@@ -5191,7 +5191,7 @@
     </w:p>
     <w:sectPr>
       <w:footerReference w:type="default" r:id="rId7"/>
-      <w:pgSz w:w="11906" w:h="16838" w:orient="portrait"/>
+      <w:pgSz w:w="12240" w:h="15840" w:orient="portrait"/>
       <w:pgMar w:top="720" w:right="720" w:bottom="720" w:left="720" w:header="708" w:footer="708" w:gutter="0"/>
       <w:pgNumType/>
       <w:docGrid w:linePitch="360"/>

</xml_diff>

<commit_message>
Travel consent — keep Section 5 together (no split) + extend Signature line to right margin
</commit_message>
<xml_diff>
--- a/assets/forms/travel_consent_complex.docx
+++ b/assets/forms/travel_consent_complex.docx
@@ -4597,7 +4597,7 @@
                 <w:szCs w:val="22"/>
                 <w:u w:val="single" w:color="28251D"/>
               </w:rPr>
-              <w:t xml:space="preserve">                                                                      </w:t>
+              <w:t xml:space="preserve">                                                                                    </w:t>
             </w:r>
           </w:p>
           <w:p>
@@ -5149,7 +5149,7 @@
                 <w:szCs w:val="22"/>
                 <w:u w:val="single" w:color="28251D"/>
               </w:rPr>
-              <w:t xml:space="preserve">                                                                      </w:t>
+              <w:t xml:space="preserve">                                                                                    </w:t>
             </w:r>
           </w:p>
           <w:p>

</xml_diff>

<commit_message>
Travel consent complex — remove second acknowledgment page (single ack has room for multiple signers)
</commit_message>
<xml_diff>
--- a/assets/forms/travel_consent_complex.docx
+++ b/assets/forms/travel_consent_complex.docx
@@ -118,7 +118,7 @@
           <w:sz w:val="20"/>
           <w:szCs w:val="20"/>
         </w:rPr>
-        <w:t xml:space="preserve">This is the "Complex Multi-Leg" version. It contains alternative blocks (marked A / B / C, D / E / F) — keep only the one that fits the situation and delete the others. It also contains repeatable blocks (additional children, additional flight legs, second acknowledgment) — duplicate or delete as needed.</w:t>
+        <w:t xml:space="preserve">This is the "Complex Multi-Leg" version. It contains alternative blocks (marked A / B / C, D / E / F) — keep only the one that fits the situation and delete the others. It also contains repeatable blocks (additional children, additional flight legs) — duplicate or delete as needed.</w:t>
       </w:r>
     </w:p>
     <w:p>
@@ -214,7 +214,7 @@
           <w:sz w:val="20"/>
           <w:szCs w:val="20"/>
         </w:rPr>
-        <w:t xml:space="preserve">Identify each signer per California ID requirements, have them sign in your presence, then complete the California All-Purpose Acknowledgment on the last page. Journal each signer. If signers appear at different times or locations, use a separate acknowledgment for each — a second acknowledgment page is included.</w:t>
+        <w:t xml:space="preserve">Identify each signer per California ID requirements, have them sign in your presence, then complete the California All-Purpose Acknowledgment on the last page. Journal each signer. The acknowledgment has room for multiple signers; if signers appear at different times or locations, attach an additional California All-Purpose Acknowledgment form for each separate signing.</w:t>
       </w:r>
     </w:p>
     <w:p>
@@ -246,7 +246,7 @@
           <w:sz w:val="20"/>
           <w:szCs w:val="20"/>
         </w:rPr>
-        <w:t xml:space="preserve">For Hague Convention destinations requiring an Apostille: acknowledge the signature(s), then the document goes to the California Secretary of State. Do not staple the acknowledgment(s) to the letter — keep them as separate pages that can be apostilled.</w:t>
+        <w:t xml:space="preserve">For Hague Convention destinations requiring an Apostille: acknowledge the signature(s), then the document goes to the California Secretary of State. Do not staple the acknowledgment to the letter — keep it as a separate page that can be apostilled.</w:t>
       </w:r>
     </w:p>
     <w:p>
@@ -3920,7 +3920,7 @@
           <w:sz w:val="20"/>
           <w:szCs w:val="20"/>
         </w:rPr>
-        <w:t xml:space="preserve">Signer(s) must sign in the notary's presence. Do not sign in advance. If signers appear at different times or locations, use a separate California All-Purpose Acknowledgment for each signature — a second acknowledgment page is included at the end for that purpose.</w:t>
+        <w:t xml:space="preserve">Signer(s) must sign in the notary's presence. Do not sign in advance. The California All-Purpose Acknowledgment on the last page has room for multiple signer names. If signers appear at different times or locations, attach an additional California All-Purpose Acknowledgment form for each separate signing.</w:t>
       </w:r>
     </w:p>
     <w:p>
@@ -4206,558 +4206,6 @@
                 <w:szCs w:val="22"/>
               </w:rPr>
               <w:t xml:space="preserve">CIVIL CODE § 1189</w:t>
-            </w:r>
-          </w:p>
-        </w:tc>
-      </w:tr>
-    </w:tbl>
-    <w:p>
-      <w:pPr>
-        <w:pBdr>
-          <w:top w:val="single" w:color="28251D" w:sz="6" w:space="8"/>
-          <w:bottom w:val="single" w:color="28251D" w:sz="6" w:space="8"/>
-          <w:left w:val="single" w:color="28251D" w:sz="6" w:space="8"/>
-          <w:right w:val="single" w:color="28251D" w:sz="6" w:space="8"/>
-        </w:pBdr>
-        <w:spacing w:after="240" w:before="60"/>
-      </w:pPr>
-      <w:r>
-        <w:rPr>
-          <w:rFonts w:ascii="Calibri" w:cs="Calibri" w:eastAsia="Calibri" w:hAnsi="Calibri"/>
-          <w:i/>
-          <w:iCs/>
-          <w:color w:val="28251D"/>
-          <w:sz w:val="20"/>
-          <w:szCs w:val="20"/>
-        </w:rPr>
-        <w:t xml:space="preserve">A notary public or other officer completing this certificate verifies only the identity of the individual who signed the document to which this certificate is attached, and not the truthfulness, accuracy, or validity of that document.</w:t>
-      </w:r>
-    </w:p>
-    <w:p>
-      <w:pPr>
-        <w:spacing w:after="160"/>
-      </w:pPr>
-      <w:r>
-        <w:rPr>
-          <w:rFonts w:ascii="Calibri" w:cs="Calibri" w:eastAsia="Calibri" w:hAnsi="Calibri"/>
-          <w:sz w:val="22"/>
-          <w:szCs w:val="22"/>
-        </w:rPr>
-        <w:t xml:space="preserve">State of California</w:t>
-      </w:r>
-    </w:p>
-    <w:p>
-      <w:pPr>
-        <w:spacing w:after="200"/>
-      </w:pPr>
-      <w:r>
-        <w:rPr>
-          <w:rFonts w:ascii="Calibri" w:cs="Calibri" w:eastAsia="Calibri" w:hAnsi="Calibri"/>
-          <w:sz w:val="22"/>
-          <w:szCs w:val="22"/>
-        </w:rPr>
-        <w:t xml:space="preserve">County of </w:t>
-      </w:r>
-      <w:r>
-        <w:rPr>
-          <w:rFonts w:ascii="Calibri" w:cs="Calibri" w:eastAsia="Calibri" w:hAnsi="Calibri"/>
-          <w:sz w:val="22"/>
-          <w:szCs w:val="22"/>
-          <w:u w:val="single" w:color="28251D"/>
-        </w:rPr>
-        <w:t xml:space="preserve">                                        </w:t>
-      </w:r>
-    </w:p>
-    <w:p>
-      <w:pPr>
-        <w:keepNext/>
-        <w:spacing w:after="20"/>
-      </w:pPr>
-      <w:r>
-        <w:rPr>
-          <w:rFonts w:ascii="Calibri" w:cs="Calibri" w:eastAsia="Calibri" w:hAnsi="Calibri"/>
-          <w:sz w:val="22"/>
-          <w:szCs w:val="22"/>
-        </w:rPr>
-        <w:t xml:space="preserve">On </w:t>
-      </w:r>
-      <w:r>
-        <w:rPr>
-          <w:rFonts w:ascii="Calibri" w:cs="Calibri" w:eastAsia="Calibri" w:hAnsi="Calibri"/>
-          <w:sz w:val="22"/>
-          <w:szCs w:val="22"/>
-          <w:u w:val="single" w:color="28251D"/>
-        </w:rPr>
-        <w:t xml:space="preserve">                              </w:t>
-      </w:r>
-      <w:r>
-        <w:rPr>
-          <w:rFonts w:ascii="Calibri" w:cs="Calibri" w:eastAsia="Calibri" w:hAnsi="Calibri"/>
-          <w:sz w:val="22"/>
-          <w:szCs w:val="22"/>
-        </w:rPr>
-        <w:t xml:space="preserve"> before me, </w:t>
-      </w:r>
-      <w:r>
-        <w:rPr>
-          <w:rFonts w:ascii="Calibri" w:cs="Calibri" w:eastAsia="Calibri" w:hAnsi="Calibri"/>
-          <w:sz w:val="22"/>
-          <w:szCs w:val="22"/>
-          <w:u w:val="single" w:color="28251D"/>
-        </w:rPr>
-        <w:t xml:space="preserve">                                                                                                                                                              </w:t>
-      </w:r>
-      <w:r>
-        <w:rPr>
-          <w:rFonts w:ascii="Calibri" w:cs="Calibri" w:eastAsia="Calibri" w:hAnsi="Calibri"/>
-          <w:sz w:val="22"/>
-          <w:szCs w:val="22"/>
-        </w:rPr>
-        <w:t xml:space="preserve">,</w:t>
-      </w:r>
-    </w:p>
-    <w:tbl>
-      <w:tblPr>
-        <w:tblW w:type="dxa" w:w="10800"/>
-        <w:tblBorders>
-          <w:top w:val="none" w:color="FFFFFF" w:sz="0"/>
-          <w:left w:val="none" w:color="FFFFFF" w:sz="0"/>
-          <w:bottom w:val="none" w:color="FFFFFF" w:sz="0"/>
-          <w:right w:val="none" w:color="FFFFFF" w:sz="0"/>
-          <w:insideH w:val="none" w:color="FFFFFF" w:sz="0"/>
-          <w:insideV w:val="none" w:color="FFFFFF" w:sz="0"/>
-        </w:tblBorders>
-      </w:tblPr>
-      <w:tblGrid>
-        <w:gridCol w:w="100"/>
-        <w:gridCol w:w="100"/>
-      </w:tblGrid>
-      <w:tr>
-        <w:trPr>
-          <w:cantSplit/>
-        </w:trPr>
-        <w:tc>
-          <w:tcPr>
-            <w:tcW w:type="dxa" w:w="2200"/>
-            <w:tcBorders>
-              <w:top w:val="none" w:color="FFFFFF" w:sz="0"/>
-              <w:left w:val="none" w:color="FFFFFF" w:sz="0"/>
-              <w:bottom w:val="none" w:color="FFFFFF" w:sz="0"/>
-              <w:right w:val="none" w:color="FFFFFF" w:sz="0"/>
-            </w:tcBorders>
-            <w:tcMar>
-              <w:top w:type="dxa" w:w="0"/>
-              <w:left w:type="dxa" w:w="0"/>
-              <w:bottom w:type="dxa" w:w="0"/>
-              <w:right w:type="dxa" w:w="0"/>
-            </w:tcMar>
-          </w:tcPr>
-          <w:p>
-            <w:pPr>
-              <w:spacing w:after="40"/>
-              <w:ind w:left="360"/>
-            </w:pPr>
-            <w:r>
-              <w:rPr>
-                <w:rFonts w:ascii="Calibri" w:cs="Calibri" w:eastAsia="Calibri" w:hAnsi="Calibri"/>
-                <w:i/>
-                <w:iCs/>
-                <w:color w:val="7A7974"/>
-                <w:sz w:val="18"/>
-                <w:szCs w:val="18"/>
-              </w:rPr>
-              <w:t xml:space="preserve">Date</w:t>
-            </w:r>
-          </w:p>
-        </w:tc>
-        <w:tc>
-          <w:tcPr>
-            <w:tcW w:type="dxa" w:w="8600"/>
-            <w:tcBorders>
-              <w:top w:val="none" w:color="FFFFFF" w:sz="0"/>
-              <w:left w:val="none" w:color="FFFFFF" w:sz="0"/>
-              <w:bottom w:val="none" w:color="FFFFFF" w:sz="0"/>
-              <w:right w:val="none" w:color="FFFFFF" w:sz="0"/>
-            </w:tcBorders>
-            <w:tcMar>
-              <w:top w:type="dxa" w:w="0"/>
-              <w:left w:type="dxa" w:w="0"/>
-              <w:bottom w:type="dxa" w:w="0"/>
-              <w:right w:type="dxa" w:w="0"/>
-            </w:tcMar>
-          </w:tcPr>
-          <w:p>
-            <w:pPr>
-              <w:spacing w:after="40"/>
-              <w:jc w:val="center"/>
-            </w:pPr>
-            <w:r>
-              <w:rPr>
-                <w:rFonts w:ascii="Calibri" w:cs="Calibri" w:eastAsia="Calibri" w:hAnsi="Calibri"/>
-                <w:i/>
-                <w:iCs/>
-                <w:color w:val="7A7974"/>
-                <w:sz w:val="18"/>
-                <w:szCs w:val="18"/>
-              </w:rPr>
-              <w:t xml:space="preserve">Here Insert Name and Title of the Officer</w:t>
-            </w:r>
-          </w:p>
-        </w:tc>
-      </w:tr>
-    </w:tbl>
-    <w:p>
-      <w:pPr>
-        <w:keepNext/>
-        <w:spacing w:after="20"/>
-      </w:pPr>
-      <w:r>
-        <w:rPr>
-          <w:rFonts w:ascii="Calibri" w:cs="Calibri" w:eastAsia="Calibri" w:hAnsi="Calibri"/>
-          <w:sz w:val="22"/>
-          <w:szCs w:val="22"/>
-        </w:rPr>
-        <w:t xml:space="preserve">personally appeared </w:t>
-      </w:r>
-      <w:r>
-        <w:rPr>
-          <w:rFonts w:ascii="Calibri" w:cs="Calibri" w:eastAsia="Calibri" w:hAnsi="Calibri"/>
-          <w:sz w:val="22"/>
-          <w:szCs w:val="22"/>
-          <w:u w:val="single" w:color="28251D"/>
-        </w:rPr>
-        <w:t xml:space="preserve">                                                                                                                                                                                    </w:t>
-      </w:r>
-    </w:p>
-    <w:p>
-      <w:pPr>
-        <w:keepNext/>
-        <w:spacing w:after="40"/>
-        <w:ind w:left="2400"/>
-        <w:jc w:val="center"/>
-      </w:pPr>
-      <w:r>
-        <w:rPr>
-          <w:rFonts w:ascii="Calibri" w:cs="Calibri" w:eastAsia="Calibri" w:hAnsi="Calibri"/>
-          <w:i/>
-          <w:iCs/>
-          <w:color w:val="7A7974"/>
-          <w:sz w:val="18"/>
-          <w:szCs w:val="18"/>
-        </w:rPr>
-        <w:t xml:space="preserve">Name(s) of Signer(s)</w:t>
-      </w:r>
-    </w:p>
-    <w:p>
-      <w:pPr>
-        <w:keepNext/>
-        <w:spacing w:after="40"/>
-      </w:pPr>
-      <w:r>
-        <w:rPr>
-          <w:rFonts w:ascii="Calibri" w:cs="Calibri" w:eastAsia="Calibri" w:hAnsi="Calibri"/>
-          <w:sz w:val="22"/>
-          <w:szCs w:val="22"/>
-          <w:u w:val="single" w:color="28251D"/>
-        </w:rPr>
-        <w:t xml:space="preserve">                                                                                                                                                                                                                          </w:t>
-      </w:r>
-      <w:r>
-        <w:rPr>
-          <w:rFonts w:ascii="Calibri" w:cs="Calibri" w:eastAsia="Calibri" w:hAnsi="Calibri"/>
-          <w:sz w:val="22"/>
-          <w:szCs w:val="22"/>
-        </w:rPr>
-        <w:t xml:space="preserve">,</w:t>
-      </w:r>
-    </w:p>
-    <w:p>
-      <w:pPr>
-        <w:spacing w:after="240"/>
-      </w:pPr>
-      <w:r>
-        <w:rPr>
-          <w:rFonts w:ascii="Calibri" w:cs="Calibri" w:eastAsia="Calibri" w:hAnsi="Calibri"/>
-          <w:sz w:val="22"/>
-          <w:szCs w:val="22"/>
-        </w:rPr>
-        <w:t xml:space="preserve">who proved to me on the basis of satisfactory evidence to be the person(s) whose name(s) is/are subscribed to the within instrument, and acknowledged to me that he/she/they executed the same in his/her/their authorized capacity(ies), and that by his/her/their signature(s) on the instrument the person(s), or the entity upon behalf of which the person(s) acted, executed the instrument.</w:t>
-      </w:r>
-    </w:p>
-    <w:tbl>
-      <w:tblPr>
-        <w:tblW w:type="dxa" w:w="10800"/>
-        <w:tblBorders>
-          <w:top w:val="none" w:color="FFFFFF" w:sz="0"/>
-          <w:left w:val="none" w:color="FFFFFF" w:sz="0"/>
-          <w:bottom w:val="none" w:color="FFFFFF" w:sz="0"/>
-          <w:right w:val="none" w:color="FFFFFF" w:sz="0"/>
-          <w:insideH w:val="none" w:color="FFFFFF" w:sz="0"/>
-          <w:insideV w:val="none" w:color="FFFFFF" w:sz="0"/>
-        </w:tblBorders>
-      </w:tblPr>
-      <w:tblGrid>
-        <w:gridCol w:w="100"/>
-        <w:gridCol w:w="100"/>
-      </w:tblGrid>
-      <w:tr>
-        <w:trPr>
-          <w:cantSplit/>
-          <w:trHeight w:val="2200" w:hRule="atLeast"/>
-        </w:trPr>
-        <w:tc>
-          <w:tcPr>
-            <w:tcW w:type="dxa" w:w="4200"/>
-            <w:tcBorders>
-              <w:top w:val="none" w:color="FFFFFF" w:sz="0"/>
-              <w:left w:val="none" w:color="FFFFFF" w:sz="0"/>
-              <w:bottom w:val="single" w:color="28251D" w:sz="6" w:space="0"/>
-              <w:right w:val="none" w:color="FFFFFF" w:sz="0"/>
-            </w:tcBorders>
-            <w:tcMar>
-              <w:top w:type="dxa" w:w="0"/>
-              <w:left w:type="dxa" w:w="0"/>
-              <w:bottom w:type="dxa" w:w="0"/>
-              <w:right w:type="dxa" w:w="200"/>
-            </w:tcMar>
-          </w:tcPr>
-          <w:p>
-            <w:pPr>
-              <w:spacing w:after="0"/>
-            </w:pPr>
-            <w:r>
-              <w:rPr>
-                <w:rFonts w:ascii="Calibri" w:cs="Calibri" w:eastAsia="Calibri" w:hAnsi="Calibri"/>
-                <w:sz w:val="22"/>
-                <w:szCs w:val="22"/>
-              </w:rPr>
-              <w:t xml:space="preserve"/>
-            </w:r>
-          </w:p>
-        </w:tc>
-        <w:tc>
-          <w:tcPr>
-            <w:tcW w:type="dxa" w:w="6600"/>
-            <w:tcBorders>
-              <w:top w:val="none" w:color="FFFFFF" w:sz="0"/>
-              <w:left w:val="none" w:color="FFFFFF" w:sz="0"/>
-              <w:bottom w:val="none" w:color="FFFFFF" w:sz="0"/>
-              <w:right w:val="none" w:color="FFFFFF" w:sz="0"/>
-            </w:tcBorders>
-            <w:tcMar>
-              <w:top w:type="dxa" w:w="0"/>
-              <w:left w:type="dxa" w:w="200"/>
-              <w:bottom w:type="dxa" w:w="0"/>
-              <w:right w:type="dxa" w:w="0"/>
-            </w:tcMar>
-          </w:tcPr>
-          <w:p>
-            <w:pPr>
-              <w:spacing w:after="160"/>
-            </w:pPr>
-            <w:r>
-              <w:rPr>
-                <w:rFonts w:ascii="Calibri" w:cs="Calibri" w:eastAsia="Calibri" w:hAnsi="Calibri"/>
-                <w:sz w:val="22"/>
-                <w:szCs w:val="22"/>
-              </w:rPr>
-              <w:t xml:space="preserve">I certify under PENALTY OF PERJURY under the laws of the State of California that the foregoing paragraph is true and correct.</w:t>
-            </w:r>
-          </w:p>
-          <w:p>
-            <w:pPr>
-              <w:spacing w:after="400"/>
-            </w:pPr>
-            <w:r>
-              <w:rPr>
-                <w:rFonts w:ascii="Calibri" w:cs="Calibri" w:eastAsia="Calibri" w:hAnsi="Calibri"/>
-                <w:sz w:val="22"/>
-                <w:szCs w:val="22"/>
-              </w:rPr>
-              <w:t xml:space="preserve">WITNESS my hand and official seal.</w:t>
-            </w:r>
-          </w:p>
-          <w:p>
-            <w:pPr>
-              <w:keepNext/>
-              <w:spacing w:after="20"/>
-            </w:pPr>
-            <w:r>
-              <w:rPr>
-                <w:rFonts w:ascii="Calibri" w:cs="Calibri" w:eastAsia="Calibri" w:hAnsi="Calibri"/>
-                <w:sz w:val="22"/>
-                <w:szCs w:val="22"/>
-              </w:rPr>
-              <w:t xml:space="preserve">Signature </w:t>
-            </w:r>
-            <w:r>
-              <w:rPr>
-                <w:rFonts w:ascii="Calibri" w:cs="Calibri" w:eastAsia="Calibri" w:hAnsi="Calibri"/>
-                <w:sz w:val="22"/>
-                <w:szCs w:val="22"/>
-                <w:u w:val="single" w:color="28251D"/>
-              </w:rPr>
-              <w:t xml:space="preserve">                                                                                    </w:t>
-            </w:r>
-          </w:p>
-          <w:p>
-            <w:pPr>
-              <w:spacing w:after="40"/>
-              <w:jc w:val="center"/>
-            </w:pPr>
-            <w:r>
-              <w:rPr>
-                <w:rFonts w:ascii="Calibri" w:cs="Calibri" w:eastAsia="Calibri" w:hAnsi="Calibri"/>
-                <w:i/>
-                <w:iCs/>
-                <w:color w:val="7A7974"/>
-                <w:sz w:val="18"/>
-                <w:szCs w:val="18"/>
-              </w:rPr>
-              <w:t xml:space="preserve">Signature of Notary Public</w:t>
-            </w:r>
-          </w:p>
-        </w:tc>
-      </w:tr>
-    </w:tbl>
-    <w:p>
-      <w:pPr>
-        <w:spacing w:after="0" w:before="40"/>
-        <w:ind w:left="720"/>
-      </w:pPr>
-      <w:r>
-        <w:rPr>
-          <w:rFonts w:ascii="Calibri" w:cs="Calibri" w:eastAsia="Calibri" w:hAnsi="Calibri"/>
-          <w:i/>
-          <w:iCs/>
-          <w:color w:val="7A7974"/>
-          <w:sz w:val="20"/>
-          <w:szCs w:val="20"/>
-        </w:rPr>
-        <w:t xml:space="preserve">Place Notary Seal Above</w:t>
-      </w:r>
-    </w:p>
-    <w:p>
-      <w:r>
-        <w:br w:type="page"/>
-      </w:r>
-    </w:p>
-    <w:p>
-      <w:pPr>
-        <w:pBdr>
-          <w:left w:val="single" w:color="01696F" w:sz="12" w:space="6"/>
-        </w:pBdr>
-        <w:shd w:fill="E6F0F1" w:val="clear"/>
-        <w:spacing w:after="240" w:before="60"/>
-        <w:ind w:left="240" w:right="240"/>
-      </w:pPr>
-      <w:r>
-        <w:rPr>
-          <w:rFonts w:ascii="Calibri" w:cs="Calibri" w:eastAsia="Calibri" w:hAnsi="Calibri"/>
-          <w:b/>
-          <w:bCs/>
-          <w:color w:val="01696F"/>
-          <w:sz w:val="20"/>
-          <w:szCs w:val="20"/>
-        </w:rPr>
-        <w:t xml:space="preserve">NOTE: </w:t>
-      </w:r>
-      <w:r>
-        <w:rPr>
-          <w:rFonts w:ascii="Calibri" w:cs="Calibri" w:eastAsia="Calibri" w:hAnsi="Calibri"/>
-          <w:i/>
-          <w:iCs/>
-          <w:color w:val="28251D"/>
-          <w:sz w:val="20"/>
-          <w:szCs w:val="20"/>
-        </w:rPr>
-        <w:t xml:space="preserve">The second acknowledgment below is for use only if a second consenting parent signs at a different time or location. If both parents appear together, use only the first acknowledgment on the previous page and delete this entire page.</w:t>
-      </w:r>
-    </w:p>
-    <w:tbl>
-      <w:tblPr>
-        <w:tblW w:type="dxa" w:w="10800"/>
-        <w:tblBorders>
-          <w:top w:val="none" w:color="FFFFFF" w:sz="0"/>
-          <w:left w:val="none" w:color="FFFFFF" w:sz="0"/>
-          <w:bottom w:val="none" w:color="FFFFFF" w:sz="0"/>
-          <w:right w:val="none" w:color="FFFFFF" w:sz="0"/>
-          <w:insideH w:val="none" w:color="FFFFFF" w:sz="0"/>
-          <w:insideV w:val="none" w:color="FFFFFF" w:sz="0"/>
-        </w:tblBorders>
-      </w:tblPr>
-      <w:tblGrid>
-        <w:gridCol w:w="100"/>
-        <w:gridCol w:w="100"/>
-      </w:tblGrid>
-      <w:tr>
-        <w:trPr>
-          <w:cantSplit/>
-        </w:trPr>
-        <w:tc>
-          <w:tcPr>
-            <w:tcW w:type="dxa" w:w="8440"/>
-            <w:tcBorders>
-              <w:top w:val="none" w:color="FFFFFF" w:sz="0"/>
-              <w:left w:val="none" w:color="FFFFFF" w:sz="0"/>
-              <w:bottom w:val="none" w:color="FFFFFF" w:sz="0"/>
-              <w:right w:val="none" w:color="FFFFFF" w:sz="0"/>
-            </w:tcBorders>
-            <w:tcMar>
-              <w:top w:type="dxa" w:w="0"/>
-              <w:left w:type="dxa" w:w="0"/>
-              <w:bottom w:type="dxa" w:w="0"/>
-              <w:right w:type="dxa" w:w="0"/>
-            </w:tcMar>
-          </w:tcPr>
-          <w:p>
-            <w:pPr>
-              <w:spacing w:after="0"/>
-            </w:pPr>
-            <w:r>
-              <w:rPr>
-                <w:rFonts w:ascii="Calibri" w:cs="Calibri" w:eastAsia="Calibri" w:hAnsi="Calibri"/>
-                <w:b/>
-                <w:bCs/>
-                <w:color w:val="01696F"/>
-                <w:sz w:val="22"/>
-                <w:szCs w:val="22"/>
-              </w:rPr>
-              <w:t xml:space="preserve">CALIFORNIA ALL-PURPOSE ACKNOWLEDGMENT</w:t>
-            </w:r>
-          </w:p>
-        </w:tc>
-        <w:tc>
-          <w:tcPr>
-            <w:tcW w:type="dxa" w:w="2360"/>
-            <w:tcBorders>
-              <w:top w:val="none" w:color="FFFFFF" w:sz="0"/>
-              <w:left w:val="none" w:color="FFFFFF" w:sz="0"/>
-              <w:bottom w:val="none" w:color="FFFFFF" w:sz="0"/>
-              <w:right w:val="none" w:color="FFFFFF" w:sz="0"/>
-            </w:tcBorders>
-            <w:tcMar>
-              <w:top w:type="dxa" w:w="0"/>
-              <w:left w:type="dxa" w:w="0"/>
-              <w:bottom w:type="dxa" w:w="0"/>
-              <w:right w:type="dxa" w:w="0"/>
-            </w:tcMar>
-          </w:tcPr>
-          <w:p>
-            <w:pPr>
-              <w:spacing w:after="0"/>
-              <w:jc w:val="right"/>
-            </w:pPr>
-            <w:r>
-              <w:rPr>
-                <w:rFonts w:ascii="Calibri" w:cs="Calibri" w:eastAsia="Calibri" w:hAnsi="Calibri"/>
-                <w:b/>
-                <w:bCs/>
-                <w:color w:val="28251D"/>
-                <w:sz w:val="22"/>
-                <w:szCs w:val="22"/>
-              </w:rPr>
-              <w:t xml:space="preserve">CIVIL CODE § 1189 — Second Signer</w:t>
             </w:r>
           </w:p>
         </w:tc>

</xml_diff>

<commit_message>
Extended Consent DOCX: fix acknowledgment lines + update footer text
Root cause of the missing lines: three runs in the ack certificate used literal underscore characters ('_______') instead of underlined non-breaking-space runs. Word/LibreOffice rendered the underscores as tightly-spaced glyphs with no underline formatting, making the fields look partially missing.

Fix — patched three runs in word/document.xml:
- Date field: 17 underscores -> 15 underlined nbsp
- Officer name/title: 73 underscores -> 70 underlined nbsp (tuned so 'On __ before me, ___' fits one line)
- Name(s) of Signer: 85 underscores -> 100 underlined nbsp
All three now use <w:u w:val="single" w:color="28251D"/> matching every other ack line.

Also updated the running footer from 'Complex Multi-Leg' to 'Extended Consent' to match the new template name on the page.
</commit_message>
<xml_diff>
--- a/assets/forms/travel_consent_complex.docx
+++ b/assets/forms/travel_consent_complex.docx
@@ -37,7 +37,7 @@
           <w:sz w:val="22"/>
           <w:szCs w:val="22"/>
         </w:rPr>
-        <w:t>Complex Multi-Leg — Instructions</w:t>
+        <w:t>Extended Consent — Instructions</w:t>
       </w:r>
     </w:p>
     <w:p>
@@ -129,7 +129,7 @@
           <w:sz w:val="20"/>
           <w:szCs w:val="20"/>
         </w:rPr>
-        <w:t>This is the "Complex Multi-Leg" version. It contains alternative blocks (marked A / B / C, D / E / F) — keep only the one that fits the situation and delete the others. It also contains repeatable blocks (additional children, additional flight legs) — duplicate or delete as needed.</w:t>
+        <w:t>This is the "Extended Consent" version. It contains alternative blocks (marked A / B / C, D / E / F) — keep only the one that fits the situation and delete the others. It also contains repeatable blocks (additional children, additional flight legs) — duplicate or delete as needed.</w:t>
       </w:r>
     </w:p>
     <w:p>
@@ -4764,8 +4764,9 @@
           <w:rFonts w:eastAsia="Calibri" w:cs="Calibri"/>
           <w:sz w:val="22"/>
           <w:szCs w:val="22"/>
-        </w:rPr>
-        <w:t>_________________</w:t>
+          <w:u w:val="single" w:color="28251D"/>
+        </w:rPr>
+        <w:t xml:space="preserve">               </w:t>
       </w:r>
       <w:r>
         <w:rPr>
@@ -4889,8 +4890,16 @@
           <w:rFonts w:eastAsia="Calibri" w:cs="Calibri"/>
           <w:sz w:val="22"/>
           <w:szCs w:val="22"/>
-        </w:rPr>
-        <w:t>_____________________________________________________________________________________</w:t>
+          <w:u w:val="single" w:color="28251D"/>
+        </w:rPr>
+        <w:t xml:space="preserve">                                                                                                    </w:t>
+      </w:r>
+      <w:r>
+        <w:rPr>
+          <w:rFonts w:eastAsia="Calibri" w:cs="Calibri"/>
+          <w:sz w:val="22"/>
+          <w:szCs w:val="22"/>
+        </w:rPr>
         <w:br/>
       </w:r>
       <w:r>
@@ -4915,13 +4924,11 @@
       <w:r>
         <w:rPr>
           <w:rFonts w:eastAsia="Calibri" w:cs="Calibri"/>
-          <w:b/>
-          <w:bCs/>
-          <w:sz w:val="22"/>
-          <w:szCs w:val="22"/>
-          <w:u w:val="none" w:color="28251D"/>
-        </w:rPr>
-        <w:t>__________________________________________________________________________________________________________</w:t>
+          <w:sz w:val="22"/>
+          <w:szCs w:val="22"/>
+          <w:u w:val="single" w:color="28251D"/>
+        </w:rPr>
+        <w:t xml:space="preserve">                                                                                                                               </w:t>
       </w:r>
       <w:r>
         <w:rPr>
@@ -5140,7 +5147,7 @@
         <w:sz w:val="16"/>
         <w:szCs w:val="16"/>
       </w:rPr>
-      <w:t xml:space="preserve">Travel Consent — Complex Multi-Leg     Page </w:t>
+      <w:t xml:space="preserve">Travel Consent — Extended Consent     Page </w:t>
     </w:r>
     <w:r>
       <w:rPr>
@@ -5284,7 +5291,7 @@
         <w:sz w:val="16"/>
         <w:szCs w:val="16"/>
       </w:rPr>
-      <w:t xml:space="preserve">Travel Consent — Complex Multi-Leg     Page </w:t>
+      <w:t xml:space="preserve">Travel Consent — Extended Consent     Page </w:t>
     </w:r>
     <w:r>
       <w:rPr>

</xml_diff>

<commit_message>
Extended Consent DOCX: splice standard-file ack block wholesale
Attempt to hand-patch the ack underline runs kept producing inconsistent widths and Word/LibreOffice rendering drift (nbsp vs. regular space, differing paragraph structure).

Instead, extract the entire ack block XML from the Standard Round-Trip DOCX (which is known to render correctly on Shawn's machine) and splice it into the Extended Consent file, replacing the buggy ack block from paragraph containing 'CALIFORNIA ALL-PURPOSE ACKNOWLEDGMENT' to the section's sectPr.

This guarantees the ack renders identically to the standard file — same runs, same widths, same paragraph structure — since it is literally the same XML.
</commit_message>
<xml_diff>
--- a/assets/forms/travel_consent_complex.docx
+++ b/assets/forms/travel_consent_complex.docx
@@ -4636,46 +4636,52 @@
           </w:tcPr>
           <w:p>
             <w:pPr>
-              <w:pStyle w:val="Normal"/>
-              <w:pageBreakBefore/>
-              <w:spacing w:before="0" w:after="0"/>
-              <w:rPr/>
+              <w:spacing w:after="0"/>
             </w:pPr>
             <w:r>
               <w:rPr>
-                <w:rFonts w:eastAsia="Calibri" w:cs="Calibri"/>
+                <w:rFonts w:ascii="Calibri" w:cs="Calibri" w:eastAsia="Calibri" w:hAnsi="Calibri"/>
                 <w:b/>
                 <w:bCs/>
                 <w:color w:val="01696F"/>
                 <w:sz w:val="22"/>
                 <w:szCs w:val="22"/>
               </w:rPr>
-              <w:t>CALIFORNIA ALL-PURPOSE ACKNOWLEDGMENT</w:t>
+              <w:t xml:space="preserve">CALIFORNIA ALL-PURPOSE ACKNOWLEDGMENT</w:t>
             </w:r>
           </w:p>
         </w:tc>
         <w:tc>
           <w:tcPr>
-            <w:tcW w:w="5400" w:type="dxa"/>
-            <w:tcBorders/>
+            <w:tcW w:type="dxa" w:w="2360"/>
+            <w:tcBorders>
+              <w:top w:val="none" w:color="FFFFFF" w:sz="0"/>
+              <w:left w:val="none" w:color="FFFFFF" w:sz="0"/>
+              <w:bottom w:val="none" w:color="FFFFFF" w:sz="0"/>
+              <w:right w:val="none" w:color="FFFFFF" w:sz="0"/>
+            </w:tcBorders>
+            <w:tcMar>
+              <w:top w:type="dxa" w:w="0"/>
+              <w:left w:type="dxa" w:w="0"/>
+              <w:bottom w:type="dxa" w:w="0"/>
+              <w:right w:type="dxa" w:w="0"/>
+            </w:tcMar>
           </w:tcPr>
           <w:p>
             <w:pPr>
-              <w:pStyle w:val="Normal"/>
-              <w:spacing w:before="0" w:after="0"/>
-              <w:jc w:val="end"/>
-              <w:rPr/>
+              <w:spacing w:after="0"/>
+              <w:jc w:val="right"/>
             </w:pPr>
             <w:r>
               <w:rPr>
-                <w:rFonts w:eastAsia="Calibri" w:cs="Calibri"/>
+                <w:rFonts w:ascii="Calibri" w:cs="Calibri" w:eastAsia="Calibri" w:hAnsi="Calibri"/>
                 <w:b/>
                 <w:bCs/>
                 <w:color w:val="28251D"/>
                 <w:sz w:val="22"/>
                 <w:szCs w:val="22"/>
               </w:rPr>
-              <w:t>CIVIL CODE § 1189</w:t>
+              <w:t xml:space="preserve">CIVIL CODE § 1189</w:t>
             </w:r>
           </w:p>
         </w:tc>
@@ -4683,52 +4689,46 @@
     </w:tbl>
     <w:p>
       <w:pPr>
-        <w:pStyle w:val="Normal"/>
         <w:pBdr>
-          <w:top w:val="single" w:sz="6" w:space="8" w:color="28251D"/>
-          <w:left w:val="single" w:sz="6" w:space="8" w:color="28251D"/>
-          <w:bottom w:val="single" w:sz="6" w:space="8" w:color="28251D"/>
-          <w:right w:val="single" w:sz="6" w:space="8" w:color="28251D"/>
+          <w:top w:val="single" w:color="28251D" w:sz="6" w:space="8"/>
+          <w:bottom w:val="single" w:color="28251D" w:sz="6" w:space="8"/>
+          <w:left w:val="single" w:color="28251D" w:sz="6" w:space="8"/>
+          <w:right w:val="single" w:color="28251D" w:sz="6" w:space="8"/>
         </w:pBdr>
-        <w:spacing w:before="60" w:after="240"/>
-        <w:rPr/>
-      </w:pPr>
-      <w:r>
-        <w:rPr>
-          <w:rFonts w:eastAsia="Calibri" w:cs="Calibri"/>
+        <w:spacing w:after="240" w:before="60"/>
+      </w:pPr>
+      <w:r>
+        <w:rPr>
+          <w:rFonts w:ascii="Calibri" w:cs="Calibri" w:eastAsia="Calibri" w:hAnsi="Calibri"/>
           <w:i/>
           <w:iCs/>
           <w:color w:val="28251D"/>
           <w:sz w:val="20"/>
           <w:szCs w:val="20"/>
         </w:rPr>
-        <w:t>A notary public or other officer completing this certificate verifies only the identity of the individual who signed the document to which this certificate is attached, and not the truthfulness, accuracy, or validity of that document.</w:t>
-      </w:r>
-    </w:p>
-    <w:p>
-      <w:pPr>
-        <w:pStyle w:val="Normal"/>
-        <w:spacing w:before="0" w:after="160"/>
-        <w:rPr/>
-      </w:pPr>
-      <w:r>
-        <w:rPr>
-          <w:rFonts w:eastAsia="Calibri" w:cs="Calibri"/>
-          <w:sz w:val="22"/>
-          <w:szCs w:val="22"/>
-        </w:rPr>
-        <w:t>State of California</w:t>
-      </w:r>
-    </w:p>
-    <w:p>
-      <w:pPr>
-        <w:pStyle w:val="Normal"/>
-        <w:spacing w:before="0" w:after="200"/>
-        <w:rPr/>
-      </w:pPr>
-      <w:r>
-        <w:rPr>
-          <w:rFonts w:eastAsia="Calibri" w:cs="Calibri"/>
+        <w:t xml:space="preserve">A notary public or other officer completing this certificate verifies only the identity of the individual who signed the document to which this certificate is attached, and not the truthfulness, accuracy, or validity of that document.</w:t>
+      </w:r>
+    </w:p>
+    <w:p>
+      <w:pPr>
+        <w:spacing w:after="160"/>
+      </w:pPr>
+      <w:r>
+        <w:rPr>
+          <w:rFonts w:ascii="Calibri" w:cs="Calibri" w:eastAsia="Calibri" w:hAnsi="Calibri"/>
+          <w:sz w:val="22"/>
+          <w:szCs w:val="22"/>
+        </w:rPr>
+        <w:t xml:space="preserve">State of California</w:t>
+      </w:r>
+    </w:p>
+    <w:p>
+      <w:pPr>
+        <w:spacing w:after="200"/>
+      </w:pPr>
+      <w:r>
+        <w:rPr>
+          <w:rFonts w:ascii="Calibri" w:cs="Calibri" w:eastAsia="Calibri" w:hAnsi="Calibri"/>
           <w:sz w:val="22"/>
           <w:szCs w:val="22"/>
         </w:rPr>
@@ -4736,24 +4736,22 @@
       </w:r>
       <w:r>
         <w:rPr>
-          <w:rFonts w:eastAsia="Calibri" w:cs="Calibri"/>
-          <w:sz w:val="22"/>
-          <w:szCs w:val="22"/>
-          <w:u w:val="single" w:color="28251D"/>
-        </w:rPr>
-        <w:t>                                        </w:t>
-      </w:r>
-    </w:p>
-    <w:p>
-      <w:pPr>
-        <w:pStyle w:val="Normal"/>
-        <w:keepNext w:val="true"/>
-        <w:spacing w:before="0" w:after="20"/>
-        <w:rPr/>
-      </w:pPr>
-      <w:r>
-        <w:rPr>
-          <w:rFonts w:eastAsia="Calibri" w:cs="Calibri"/>
+          <w:rFonts w:ascii="Calibri" w:cs="Calibri" w:eastAsia="Calibri" w:hAnsi="Calibri"/>
+          <w:sz w:val="22"/>
+          <w:szCs w:val="22"/>
+          <w:u w:val="single" w:color="28251D"/>
+        </w:rPr>
+        <w:t xml:space="preserve">                                        </w:t>
+      </w:r>
+    </w:p>
+    <w:p>
+      <w:pPr>
+        <w:keepNext/>
+        <w:spacing w:after="20"/>
+      </w:pPr>
+      <w:r>
+        <w:rPr>
+          <w:rFonts w:ascii="Calibri" w:cs="Calibri" w:eastAsia="Calibri" w:hAnsi="Calibri"/>
           <w:sz w:val="22"/>
           <w:szCs w:val="22"/>
         </w:rPr>
@@ -4761,16 +4759,16 @@
       </w:r>
       <w:r>
         <w:rPr>
-          <w:rFonts w:eastAsia="Calibri" w:cs="Calibri"/>
-          <w:sz w:val="22"/>
-          <w:szCs w:val="22"/>
-          <w:u w:val="single" w:color="28251D"/>
-        </w:rPr>
-        <w:t xml:space="preserve">               </w:t>
-      </w:r>
-      <w:r>
-        <w:rPr>
-          <w:rFonts w:eastAsia="Calibri" w:cs="Calibri"/>
+          <w:rFonts w:ascii="Calibri" w:cs="Calibri" w:eastAsia="Calibri" w:hAnsi="Calibri"/>
+          <w:sz w:val="22"/>
+          <w:szCs w:val="22"/>
+          <w:u w:val="single" w:color="28251D"/>
+        </w:rPr>
+        <w:t xml:space="preserve">                              </w:t>
+      </w:r>
+      <w:r>
+        <w:rPr>
+          <w:rFonts w:ascii="Calibri" w:cs="Calibri" w:eastAsia="Calibri" w:hAnsi="Calibri"/>
           <w:sz w:val="22"/>
           <w:szCs w:val="22"/>
         </w:rPr>
@@ -4778,271 +4776,291 @@
       </w:r>
       <w:r>
         <w:rPr>
-          <w:rFonts w:eastAsia="Calibri" w:cs="Calibri"/>
-          <w:sz w:val="22"/>
-          <w:szCs w:val="22"/>
-        </w:rPr>
-        <w:t>_________________________________________________________________________,</w:t>
+          <w:rFonts w:ascii="Calibri" w:cs="Calibri" w:eastAsia="Calibri" w:hAnsi="Calibri"/>
+          <w:sz w:val="22"/>
+          <w:szCs w:val="22"/>
+          <w:u w:val="single" w:color="28251D"/>
+        </w:rPr>
+        <w:t xml:space="preserve">                                                                                                                                                              </w:t>
+      </w:r>
+      <w:r>
+        <w:rPr>
+          <w:rFonts w:ascii="Calibri" w:cs="Calibri" w:eastAsia="Calibri" w:hAnsi="Calibri"/>
+          <w:sz w:val="22"/>
+          <w:szCs w:val="22"/>
+        </w:rPr>
+        <w:t xml:space="preserve">,</w:t>
       </w:r>
     </w:p>
     <w:tbl>
       <w:tblPr>
-        <w:tblW w:w="10800" w:type="dxa"/>
-        <w:jc w:val="start"/>
-        <w:tblInd w:w="0" w:type="dxa"/>
-        <w:tblLayout w:type="fixed"/>
-        <w:tblCellMar>
-          <w:top w:w="0" w:type="dxa"/>
-          <w:start w:w="0" w:type="dxa"/>
-          <w:bottom w:w="0" w:type="dxa"/>
-          <w:end w:w="0" w:type="dxa"/>
-        </w:tblCellMar>
+        <w:tblW w:type="dxa" w:w="10800"/>
+        <w:tblBorders>
+          <w:top w:val="none" w:color="FFFFFF" w:sz="0"/>
+          <w:left w:val="none" w:color="FFFFFF" w:sz="0"/>
+          <w:bottom w:val="none" w:color="FFFFFF" w:sz="0"/>
+          <w:right w:val="none" w:color="FFFFFF" w:sz="0"/>
+          <w:insideH w:val="none" w:color="FFFFFF" w:sz="0"/>
+          <w:insideV w:val="none" w:color="FFFFFF" w:sz="0"/>
+        </w:tblBorders>
       </w:tblPr>
       <w:tblGrid>
-        <w:gridCol w:w="3327"/>
-        <w:gridCol w:w="7473"/>
+        <w:gridCol w:w="100"/>
+        <w:gridCol w:w="100"/>
       </w:tblGrid>
       <w:tr>
         <w:trPr>
-          <w:cantSplit w:val="true"/>
+          <w:cantSplit/>
         </w:trPr>
         <w:tc>
           <w:tcPr>
-            <w:tcW w:w="3327" w:type="dxa"/>
-            <w:tcBorders/>
+            <w:tcW w:type="dxa" w:w="2200"/>
+            <w:tcBorders>
+              <w:top w:val="none" w:color="FFFFFF" w:sz="0"/>
+              <w:left w:val="none" w:color="FFFFFF" w:sz="0"/>
+              <w:bottom w:val="none" w:color="FFFFFF" w:sz="0"/>
+              <w:right w:val="none" w:color="FFFFFF" w:sz="0"/>
+            </w:tcBorders>
+            <w:tcMar>
+              <w:top w:type="dxa" w:w="0"/>
+              <w:left w:type="dxa" w:w="0"/>
+              <w:bottom w:type="dxa" w:w="0"/>
+              <w:right w:type="dxa" w:w="0"/>
+            </w:tcMar>
           </w:tcPr>
           <w:p>
             <w:pPr>
-              <w:pStyle w:val="Normal"/>
-              <w:spacing w:before="0" w:after="40"/>
-              <w:ind w:start="360"/>
-              <w:rPr/>
+              <w:spacing w:after="40"/>
+              <w:ind w:left="360"/>
             </w:pPr>
             <w:r>
               <w:rPr>
-                <w:rFonts w:eastAsia="Calibri" w:cs="Calibri"/>
+                <w:rFonts w:ascii="Calibri" w:cs="Calibri" w:eastAsia="Calibri" w:hAnsi="Calibri"/>
                 <w:i/>
                 <w:iCs/>
                 <w:color w:val="7A7974"/>
                 <w:sz w:val="18"/>
                 <w:szCs w:val="18"/>
               </w:rPr>
-              <w:t xml:space="preserve">            </w:t>
+              <w:t xml:space="preserve">Date</w:t>
             </w:r>
+          </w:p>
+        </w:tc>
+        <w:tc>
+          <w:tcPr>
+            <w:tcW w:type="dxa" w:w="8600"/>
+            <w:tcBorders>
+              <w:top w:val="none" w:color="FFFFFF" w:sz="0"/>
+              <w:left w:val="none" w:color="FFFFFF" w:sz="0"/>
+              <w:bottom w:val="none" w:color="FFFFFF" w:sz="0"/>
+              <w:right w:val="none" w:color="FFFFFF" w:sz="0"/>
+            </w:tcBorders>
+            <w:tcMar>
+              <w:top w:type="dxa" w:w="0"/>
+              <w:left w:type="dxa" w:w="0"/>
+              <w:bottom w:type="dxa" w:w="0"/>
+              <w:right w:type="dxa" w:w="0"/>
+            </w:tcMar>
+          </w:tcPr>
+          <w:p>
+            <w:pPr>
+              <w:spacing w:after="40"/>
+              <w:jc w:val="center"/>
+            </w:pPr>
             <w:r>
               <w:rPr>
-                <w:rFonts w:eastAsia="Calibri" w:cs="Calibri"/>
+                <w:rFonts w:ascii="Calibri" w:cs="Calibri" w:eastAsia="Calibri" w:hAnsi="Calibri"/>
                 <w:i/>
                 <w:iCs/>
                 <w:color w:val="7A7974"/>
                 <w:sz w:val="18"/>
                 <w:szCs w:val="18"/>
               </w:rPr>
-              <w:t>Date</w:t>
+              <w:t xml:space="preserve">Here Insert Name and Title of the Officer</w:t>
+            </w:r>
+          </w:p>
+        </w:tc>
+      </w:tr>
+    </w:tbl>
+    <w:p>
+      <w:pPr>
+        <w:keepNext/>
+        <w:spacing w:after="20"/>
+      </w:pPr>
+      <w:r>
+        <w:rPr>
+          <w:rFonts w:ascii="Calibri" w:cs="Calibri" w:eastAsia="Calibri" w:hAnsi="Calibri"/>
+          <w:sz w:val="22"/>
+          <w:szCs w:val="22"/>
+        </w:rPr>
+        <w:t xml:space="preserve">personally appeared </w:t>
+      </w:r>
+      <w:r>
+        <w:rPr>
+          <w:rFonts w:ascii="Calibri" w:cs="Calibri" w:eastAsia="Calibri" w:hAnsi="Calibri"/>
+          <w:sz w:val="22"/>
+          <w:szCs w:val="22"/>
+          <w:u w:val="single" w:color="28251D"/>
+        </w:rPr>
+        <w:t xml:space="preserve">                                                                                                                                                                                    </w:t>
+      </w:r>
+    </w:p>
+    <w:p>
+      <w:pPr>
+        <w:keepNext/>
+        <w:spacing w:after="40"/>
+        <w:ind w:left="2400"/>
+        <w:jc w:val="center"/>
+      </w:pPr>
+      <w:r>
+        <w:rPr>
+          <w:rFonts w:ascii="Calibri" w:cs="Calibri" w:eastAsia="Calibri" w:hAnsi="Calibri"/>
+          <w:i/>
+          <w:iCs/>
+          <w:color w:val="7A7974"/>
+          <w:sz w:val="18"/>
+          <w:szCs w:val="18"/>
+        </w:rPr>
+        <w:t xml:space="preserve">Name(s) of Signer(s)</w:t>
+      </w:r>
+    </w:p>
+    <w:p>
+      <w:pPr>
+        <w:keepNext/>
+        <w:spacing w:after="40"/>
+      </w:pPr>
+      <w:r>
+        <w:rPr>
+          <w:rFonts w:ascii="Calibri" w:cs="Calibri" w:eastAsia="Calibri" w:hAnsi="Calibri"/>
+          <w:sz w:val="22"/>
+          <w:szCs w:val="22"/>
+          <w:u w:val="single" w:color="28251D"/>
+        </w:rPr>
+        <w:t xml:space="preserve">                                                                                                                                                                                                                          </w:t>
+      </w:r>
+      <w:r>
+        <w:rPr>
+          <w:rFonts w:ascii="Calibri" w:cs="Calibri" w:eastAsia="Calibri" w:hAnsi="Calibri"/>
+          <w:sz w:val="22"/>
+          <w:szCs w:val="22"/>
+        </w:rPr>
+        <w:t xml:space="preserve">,</w:t>
+      </w:r>
+    </w:p>
+    <w:p>
+      <w:pPr>
+        <w:spacing w:after="240"/>
+      </w:pPr>
+      <w:r>
+        <w:rPr>
+          <w:rFonts w:ascii="Calibri" w:cs="Calibri" w:eastAsia="Calibri" w:hAnsi="Calibri"/>
+          <w:sz w:val="22"/>
+          <w:szCs w:val="22"/>
+        </w:rPr>
+        <w:t xml:space="preserve">who proved to me on the basis of satisfactory evidence to be the person(s) whose name(s) is/are subscribed to the within instrument, and acknowledged to me that he/she/they executed the same in his/her/their authorized capacity(ies), and that by his/her/their signature(s) on the instrument the person(s), or the entity upon behalf of which the person(s) acted, executed the instrument.</w:t>
+      </w:r>
+    </w:p>
+    <w:tbl>
+      <w:tblPr>
+        <w:tblW w:type="dxa" w:w="10800"/>
+        <w:tblBorders>
+          <w:top w:val="none" w:color="FFFFFF" w:sz="0"/>
+          <w:left w:val="none" w:color="FFFFFF" w:sz="0"/>
+          <w:bottom w:val="none" w:color="FFFFFF" w:sz="0"/>
+          <w:right w:val="none" w:color="FFFFFF" w:sz="0"/>
+          <w:insideH w:val="none" w:color="FFFFFF" w:sz="0"/>
+          <w:insideV w:val="none" w:color="FFFFFF" w:sz="0"/>
+        </w:tblBorders>
+      </w:tblPr>
+      <w:tblGrid>
+        <w:gridCol w:w="100"/>
+        <w:gridCol w:w="100"/>
+      </w:tblGrid>
+      <w:tr>
+        <w:trPr>
+          <w:cantSplit/>
+          <w:trHeight w:val="2200" w:hRule="atLeast"/>
+        </w:trPr>
+        <w:tc>
+          <w:tcPr>
+            <w:tcW w:type="dxa" w:w="4200"/>
+            <w:tcBorders>
+              <w:top w:val="none" w:color="FFFFFF" w:sz="0"/>
+              <w:left w:val="none" w:color="FFFFFF" w:sz="0"/>
+              <w:bottom w:val="single" w:color="28251D" w:sz="6" w:space="0"/>
+              <w:right w:val="none" w:color="FFFFFF" w:sz="0"/>
+            </w:tcBorders>
+            <w:tcMar>
+              <w:top w:type="dxa" w:w="0"/>
+              <w:left w:type="dxa" w:w="0"/>
+              <w:bottom w:type="dxa" w:w="0"/>
+              <w:right w:type="dxa" w:w="200"/>
+            </w:tcMar>
+          </w:tcPr>
+          <w:p>
+            <w:pPr>
+              <w:spacing w:after="0"/>
+            </w:pPr>
+            <w:r>
+              <w:rPr>
+                <w:rFonts w:ascii="Calibri" w:cs="Calibri" w:eastAsia="Calibri" w:hAnsi="Calibri"/>
+                <w:sz w:val="22"/>
+                <w:szCs w:val="22"/>
+              </w:rPr>
+              <w:t xml:space="preserve"/>
             </w:r>
           </w:p>
         </w:tc>
         <w:tc>
           <w:tcPr>
-            <w:tcW w:w="7473" w:type="dxa"/>
-            <w:tcBorders/>
-          </w:tcPr>
-          <w:p>
-            <w:pPr>
-              <w:pStyle w:val="Normal"/>
-              <w:spacing w:before="0" w:after="40"/>
-              <w:jc w:val="center"/>
-              <w:rPr/>
-            </w:pPr>
-            <w:r>
-              <w:rPr>
-                <w:rFonts w:eastAsia="Calibri" w:cs="Calibri"/>
-                <w:i/>
-                <w:iCs/>
-                <w:color w:val="7A7974"/>
-                <w:sz w:val="18"/>
-                <w:szCs w:val="18"/>
-              </w:rPr>
-              <w:t>Here Insert Name and Title of the Officer</w:t>
-            </w:r>
-          </w:p>
-        </w:tc>
-      </w:tr>
-    </w:tbl>
-    <w:p>
-      <w:pPr>
-        <w:pStyle w:val="Normal"/>
-        <w:keepNext w:val="true"/>
-        <w:spacing w:before="0" w:after="20"/>
-        <w:jc w:val="center"/>
-        <w:rPr/>
-      </w:pPr>
-      <w:r>
-        <w:rPr>
-          <w:rFonts w:eastAsia="Calibri" w:cs="Calibri"/>
-          <w:sz w:val="22"/>
-          <w:szCs w:val="22"/>
-        </w:rPr>
-        <w:t xml:space="preserve">personally appeared </w:t>
-      </w:r>
-      <w:r>
-        <w:rPr>
-          <w:rFonts w:eastAsia="Calibri" w:cs="Calibri"/>
-          <w:sz w:val="22"/>
-          <w:szCs w:val="22"/>
-          <w:u w:val="single" w:color="28251D"/>
-        </w:rPr>
-        <w:t xml:space="preserve">                                                                                                    </w:t>
-      </w:r>
-      <w:r>
-        <w:rPr>
-          <w:rFonts w:eastAsia="Calibri" w:cs="Calibri"/>
-          <w:sz w:val="22"/>
-          <w:szCs w:val="22"/>
-        </w:rPr>
-        <w:br/>
-      </w:r>
-      <w:r>
-        <w:rPr>
-          <w:rFonts w:eastAsia="Calibri" w:cs="Calibri"/>
-          <w:i/>
-          <w:iCs/>
-          <w:color w:val="7A7974"/>
-          <w:sz w:val="18"/>
-          <w:szCs w:val="18"/>
-        </w:rPr>
-        <w:t>Name(s) of Signer(s)</w:t>
-      </w:r>
-    </w:p>
-    <w:p>
-      <w:pPr>
-        <w:pStyle w:val="Normal"/>
-        <w:keepNext w:val="true"/>
-        <w:spacing w:before="0" w:after="40"/>
-        <w:rPr/>
-      </w:pPr>
-      <w:r>
-        <w:rPr>
-          <w:rFonts w:eastAsia="Calibri" w:cs="Calibri"/>
-          <w:sz w:val="22"/>
-          <w:szCs w:val="22"/>
-          <w:u w:val="single" w:color="28251D"/>
-        </w:rPr>
-        <w:t xml:space="preserve">                                                                                                                               </w:t>
-      </w:r>
-      <w:r>
-        <w:rPr>
-          <w:rFonts w:eastAsia="Calibri" w:cs="Calibri"/>
-          <w:sz w:val="22"/>
-          <w:szCs w:val="22"/>
-        </w:rPr>
-        <w:t>,</w:t>
-      </w:r>
-    </w:p>
-    <w:p>
-      <w:pPr>
-        <w:pStyle w:val="Normal"/>
-        <w:spacing w:before="0" w:after="240"/>
-        <w:rPr/>
-      </w:pPr>
-      <w:r>
-        <w:rPr>
-          <w:rFonts w:eastAsia="Calibri" w:cs="Calibri"/>
-          <w:sz w:val="22"/>
-          <w:szCs w:val="22"/>
-        </w:rPr>
-        <w:t>who proved to me on the basis of satisfactory evidence to be the person(s) whose name(s) is/are subscribed to the within instrument, and acknowledged to me that he/she/they executed the same in his/her/their authorized capacity(ies), and that by his/her/their signature(s) on the instrument the person(s), or the entity upon behalf of which the person(s) acted, executed the instrument.</w:t>
-      </w:r>
-    </w:p>
-    <w:tbl>
-      <w:tblPr>
-        <w:tblW w:w="10800" w:type="dxa"/>
-        <w:jc w:val="start"/>
-        <w:tblInd w:w="0" w:type="dxa"/>
-        <w:tblLayout w:type="fixed"/>
-        <w:tblCellMar>
-          <w:top w:w="0" w:type="dxa"/>
-          <w:start w:w="0" w:type="dxa"/>
-          <w:bottom w:w="0" w:type="dxa"/>
-          <w:end w:w="200" w:type="dxa"/>
-        </w:tblCellMar>
-      </w:tblPr>
-      <w:tblGrid>
-        <w:gridCol w:w="5400"/>
-        <w:gridCol w:w="5400"/>
-      </w:tblGrid>
-      <w:tr>
-        <w:trPr>
-          <w:trHeight w:val="2427" w:hRule="atLeast"/>
-          <w:cantSplit w:val="true"/>
-        </w:trPr>
-        <w:tc>
-          <w:tcPr>
-            <w:tcW w:w="5400" w:type="dxa"/>
+            <w:tcW w:type="dxa" w:w="6600"/>
             <w:tcBorders>
-              <w:bottom w:val="single" w:sz="6" w:space="0" w:color="28251D"/>
+              <w:top w:val="none" w:color="FFFFFF" w:sz="0"/>
+              <w:left w:val="none" w:color="FFFFFF" w:sz="0"/>
+              <w:bottom w:val="none" w:color="FFFFFF" w:sz="0"/>
+              <w:right w:val="none" w:color="FFFFFF" w:sz="0"/>
             </w:tcBorders>
-          </w:tcPr>
-          <w:p>
-            <w:pPr>
-              <w:pStyle w:val="Normal"/>
-              <w:spacing w:before="0" w:after="0"/>
-              <w:rPr/>
-            </w:pPr>
-            <w:r>
-              <w:rPr/>
-            </w:r>
-          </w:p>
-        </w:tc>
-        <w:tc>
-          <w:tcPr>
-            <w:tcW w:w="5400" w:type="dxa"/>
-            <w:tcBorders/>
             <w:tcMar>
-              <w:start w:w="200" w:type="dxa"/>
-              <w:end w:w="0" w:type="dxa"/>
+              <w:top w:type="dxa" w:w="0"/>
+              <w:left w:type="dxa" w:w="200"/>
+              <w:bottom w:type="dxa" w:w="0"/>
+              <w:right w:type="dxa" w:w="0"/>
             </w:tcMar>
           </w:tcPr>
           <w:p>
             <w:pPr>
-              <w:pStyle w:val="Normal"/>
-              <w:spacing w:before="0" w:after="160"/>
-              <w:rPr/>
+              <w:spacing w:after="160"/>
             </w:pPr>
             <w:r>
               <w:rPr>
-                <w:rFonts w:eastAsia="Calibri" w:cs="Calibri"/>
+                <w:rFonts w:ascii="Calibri" w:cs="Calibri" w:eastAsia="Calibri" w:hAnsi="Calibri"/>
                 <w:sz w:val="22"/>
                 <w:szCs w:val="22"/>
               </w:rPr>
-              <w:t>I certify under PENALTY OF PERJURY under the laws of the State of California that the foregoing paragraph is true and correct.</w:t>
+              <w:t xml:space="preserve">I certify under PENALTY OF PERJURY under the laws of the State of California that the foregoing paragraph is true and correct.</w:t>
             </w:r>
           </w:p>
           <w:p>
             <w:pPr>
-              <w:pStyle w:val="Normal"/>
-              <w:spacing w:before="0" w:after="400"/>
-              <w:rPr/>
+              <w:spacing w:after="400"/>
             </w:pPr>
             <w:r>
               <w:rPr>
-                <w:rFonts w:eastAsia="Calibri" w:cs="Calibri"/>
+                <w:rFonts w:ascii="Calibri" w:cs="Calibri" w:eastAsia="Calibri" w:hAnsi="Calibri"/>
                 <w:sz w:val="22"/>
                 <w:szCs w:val="22"/>
               </w:rPr>
-              <w:t>WITNESS my hand and official seal.</w:t>
+              <w:t xml:space="preserve">WITNESS my hand and official seal.</w:t>
             </w:r>
           </w:p>
           <w:p>
             <w:pPr>
-              <w:pStyle w:val="Normal"/>
-              <w:keepNext w:val="true"/>
-              <w:spacing w:before="0" w:after="20"/>
-              <w:rPr/>
+              <w:keepNext/>
+              <w:spacing w:after="20"/>
             </w:pPr>
             <w:r>
               <w:rPr>
-                <w:rFonts w:eastAsia="Calibri" w:cs="Calibri"/>
+                <w:rFonts w:ascii="Calibri" w:cs="Calibri" w:eastAsia="Calibri" w:hAnsi="Calibri"/>
                 <w:sz w:val="22"/>
                 <w:szCs w:val="22"/>
               </w:rPr>
@@ -5050,31 +5068,29 @@
             </w:r>
             <w:r>
               <w:rPr>
-                <w:rFonts w:eastAsia="Calibri" w:cs="Calibri"/>
+                <w:rFonts w:ascii="Calibri" w:cs="Calibri" w:eastAsia="Calibri" w:hAnsi="Calibri"/>
                 <w:sz w:val="22"/>
                 <w:szCs w:val="22"/>
                 <w:u w:val="single" w:color="28251D"/>
               </w:rPr>
-              <w:t>                                                                                    </w:t>
+              <w:t xml:space="preserve">                                                                                    </w:t>
             </w:r>
           </w:p>
           <w:p>
             <w:pPr>
-              <w:pStyle w:val="Normal"/>
-              <w:spacing w:before="0" w:after="40"/>
+              <w:spacing w:after="40"/>
               <w:jc w:val="center"/>
-              <w:rPr/>
             </w:pPr>
             <w:r>
               <w:rPr>
-                <w:rFonts w:eastAsia="Calibri" w:cs="Calibri"/>
+                <w:rFonts w:ascii="Calibri" w:cs="Calibri" w:eastAsia="Calibri" w:hAnsi="Calibri"/>
                 <w:i/>
                 <w:iCs/>
                 <w:color w:val="7A7974"/>
                 <w:sz w:val="18"/>
                 <w:szCs w:val="18"/>
               </w:rPr>
-              <w:t>Signature of Notary Public</w:t>
+              <w:t xml:space="preserve">Signature of Notary Public</w:t>
             </w:r>
           </w:p>
         </w:tc>
@@ -5082,22 +5098,19 @@
     </w:tbl>
     <w:p>
       <w:pPr>
-        <w:pStyle w:val="Normal"/>
-        <w:spacing w:before="40" w:after="0"/>
-        <w:ind w:start="720"/>
-        <w:rPr/>
-      </w:pPr>
-      <w:r>
-        <w:rPr>
-          <w:rFonts w:eastAsia="Calibri" w:cs="Calibri"/>
+        <w:spacing w:after="0" w:before="40"/>
+        <w:ind w:left="720"/>
+      </w:pPr>
+      <w:r>
+        <w:rPr>
+          <w:rFonts w:ascii="Calibri" w:cs="Calibri" w:eastAsia="Calibri" w:hAnsi="Calibri"/>
           <w:i/>
           <w:iCs/>
           <w:color w:val="7A7974"/>
           <w:sz w:val="20"/>
           <w:szCs w:val="20"/>
         </w:rPr>
-        <w:tab/>
-        <w:t>Place Notary Seal Above</w:t>
+        <w:t xml:space="preserve">Place Notary Seal Above</w:t>
       </w:r>
     </w:p>
     <w:sectPr>

</xml_diff>

<commit_message>
Travel consent: Instructions on its own standalone page, page numbers restart on form
</commit_message>
<xml_diff>
--- a/assets/forms/travel_consent_complex.docx
+++ b/assets/forms/travel_consent_complex.docx
@@ -279,6 +279,17 @@
       <w:r>
         <w:br w:type="page"/>
       </w:r>
+    </w:p>
+    <w:p>
+      <w:pPr>
+        <w:sectPr>
+          <w:footerReference w:type="default" r:id="rId50"/>
+          <w:type w:val="nextPage"/>
+          <w:pgSz w:w="12240" w:h="15840"/>
+          <w:pgMar w:left="720" w:right="720" w:gutter="0" w:header="0" w:top="720" w:footer="708" w:bottom="765"/>
+          <w:docGrid w:linePitch="360"/>
+        </w:sectPr>
+      </w:pPr>
     </w:p>
     <w:p>
       <w:pPr>
@@ -5465,8 +5476,8 @@
               </w:tblCellMar>
             </w:tblPr>
             <w:tblGrid>
-              <w:gridCol w:w="1000"/>
-              <w:gridCol w:w="5200"/>
+              <w:gridCol w:w="1300"/>
+              <w:gridCol w:w="4900"/>
             </w:tblGrid>
             <w:tr>
               <w:trPr>
@@ -5474,7 +5485,7 @@
               </w:trPr>
               <w:tc>
                 <w:tcPr>
-                  <w:tcW w:type="dxa" w:w="1000"/>
+                  <w:tcW w:type="dxa" w:w="1300"/>
                   <w:tcBorders>
                     <w:top w:val="none" w:sz="0" w:color="FFFFFF"/>
                     <w:left w:val="none" w:sz="0" w:color="FFFFFF"/>
@@ -5499,7 +5510,7 @@
               </w:tc>
               <w:tc>
                 <w:tcPr>
-                  <w:tcW w:type="dxa" w:w="5200"/>
+                  <w:tcW w:type="dxa" w:w="4900"/>
                   <w:tcBorders>
                     <w:top w:val="none" w:sz="0" w:color="FFFFFF"/>
                     <w:left w:val="none" w:sz="0" w:color="FFFFFF"/>
@@ -5521,7 +5532,7 @@
               </w:trPr>
               <w:tc>
                 <w:tcPr>
-                  <w:tcW w:type="dxa" w:w="1000"/>
+                  <w:tcW w:type="dxa" w:w="1300"/>
                   <w:tcBorders>
                     <w:top w:val="none" w:sz="0" w:color="FFFFFF"/>
                     <w:left w:val="none" w:sz="0" w:color="FFFFFF"/>
@@ -5538,7 +5549,7 @@
               </w:tc>
               <w:tc>
                 <w:tcPr>
-                  <w:tcW w:type="dxa" w:w="5200"/>
+                  <w:tcW w:type="dxa" w:w="4900"/>
                   <w:tcBorders>
                     <w:top w:val="none" w:sz="0" w:color="FFFFFF"/>
                     <w:left w:val="none" w:sz="0" w:color="FFFFFF"/>
@@ -5581,7 +5592,7 @@
       <w:type w:val="nextPage"/>
       <w:pgSz w:w="12240" w:h="15840"/>
       <w:pgMar w:left="720" w:right="720" w:gutter="0" w:header="0" w:top="720" w:footer="708" w:bottom="765"/>
-      <w:pgNumType w:fmt="decimal"/>
+      <w:pgNumType w:fmt="decimal" w:start="1"/>
       <w:formProt w:val="false"/>
       <w:textDirection w:val="lrTb"/>
       <w:docGrid w:type="default" w:linePitch="360" w:charSpace="0"/>
@@ -5605,16 +5616,22 @@
 </file>
 
 <file path=word/footer2.xml><?xml version="1.0" encoding="utf-8"?>
-<w:ftr xmlns:o="urn:schemas-microsoft-com:office:office" xmlns:r="http://schemas.openxmlformats.org/officeDocument/2006/relationships" xmlns:v="urn:schemas-microsoft-com:vml" xmlns:w="http://schemas.openxmlformats.org/wordprocessingml/2006/main" xmlns:w10="urn:schemas-microsoft-com:office:word" xmlns:wp="http://schemas.openxmlformats.org/drawingml/2006/wordprocessingDrawing" xmlns:pic="http://schemas.openxmlformats.org/drawingml/2006/picture" xmlns:wps="http://schemas.microsoft.com/office/word/2010/wordprocessingShape" xmlns:wpg="http://schemas.microsoft.com/office/word/2010/wordprocessingGroup" xmlns:mc="http://schemas.openxmlformats.org/markup-compatibility/2006" xmlns:wp14="http://schemas.microsoft.com/office/word/2010/wordprocessingDrawing" xmlns:w14="http://schemas.microsoft.com/office/word/2010/wordml" xmlns:w15="http://schemas.microsoft.com/office/word/2012/wordml" mc:Ignorable="w14 wp14 w15">
+<w:ftr xmlns:w="http://schemas.openxmlformats.org/wordprocessingml/2006/main" xmlns:r="http://schemas.openxmlformats.org/officeDocument/2006/relationships">
   <w:p>
     <w:pPr>
-      <w:pStyle w:val="Normal"/>
       <w:jc w:val="center"/>
-      <w:rPr/>
+      <w:rPr>
+        <w:rFonts w:ascii="Calibri" w:hAnsi="Calibri"/>
+        <w:i/>
+        <w:iCs/>
+        <w:color w:val="7A7974"/>
+        <w:sz w:val="16"/>
+        <w:szCs w:val="16"/>
+      </w:rPr>
     </w:pPr>
     <w:r>
       <w:rPr>
-        <w:rFonts w:eastAsia="Calibri" w:cs="Calibri"/>
+        <w:rFonts w:ascii="Calibri" w:hAnsi="Calibri"/>
         <w:i/>
         <w:iCs/>
         <w:color w:val="7A7974"/>
@@ -5625,123 +5642,17 @@
     </w:r>
     <w:r>
       <w:rPr>
-        <w:rFonts w:eastAsia="Calibri" w:cs="Calibri"/>
-        <w:i/>
-        <w:iCs/>
-        <w:color w:val="7A7974"/>
-        <w:sz w:val="20"/>
-        <w:szCs w:val="20"/>
-      </w:rPr>
-      <w:fldChar w:fldCharType="begin"/>
-    </w:r>
-    <w:r>
-      <w:rPr>
-        <w:rFonts w:eastAsia="Calibri" w:cs="Calibri"/>
-        <w:i/>
-        <w:iCs/>
-        <w:color w:val="7A7974"/>
-        <w:sz w:val="20"/>
-        <w:szCs w:val="20"/>
-      </w:rPr>
-      <w:instrText xml:space="preserve"> PAGE </w:instrText>
-    </w:r>
-    <w:r>
-      <w:rPr>
-        <w:rFonts w:eastAsia="Calibri" w:cs="Calibri"/>
-        <w:i/>
-        <w:iCs/>
-        <w:color w:val="7A7974"/>
-        <w:sz w:val="20"/>
-        <w:szCs w:val="20"/>
-      </w:rPr>
-      <w:fldChar w:fldCharType="separate"/>
-    </w:r>
-    <w:r>
-      <w:rPr>
-        <w:rFonts w:eastAsia="Calibri" w:cs="Calibri"/>
-        <w:i/>
-        <w:iCs/>
-        <w:color w:val="7A7974"/>
-        <w:sz w:val="20"/>
-        <w:szCs w:val="20"/>
-      </w:rPr>
-      <w:t>7</w:t>
-    </w:r>
-    <w:r>
-      <w:rPr>
-        <w:rFonts w:eastAsia="Calibri" w:cs="Calibri"/>
-        <w:i/>
-        <w:iCs/>
-        <w:color w:val="7A7974"/>
-        <w:sz w:val="20"/>
-        <w:szCs w:val="20"/>
-      </w:rPr>
-      <w:fldChar w:fldCharType="end"/>
-    </w:r>
-    <w:r>
-      <w:rPr>
-        <w:rFonts w:eastAsia="Calibri" w:cs="Calibri"/>
+        <w:rFonts w:ascii="Calibri" w:hAnsi="Calibri"/>
         <w:i/>
         <w:iCs/>
         <w:color w:val="7A7974"/>
         <w:sz w:val="16"/>
         <w:szCs w:val="16"/>
       </w:rPr>
-      <w:t xml:space="preserve"> of </w:t>
-    </w:r>
-    <w:r>
-      <w:rPr>
-        <w:rFonts w:eastAsia="Calibri" w:cs="Calibri"/>
-        <w:i/>
-        <w:iCs/>
-        <w:color w:val="7A7974"/>
-        <w:sz w:val="20"/>
-        <w:szCs w:val="20"/>
-      </w:rPr>
       <w:fldChar w:fldCharType="begin"/>
-    </w:r>
-    <w:r>
-      <w:rPr>
-        <w:rFonts w:eastAsia="Calibri" w:cs="Calibri"/>
-        <w:i/>
-        <w:iCs/>
-        <w:color w:val="7A7974"/>
-        <w:sz w:val="20"/>
-        <w:szCs w:val="20"/>
-      </w:rPr>
-      <w:instrText xml:space="preserve"> NUMPAGES </w:instrText>
-    </w:r>
-    <w:r>
-      <w:rPr>
-        <w:rFonts w:eastAsia="Calibri" w:cs="Calibri"/>
-        <w:i/>
-        <w:iCs/>
-        <w:color w:val="7A7974"/>
-        <w:sz w:val="20"/>
-        <w:szCs w:val="20"/>
-      </w:rPr>
+      <w:instrText xml:space="preserve">PAGE</w:instrText>
       <w:fldChar w:fldCharType="separate"/>
-    </w:r>
-    <w:r>
-      <w:rPr>
-        <w:rFonts w:eastAsia="Calibri" w:cs="Calibri"/>
-        <w:i/>
-        <w:iCs/>
-        <w:color w:val="7A7974"/>
-        <w:sz w:val="20"/>
-        <w:szCs w:val="20"/>
-      </w:rPr>
-      <w:t>9</w:t>
-    </w:r>
-    <w:r>
-      <w:rPr>
-        <w:rFonts w:eastAsia="Calibri" w:cs="Calibri"/>
-        <w:i/>
-        <w:iCs/>
-        <w:color w:val="7A7974"/>
-        <w:sz w:val="20"/>
-        <w:szCs w:val="20"/>
-      </w:rPr>
+      <w:t>1</w:t>
       <w:fldChar w:fldCharType="end"/>
     </w:r>
   </w:p>
@@ -5887,6 +5798,35 @@
         <w:szCs w:val="20"/>
       </w:rPr>
       <w:fldChar w:fldCharType="end"/>
+    </w:r>
+  </w:p>
+</w:ftr>
+</file>
+
+<file path=word/footer4.xml><?xml version="1.0" encoding="utf-8"?>
+<w:ftr xmlns:w="http://schemas.openxmlformats.org/wordprocessingml/2006/main" xmlns:r="http://schemas.openxmlformats.org/officeDocument/2006/relationships">
+  <w:p>
+    <w:pPr>
+      <w:jc w:val="center"/>
+      <w:rPr>
+        <w:rFonts w:ascii="Calibri" w:hAnsi="Calibri"/>
+        <w:i/>
+        <w:iCs/>
+        <w:color w:val="6B7280"/>
+        <w:sz w:val="17"/>
+        <w:szCs w:val="17"/>
+      </w:rPr>
+    </w:pPr>
+    <w:r>
+      <w:rPr>
+        <w:rFonts w:ascii="Calibri" w:hAnsi="Calibri"/>
+        <w:i/>
+        <w:iCs/>
+        <w:color w:val="6B7280"/>
+        <w:sz w:val="17"/>
+        <w:szCs w:val="17"/>
+      </w:rPr>
+      <w:t xml:space="preserve">Instructions — not part of the travel consent letter</w:t>
     </w:r>
   </w:p>
 </w:ftr>

</xml_diff>